<commit_message>
Frontend HTML, CSS y JavaScript que consume la API
</commit_message>
<xml_diff>
--- a/evidencias/Evidencias_PF02_Avance2.docx
+++ b/evidencias/Evidencias_PF02_Avance2.docx
@@ -210,12 +210,6 @@
         <w:gridCol w:w="6760"/>
       </w:tblGrid>
       <w:tr>
-        <w:tblPrEx>
-          <w:tblCellMar>
-            <w:top w:w="0" w:type="dxa"/>
-            <w:bottom w:w="0" w:type="dxa"/>
-          </w:tblCellMar>
-        </w:tblPrEx>
         <w:trPr>
           <w:tblHeader/>
         </w:trPr>
@@ -281,12 +275,6 @@
         </w:tc>
       </w:tr>
       <w:tr>
-        <w:tblPrEx>
-          <w:tblCellMar>
-            <w:top w:w="0" w:type="dxa"/>
-            <w:bottom w:w="0" w:type="dxa"/>
-          </w:tblCellMar>
-        </w:tblPrEx>
         <w:tc>
           <w:tcPr>
             <w:tcW w:w="2600" w:type="dxa"/>
@@ -343,12 +331,6 @@
         </w:tc>
       </w:tr>
       <w:tr>
-        <w:tblPrEx>
-          <w:tblCellMar>
-            <w:top w:w="0" w:type="dxa"/>
-            <w:bottom w:w="0" w:type="dxa"/>
-          </w:tblCellMar>
-        </w:tblPrEx>
         <w:tc>
           <w:tcPr>
             <w:tcW w:w="2600" w:type="dxa"/>
@@ -405,12 +387,6 @@
         </w:tc>
       </w:tr>
       <w:tr>
-        <w:tblPrEx>
-          <w:tblCellMar>
-            <w:top w:w="0" w:type="dxa"/>
-            <w:bottom w:w="0" w:type="dxa"/>
-          </w:tblCellMar>
-        </w:tblPrEx>
         <w:tc>
           <w:tcPr>
             <w:tcW w:w="2600" w:type="dxa"/>
@@ -485,12 +461,6 @@
         </w:tc>
       </w:tr>
       <w:tr>
-        <w:tblPrEx>
-          <w:tblCellMar>
-            <w:top w:w="0" w:type="dxa"/>
-            <w:bottom w:w="0" w:type="dxa"/>
-          </w:tblCellMar>
-        </w:tblPrEx>
         <w:tc>
           <w:tcPr>
             <w:tcW w:w="2600" w:type="dxa"/>
@@ -557,12 +527,6 @@
         </w:tc>
       </w:tr>
       <w:tr>
-        <w:tblPrEx>
-          <w:tblCellMar>
-            <w:top w:w="0" w:type="dxa"/>
-            <w:bottom w:w="0" w:type="dxa"/>
-          </w:tblCellMar>
-        </w:tblPrEx>
         <w:tc>
           <w:tcPr>
             <w:tcW w:w="2600" w:type="dxa"/>
@@ -689,12 +653,6 @@
         <w:gridCol w:w="2200"/>
       </w:tblGrid>
       <w:tr>
-        <w:tblPrEx>
-          <w:tblCellMar>
-            <w:top w:w="0" w:type="dxa"/>
-            <w:bottom w:w="0" w:type="dxa"/>
-          </w:tblCellMar>
-        </w:tblPrEx>
         <w:trPr>
           <w:tblHeader/>
         </w:trPr>
@@ -760,12 +718,6 @@
         </w:tc>
       </w:tr>
       <w:tr>
-        <w:tblPrEx>
-          <w:tblCellMar>
-            <w:top w:w="0" w:type="dxa"/>
-            <w:bottom w:w="0" w:type="dxa"/>
-          </w:tblCellMar>
-        </w:tblPrEx>
         <w:tc>
           <w:tcPr>
             <w:tcW w:w="7160" w:type="dxa"/>
@@ -822,12 +774,6 @@
         </w:tc>
       </w:tr>
       <w:tr>
-        <w:tblPrEx>
-          <w:tblCellMar>
-            <w:top w:w="0" w:type="dxa"/>
-            <w:bottom w:w="0" w:type="dxa"/>
-          </w:tblCellMar>
-        </w:tblPrEx>
         <w:tc>
           <w:tcPr>
             <w:tcW w:w="7160" w:type="dxa"/>
@@ -920,12 +866,6 @@
         </w:tc>
       </w:tr>
       <w:tr>
-        <w:tblPrEx>
-          <w:tblCellMar>
-            <w:top w:w="0" w:type="dxa"/>
-            <w:bottom w:w="0" w:type="dxa"/>
-          </w:tblCellMar>
-        </w:tblPrEx>
         <w:tc>
           <w:tcPr>
             <w:tcW w:w="7160" w:type="dxa"/>
@@ -1082,12 +1022,6 @@
         </w:tc>
       </w:tr>
       <w:tr>
-        <w:tblPrEx>
-          <w:tblCellMar>
-            <w:top w:w="0" w:type="dxa"/>
-            <w:bottom w:w="0" w:type="dxa"/>
-          </w:tblCellMar>
-        </w:tblPrEx>
         <w:tc>
           <w:tcPr>
             <w:tcW w:w="7160" w:type="dxa"/>
@@ -1144,12 +1078,6 @@
         </w:tc>
       </w:tr>
       <w:tr>
-        <w:tblPrEx>
-          <w:tblCellMar>
-            <w:top w:w="0" w:type="dxa"/>
-            <w:bottom w:w="0" w:type="dxa"/>
-          </w:tblCellMar>
-        </w:tblPrEx>
         <w:tc>
           <w:tcPr>
             <w:tcW w:w="7160" w:type="dxa"/>
@@ -1206,12 +1134,6 @@
         </w:tc>
       </w:tr>
       <w:tr>
-        <w:tblPrEx>
-          <w:tblCellMar>
-            <w:top w:w="0" w:type="dxa"/>
-            <w:bottom w:w="0" w:type="dxa"/>
-          </w:tblCellMar>
-        </w:tblPrEx>
         <w:tc>
           <w:tcPr>
             <w:tcW w:w="7160" w:type="dxa"/>
@@ -1268,12 +1190,6 @@
         </w:tc>
       </w:tr>
       <w:tr>
-        <w:tblPrEx>
-          <w:tblCellMar>
-            <w:top w:w="0" w:type="dxa"/>
-            <w:bottom w:w="0" w:type="dxa"/>
-          </w:tblCellMar>
-        </w:tblPrEx>
         <w:tc>
           <w:tcPr>
             <w:tcW w:w="7160" w:type="dxa"/>
@@ -1330,12 +1246,6 @@
         </w:tc>
       </w:tr>
       <w:tr>
-        <w:tblPrEx>
-          <w:tblCellMar>
-            <w:top w:w="0" w:type="dxa"/>
-            <w:bottom w:w="0" w:type="dxa"/>
-          </w:tblCellMar>
-        </w:tblPrEx>
         <w:tc>
           <w:tcPr>
             <w:tcW w:w="7160" w:type="dxa"/>
@@ -1392,12 +1302,6 @@
         </w:tc>
       </w:tr>
       <w:tr>
-        <w:tblPrEx>
-          <w:tblCellMar>
-            <w:top w:w="0" w:type="dxa"/>
-            <w:bottom w:w="0" w:type="dxa"/>
-          </w:tblCellMar>
-        </w:tblPrEx>
         <w:tc>
           <w:tcPr>
             <w:tcW w:w="7160" w:type="dxa"/>
@@ -1454,12 +1358,6 @@
         </w:tc>
       </w:tr>
       <w:tr>
-        <w:tblPrEx>
-          <w:tblCellMar>
-            <w:top w:w="0" w:type="dxa"/>
-            <w:bottom w:w="0" w:type="dxa"/>
-          </w:tblCellMar>
-        </w:tblPrEx>
         <w:tc>
           <w:tcPr>
             <w:tcW w:w="7160" w:type="dxa"/>
@@ -1516,12 +1414,6 @@
         </w:tc>
       </w:tr>
       <w:tr>
-        <w:tblPrEx>
-          <w:tblCellMar>
-            <w:top w:w="0" w:type="dxa"/>
-            <w:bottom w:w="0" w:type="dxa"/>
-          </w:tblCellMar>
-        </w:tblPrEx>
         <w:tc>
           <w:tcPr>
             <w:tcW w:w="7160" w:type="dxa"/>
@@ -1582,8 +1474,6 @@
       <w:pPr>
         <w:pStyle w:val="Ttulo1"/>
         <w:spacing w:before="280" w:after="160"/>
-      </w:pPr>
-      <w:r>
         <w:rPr>
           <w:b/>
           <w:bCs/>
@@ -1591,6 +1481,35 @@
           <w:sz w:val="30"/>
           <w:szCs w:val="30"/>
         </w:rPr>
+      </w:pPr>
+    </w:p>
+    <w:p>
+      <w:pPr>
+        <w:pStyle w:val="Ttulo1"/>
+        <w:spacing w:before="280" w:after="160"/>
+        <w:rPr>
+          <w:b/>
+          <w:bCs/>
+          <w:color w:val="1F4E79"/>
+          <w:sz w:val="30"/>
+          <w:szCs w:val="30"/>
+        </w:rPr>
+      </w:pPr>
+    </w:p>
+    <w:p>
+      <w:pPr>
+        <w:pStyle w:val="Ttulo1"/>
+        <w:spacing w:before="280" w:after="160"/>
+      </w:pPr>
+      <w:r>
+        <w:rPr>
+          <w:b/>
+          <w:bCs/>
+          <w:color w:val="1F4E79"/>
+          <w:sz w:val="30"/>
+          <w:szCs w:val="30"/>
+        </w:rPr>
+        <w:lastRenderedPageBreak/>
         <w:t>4. Diagrama de entidades</w:t>
       </w:r>
     </w:p>
@@ -1606,7 +1525,6 @@
           <w:sz w:val="21"/>
           <w:szCs w:val="21"/>
         </w:rPr>
-        <w:lastRenderedPageBreak/>
         <w:t>1. Diagrama de entidades: un servicio puede estar en muchas órdenes; cada orden selecciona un solo servicio.</w:t>
       </w:r>
     </w:p>
@@ -1770,8 +1688,6 @@
       <w:pPr>
         <w:pStyle w:val="Ttulo1"/>
         <w:spacing w:before="280" w:after="160"/>
-      </w:pPr>
-      <w:r>
         <w:rPr>
           <w:b/>
           <w:bCs/>
@@ -1779,6 +1695,61 @@
           <w:sz w:val="30"/>
           <w:szCs w:val="30"/>
         </w:rPr>
+      </w:pPr>
+    </w:p>
+    <w:p>
+      <w:pPr>
+        <w:pStyle w:val="Ttulo1"/>
+        <w:spacing w:before="280" w:after="160"/>
+        <w:rPr>
+          <w:b/>
+          <w:bCs/>
+          <w:color w:val="1F4E79"/>
+          <w:sz w:val="30"/>
+          <w:szCs w:val="30"/>
+        </w:rPr>
+      </w:pPr>
+    </w:p>
+    <w:p>
+      <w:pPr>
+        <w:pStyle w:val="Ttulo1"/>
+        <w:spacing w:before="280" w:after="160"/>
+        <w:rPr>
+          <w:b/>
+          <w:bCs/>
+          <w:color w:val="1F4E79"/>
+          <w:sz w:val="30"/>
+          <w:szCs w:val="30"/>
+        </w:rPr>
+      </w:pPr>
+    </w:p>
+    <w:p>
+      <w:pPr>
+        <w:pStyle w:val="Ttulo1"/>
+        <w:spacing w:before="280" w:after="160"/>
+        <w:rPr>
+          <w:b/>
+          <w:bCs/>
+          <w:color w:val="1F4E79"/>
+          <w:sz w:val="30"/>
+          <w:szCs w:val="30"/>
+        </w:rPr>
+      </w:pPr>
+    </w:p>
+    <w:p>
+      <w:pPr>
+        <w:pStyle w:val="Ttulo1"/>
+        <w:spacing w:before="280" w:after="160"/>
+      </w:pPr>
+      <w:r>
+        <w:rPr>
+          <w:b/>
+          <w:bCs/>
+          <w:color w:val="1F4E79"/>
+          <w:sz w:val="30"/>
+          <w:szCs w:val="30"/>
+        </w:rPr>
+        <w:lastRenderedPageBreak/>
         <w:t>6. Evidencias de la conexión con PostgreSQL</w:t>
       </w:r>
     </w:p>
@@ -1794,7 +1765,6 @@
           <w:sz w:val="21"/>
           <w:szCs w:val="21"/>
         </w:rPr>
-        <w:lastRenderedPageBreak/>
         <w:t xml:space="preserve">2. Tablas </w:t>
       </w:r>
       <w:proofErr w:type="spellStart"/>
@@ -2063,18 +2033,7 @@
           <w:sz w:val="30"/>
           <w:szCs w:val="30"/>
         </w:rPr>
-        <w:lastRenderedPageBreak/>
-        <w:t xml:space="preserve"> </w:t>
-      </w:r>
-      <w:r>
-        <w:rPr>
-          <w:b/>
-          <w:bCs/>
-          <w:color w:val="1F4E79"/>
-          <w:sz w:val="30"/>
-          <w:szCs w:val="30"/>
-        </w:rPr>
-        <w:t>7. Pruebas en Postman: servicios</w:t>
+        <w:t xml:space="preserve"> 7. Pruebas en Postman: servicios</w:t>
       </w:r>
     </w:p>
     <w:p>
@@ -2105,16 +2064,7 @@
           <w:sz w:val="21"/>
           <w:szCs w:val="21"/>
         </w:rPr>
-        <w:t>Prueba 1</w:t>
-      </w:r>
-      <w:r>
-        <w:rPr>
-          <w:b/>
-          <w:bCs/>
-          <w:sz w:val="21"/>
-          <w:szCs w:val="21"/>
-        </w:rPr>
-        <w:t>. GET http://localhost:8080/api/servicios — lista vacía antes del primer registro (200 OK).</w:t>
+        <w:t>Prueba 1. GET http://localhost:8080/api/servicios — lista vacía antes del primer registro (200 OK).</w:t>
       </w:r>
     </w:p>
     <w:p>
@@ -2178,25 +2128,7 @@
           <w:sz w:val="21"/>
           <w:szCs w:val="21"/>
         </w:rPr>
-        <w:t xml:space="preserve">Prueba </w:t>
-      </w:r>
-      <w:r>
-        <w:rPr>
-          <w:b/>
-          <w:bCs/>
-          <w:sz w:val="21"/>
-          <w:szCs w:val="21"/>
-        </w:rPr>
-        <w:t>2</w:t>
-      </w:r>
-      <w:r>
-        <w:rPr>
-          <w:b/>
-          <w:bCs/>
-          <w:sz w:val="21"/>
-          <w:szCs w:val="21"/>
-        </w:rPr>
-        <w:t xml:space="preserve">. POST http://localhost:8080/api/servicios — registro de un servicio (201 </w:t>
+        <w:t xml:space="preserve">Prueba 2. POST http://localhost:8080/api/servicios — registro de un servicio (201 </w:t>
       </w:r>
       <w:proofErr w:type="spellStart"/>
       <w:r>
@@ -2281,25 +2213,7 @@
           <w:szCs w:val="21"/>
         </w:rPr>
         <w:lastRenderedPageBreak/>
-        <w:t xml:space="preserve">Prueba </w:t>
-      </w:r>
-      <w:r>
-        <w:rPr>
-          <w:b/>
-          <w:bCs/>
-          <w:sz w:val="21"/>
-          <w:szCs w:val="21"/>
-        </w:rPr>
-        <w:t>3</w:t>
-      </w:r>
-      <w:r>
-        <w:rPr>
-          <w:b/>
-          <w:bCs/>
-          <w:sz w:val="21"/>
-          <w:szCs w:val="21"/>
-        </w:rPr>
-        <w:t>. GET http://localhost:8080/api/servicios/1 — consulta por identificador (200 OK).</w:t>
+        <w:t>Prueba 3. GET http://localhost:8080/api/servicios/1 — consulta por identificador (200 OK).</w:t>
       </w:r>
     </w:p>
     <w:p>
@@ -2379,25 +2293,7 @@
           <w:sz w:val="21"/>
           <w:szCs w:val="21"/>
         </w:rPr>
-        <w:t xml:space="preserve">Prueba </w:t>
-      </w:r>
-      <w:r>
-        <w:rPr>
-          <w:b/>
-          <w:bCs/>
-          <w:sz w:val="21"/>
-          <w:szCs w:val="21"/>
-        </w:rPr>
-        <w:t>4</w:t>
-      </w:r>
-      <w:r>
-        <w:rPr>
-          <w:b/>
-          <w:bCs/>
-          <w:sz w:val="21"/>
-          <w:szCs w:val="21"/>
-        </w:rPr>
-        <w:t>. GET http://localhost:8080/api/servicios/999 — recurso inexistente (404 Not Found).</w:t>
+        <w:t>Prueba 4. GET http://localhost:8080/api/servicios/999 — recurso inexistente (404 Not Found).</w:t>
       </w:r>
     </w:p>
     <w:p>
@@ -2462,25 +2358,7 @@
           <w:szCs w:val="21"/>
         </w:rPr>
         <w:lastRenderedPageBreak/>
-        <w:t xml:space="preserve">Prueba </w:t>
-      </w:r>
-      <w:r>
-        <w:rPr>
-          <w:b/>
-          <w:bCs/>
-          <w:sz w:val="21"/>
-          <w:szCs w:val="21"/>
-        </w:rPr>
-        <w:t>5</w:t>
-      </w:r>
-      <w:r>
-        <w:rPr>
-          <w:b/>
-          <w:bCs/>
-          <w:sz w:val="21"/>
-          <w:szCs w:val="21"/>
-        </w:rPr>
-        <w:t xml:space="preserve">. POST con nombre vacío y costo negativo — datos inválidos (400 Bad </w:t>
+        <w:t xml:space="preserve">Prueba 5. POST con nombre vacío y costo negativo — datos inválidos (400 Bad </w:t>
       </w:r>
       <w:proofErr w:type="spellStart"/>
       <w:r>
@@ -2564,25 +2442,7 @@
           <w:sz w:val="21"/>
           <w:szCs w:val="21"/>
         </w:rPr>
-        <w:t xml:space="preserve">Prueba </w:t>
-      </w:r>
-      <w:r>
-        <w:rPr>
-          <w:b/>
-          <w:bCs/>
-          <w:sz w:val="21"/>
-          <w:szCs w:val="21"/>
-        </w:rPr>
-        <w:t>6</w:t>
-      </w:r>
-      <w:r>
-        <w:rPr>
-          <w:b/>
-          <w:bCs/>
-          <w:sz w:val="21"/>
-          <w:szCs w:val="21"/>
-        </w:rPr>
-        <w:t xml:space="preserve">. POST con un nombre ya registrado — servicio duplicado (409 </w:t>
+        <w:t xml:space="preserve">Prueba 6. POST con un nombre ya registrado — servicio duplicado (409 </w:t>
       </w:r>
       <w:proofErr w:type="spellStart"/>
       <w:r>
@@ -2667,25 +2527,7 @@
           <w:szCs w:val="21"/>
         </w:rPr>
         <w:lastRenderedPageBreak/>
-        <w:t xml:space="preserve">Prueba </w:t>
-      </w:r>
-      <w:r>
-        <w:rPr>
-          <w:b/>
-          <w:bCs/>
-          <w:sz w:val="21"/>
-          <w:szCs w:val="21"/>
-        </w:rPr>
-        <w:t>7</w:t>
-      </w:r>
-      <w:r>
-        <w:rPr>
-          <w:b/>
-          <w:bCs/>
-          <w:sz w:val="21"/>
-          <w:szCs w:val="21"/>
-        </w:rPr>
-        <w:t xml:space="preserve">. PUT con nombre vacío y costo negativo — datos inválidos (400 Bad </w:t>
+        <w:t xml:space="preserve">Prueba 7. PUT con nombre vacío y costo negativo — datos inválidos (400 Bad </w:t>
       </w:r>
       <w:proofErr w:type="spellStart"/>
       <w:r>
@@ -2785,25 +2627,7 @@
           <w:sz w:val="21"/>
           <w:szCs w:val="21"/>
         </w:rPr>
-        <w:t xml:space="preserve">Prueba </w:t>
-      </w:r>
-      <w:r>
-        <w:rPr>
-          <w:b/>
-          <w:bCs/>
-          <w:sz w:val="21"/>
-          <w:szCs w:val="21"/>
-        </w:rPr>
-        <w:t>8</w:t>
-      </w:r>
-      <w:r>
-        <w:rPr>
-          <w:b/>
-          <w:bCs/>
-          <w:sz w:val="21"/>
-          <w:szCs w:val="21"/>
-        </w:rPr>
-        <w:t>. PUT http://localhost:8080/api/servicios/1 — modificación de un servicio (200 OK).</w:t>
+        <w:t>Prueba 8. PUT http://localhost:8080/api/servicios/1 — modificación de un servicio (200 OK).</w:t>
       </w:r>
     </w:p>
     <w:p>
@@ -2868,25 +2692,7 @@
           <w:szCs w:val="21"/>
         </w:rPr>
         <w:lastRenderedPageBreak/>
-        <w:t xml:space="preserve">Prueba </w:t>
-      </w:r>
-      <w:r>
-        <w:rPr>
-          <w:b/>
-          <w:bCs/>
-          <w:sz w:val="21"/>
-          <w:szCs w:val="21"/>
-        </w:rPr>
-        <w:t>9</w:t>
-      </w:r>
-      <w:r>
-        <w:rPr>
-          <w:b/>
-          <w:bCs/>
-          <w:sz w:val="21"/>
-          <w:szCs w:val="21"/>
-        </w:rPr>
-        <w:t>. PATCH http://localhost:8080/api/servicios/1/desactivar — desactivación (200 OK, activo = false).</w:t>
+        <w:t>Prueba 9. PATCH http://localhost:8080/api/servicios/1/desactivar — desactivación (200 OK, activo = false).</w:t>
       </w:r>
     </w:p>
     <w:p>
@@ -2958,8 +2764,6 @@
       <w:pPr>
         <w:pStyle w:val="Ttulo2"/>
         <w:spacing w:before="200" w:after="120"/>
-      </w:pPr>
-      <w:r>
         <w:rPr>
           <w:b/>
           <w:bCs/>
@@ -2967,6 +2771,15 @@
           <w:sz w:val="25"/>
           <w:szCs w:val="25"/>
         </w:rPr>
+      </w:pPr>
+      <w:r>
+        <w:rPr>
+          <w:b/>
+          <w:bCs/>
+          <w:color w:val="2E5C8A"/>
+          <w:sz w:val="25"/>
+          <w:szCs w:val="25"/>
+        </w:rPr>
         <w:t>8.1 Registro y consultas</w:t>
       </w:r>
     </w:p>
@@ -2980,7 +2793,6 @@
           <w:b/>
           <w:bCs/>
         </w:rPr>
-        <w:lastRenderedPageBreak/>
         <w:t>Prueba 1. POST /api/ordenes — registrar una orden</w:t>
       </w:r>
     </w:p>
@@ -3032,8 +2844,11 @@
         <w:spacing w:after="80"/>
       </w:pPr>
       <w:r>
+        <w:rPr>
+          <w:noProof/>
+        </w:rPr>
         <w:drawing>
-          <wp:inline distT="0" distB="0" distL="0" distR="0" wp14:anchorId="450D955D" wp14:editId="3527DD5D">
+          <wp:inline distT="0" distB="0" distL="0" distR="0" wp14:anchorId="1AA51BE4" wp14:editId="4B2BC98D">
             <wp:extent cx="5612130" cy="2760980"/>
             <wp:effectExtent l="0" t="0" r="7620" b="1270"/>
             <wp:docPr id="383111771" name="Imagen 1"/>
@@ -3071,6 +2886,12 @@
     </w:p>
     <w:p>
       <w:pPr>
+        <w:pStyle w:val="Ttulo2"/>
+        <w:spacing w:before="200" w:after="120"/>
+      </w:pPr>
+    </w:p>
+    <w:p>
+      <w:pPr>
         <w:keepNext/>
         <w:spacing w:before="200" w:after="60"/>
       </w:pPr>
@@ -3079,6 +2900,7 @@
           <w:b/>
           <w:bCs/>
         </w:rPr>
+        <w:lastRenderedPageBreak/>
         <w:t>Prueba 2. GET /api/ordenes — listar órdenes</w:t>
       </w:r>
     </w:p>
@@ -3114,6 +2936,9 @@
         <w:spacing w:after="80"/>
       </w:pPr>
       <w:r>
+        <w:rPr>
+          <w:noProof/>
+        </w:rPr>
         <w:drawing>
           <wp:inline distT="0" distB="0" distL="0" distR="0" wp14:anchorId="591FDCC9" wp14:editId="3665E190">
             <wp:extent cx="5612130" cy="2603500"/>
@@ -3165,63 +2990,12 @@
       <w:pPr>
         <w:keepNext/>
         <w:spacing w:before="200" w:after="60"/>
-        <w:rPr>
-          <w:b/>
-          <w:bCs/>
-        </w:rPr>
-      </w:pPr>
-    </w:p>
-    <w:p>
-      <w:pPr>
-        <w:keepNext/>
-        <w:spacing w:before="200" w:after="60"/>
-        <w:rPr>
-          <w:b/>
-          <w:bCs/>
-        </w:rPr>
-      </w:pPr>
-    </w:p>
-    <w:p>
-      <w:pPr>
-        <w:keepNext/>
-        <w:spacing w:before="200" w:after="60"/>
-        <w:rPr>
-          <w:b/>
-          <w:bCs/>
-        </w:rPr>
-      </w:pPr>
-    </w:p>
-    <w:p>
-      <w:pPr>
-        <w:keepNext/>
-        <w:spacing w:before="200" w:after="60"/>
-        <w:rPr>
-          <w:b/>
-          <w:bCs/>
-        </w:rPr>
-      </w:pPr>
-    </w:p>
-    <w:p>
-      <w:pPr>
-        <w:keepNext/>
-        <w:spacing w:before="200" w:after="60"/>
-        <w:rPr>
-          <w:b/>
-          <w:bCs/>
-        </w:rPr>
-      </w:pPr>
-    </w:p>
-    <w:p>
-      <w:pPr>
-        <w:keepNext/>
-        <w:spacing w:before="200" w:after="60"/>
-      </w:pPr>
-      <w:r>
-        <w:rPr>
-          <w:b/>
-          <w:bCs/>
-        </w:rPr>
-        <w:lastRenderedPageBreak/>
+      </w:pPr>
+      <w:r>
+        <w:rPr>
+          <w:b/>
+          <w:bCs/>
+        </w:rPr>
         <w:t>Prueba 3. GET /api/ordenes/{id} — consultar por identificador</w:t>
       </w:r>
     </w:p>
@@ -3257,6 +3031,9 @@
         <w:spacing w:after="80"/>
       </w:pPr>
       <w:r>
+        <w:rPr>
+          <w:noProof/>
+        </w:rPr>
         <w:drawing>
           <wp:inline distT="0" distB="0" distL="0" distR="0" wp14:anchorId="13B5B238" wp14:editId="3C82CF62">
             <wp:extent cx="5612130" cy="2717800"/>
@@ -3298,8 +3075,6 @@
       <w:pPr>
         <w:pStyle w:val="Ttulo2"/>
         <w:spacing w:before="200" w:after="120"/>
-      </w:pPr>
-      <w:r>
         <w:rPr>
           <w:b/>
           <w:bCs/>
@@ -3307,6 +3082,81 @@
           <w:sz w:val="25"/>
           <w:szCs w:val="25"/>
         </w:rPr>
+      </w:pPr>
+    </w:p>
+    <w:p>
+      <w:pPr>
+        <w:pStyle w:val="Ttulo2"/>
+        <w:spacing w:before="200" w:after="120"/>
+        <w:rPr>
+          <w:b/>
+          <w:bCs/>
+          <w:color w:val="2E5C8A"/>
+          <w:sz w:val="25"/>
+          <w:szCs w:val="25"/>
+        </w:rPr>
+      </w:pPr>
+    </w:p>
+    <w:p>
+      <w:pPr>
+        <w:pStyle w:val="Ttulo2"/>
+        <w:spacing w:before="200" w:after="120"/>
+        <w:rPr>
+          <w:b/>
+          <w:bCs/>
+          <w:color w:val="2E5C8A"/>
+          <w:sz w:val="25"/>
+          <w:szCs w:val="25"/>
+        </w:rPr>
+      </w:pPr>
+    </w:p>
+    <w:p>
+      <w:pPr>
+        <w:pStyle w:val="Ttulo2"/>
+        <w:spacing w:before="200" w:after="120"/>
+        <w:rPr>
+          <w:b/>
+          <w:bCs/>
+          <w:color w:val="2E5C8A"/>
+          <w:sz w:val="25"/>
+          <w:szCs w:val="25"/>
+        </w:rPr>
+      </w:pPr>
+    </w:p>
+    <w:p>
+      <w:pPr>
+        <w:pStyle w:val="Ttulo2"/>
+        <w:spacing w:before="200" w:after="120"/>
+        <w:rPr>
+          <w:b/>
+          <w:bCs/>
+          <w:color w:val="2E5C8A"/>
+          <w:sz w:val="25"/>
+          <w:szCs w:val="25"/>
+        </w:rPr>
+      </w:pPr>
+    </w:p>
+    <w:p>
+      <w:pPr>
+        <w:pStyle w:val="Ttulo2"/>
+        <w:spacing w:before="200" w:after="120"/>
+        <w:rPr>
+          <w:b/>
+          <w:bCs/>
+          <w:color w:val="2E5C8A"/>
+          <w:sz w:val="25"/>
+          <w:szCs w:val="25"/>
+        </w:rPr>
+      </w:pPr>
+      <w:r>
+        <w:rPr>
+          <w:b/>
+          <w:bCs/>
+          <w:color w:val="2E5C8A"/>
+          <w:sz w:val="25"/>
+          <w:szCs w:val="25"/>
+        </w:rPr>
+        <w:lastRenderedPageBreak/>
         <w:t>8.2 Pruebas de excepciones y validaciones</w:t>
       </w:r>
     </w:p>
@@ -3320,7 +3170,6 @@
           <w:b/>
           <w:bCs/>
         </w:rPr>
-        <w:lastRenderedPageBreak/>
         <w:t>Prueba 4. GET /api/ordenes/999 — orden inexistente</w:t>
       </w:r>
     </w:p>
@@ -3356,8 +3205,11 @@
         <w:spacing w:after="80"/>
       </w:pPr>
       <w:r>
+        <w:rPr>
+          <w:noProof/>
+        </w:rPr>
         <w:drawing>
-          <wp:inline distT="0" distB="0" distL="0" distR="0" wp14:anchorId="479BCB7F" wp14:editId="3EDAA82B">
+          <wp:inline distT="0" distB="0" distL="0" distR="0" wp14:anchorId="7ECB8F83" wp14:editId="624D9BB9">
             <wp:extent cx="5612130" cy="2505075"/>
             <wp:effectExtent l="0" t="0" r="7620" b="9525"/>
             <wp:docPr id="1635173230" name="Imagen 1"/>
@@ -3450,15 +3302,22 @@
     </w:p>
     <w:p>
       <w:pPr>
-        <w:keepNext/>
-        <w:spacing w:after="80"/>
+        <w:pStyle w:val="Ttulo2"/>
+        <w:spacing w:before="200" w:after="120"/>
+        <w:rPr>
+          <w:b/>
+          <w:bCs/>
+          <w:color w:val="2E5C8A"/>
+          <w:sz w:val="25"/>
+          <w:szCs w:val="25"/>
+        </w:rPr>
       </w:pPr>
       <w:r>
         <w:rPr>
           <w:noProof/>
         </w:rPr>
         <w:drawing>
-          <wp:inline distT="0" distB="0" distL="0" distR="0" wp14:anchorId="779A95AE" wp14:editId="006D27AE">
+          <wp:inline distT="0" distB="0" distL="0" distR="0" wp14:anchorId="565BE57E" wp14:editId="1E7FF216">
             <wp:extent cx="5612130" cy="2585085"/>
             <wp:effectExtent l="0" t="0" r="7620" b="5715"/>
             <wp:docPr id="1895983541" name="Imagen 1"/>
@@ -3498,76 +3357,6 @@
       <w:pPr>
         <w:keepNext/>
         <w:spacing w:before="200" w:after="60"/>
-        <w:rPr>
-          <w:b/>
-          <w:bCs/>
-        </w:rPr>
-      </w:pPr>
-    </w:p>
-    <w:p>
-      <w:pPr>
-        <w:keepNext/>
-        <w:spacing w:before="200" w:after="60"/>
-        <w:rPr>
-          <w:b/>
-          <w:bCs/>
-        </w:rPr>
-      </w:pPr>
-    </w:p>
-    <w:p>
-      <w:pPr>
-        <w:keepNext/>
-        <w:spacing w:before="200" w:after="60"/>
-        <w:rPr>
-          <w:b/>
-          <w:bCs/>
-        </w:rPr>
-      </w:pPr>
-    </w:p>
-    <w:p>
-      <w:pPr>
-        <w:keepNext/>
-        <w:spacing w:before="200" w:after="60"/>
-        <w:rPr>
-          <w:b/>
-          <w:bCs/>
-        </w:rPr>
-      </w:pPr>
-    </w:p>
-    <w:p>
-      <w:pPr>
-        <w:keepNext/>
-        <w:spacing w:before="200" w:after="60"/>
-        <w:rPr>
-          <w:b/>
-          <w:bCs/>
-        </w:rPr>
-      </w:pPr>
-    </w:p>
-    <w:p>
-      <w:pPr>
-        <w:keepNext/>
-        <w:spacing w:before="200" w:after="60"/>
-        <w:rPr>
-          <w:b/>
-          <w:bCs/>
-        </w:rPr>
-      </w:pPr>
-    </w:p>
-    <w:p>
-      <w:pPr>
-        <w:keepNext/>
-        <w:spacing w:before="200" w:after="60"/>
-        <w:rPr>
-          <w:b/>
-          <w:bCs/>
-        </w:rPr>
-      </w:pPr>
-    </w:p>
-    <w:p>
-      <w:pPr>
-        <w:keepNext/>
-        <w:spacing w:before="200" w:after="60"/>
       </w:pPr>
       <w:r>
         <w:rPr>
@@ -3626,6 +3415,9 @@
         <w:spacing w:after="80"/>
       </w:pPr>
       <w:r>
+        <w:rPr>
+          <w:noProof/>
+        </w:rPr>
         <w:drawing>
           <wp:inline distT="0" distB="0" distL="0" distR="0" wp14:anchorId="6D41CBF1" wp14:editId="1039D09E">
             <wp:extent cx="5612130" cy="2321560"/>
@@ -3724,6 +3516,9 @@
         <w:spacing w:after="80"/>
       </w:pPr>
       <w:r>
+        <w:rPr>
+          <w:noProof/>
+        </w:rPr>
         <w:drawing>
           <wp:inline distT="0" distB="0" distL="0" distR="0" wp14:anchorId="596315F7" wp14:editId="494E981F">
             <wp:extent cx="5612130" cy="2703195"/>
@@ -3823,6 +3618,9 @@
         <w:spacing w:after="80"/>
       </w:pPr>
       <w:r>
+        <w:rPr>
+          <w:noProof/>
+        </w:rPr>
         <w:drawing>
           <wp:inline distT="0" distB="0" distL="0" distR="0" wp14:anchorId="172CFC37" wp14:editId="33D4924A">
             <wp:extent cx="5612130" cy="2783205"/>
@@ -4067,6 +3865,9 @@
         <w:spacing w:after="80"/>
       </w:pPr>
       <w:r>
+        <w:rPr>
+          <w:noProof/>
+        </w:rPr>
         <w:drawing>
           <wp:inline distT="0" distB="0" distL="0" distR="0" wp14:anchorId="4F917BAB" wp14:editId="464FFD05">
             <wp:extent cx="5041900" cy="2320712"/>
@@ -4165,6 +3966,9 @@
         <w:spacing w:after="80"/>
       </w:pPr>
       <w:r>
+        <w:rPr>
+          <w:noProof/>
+        </w:rPr>
         <w:drawing>
           <wp:inline distT="0" distB="0" distL="0" distR="0" wp14:anchorId="4583FA86" wp14:editId="5E106410">
             <wp:extent cx="5029200" cy="2126512"/>
@@ -4251,6 +4055,9 @@
         </w:rPr>
       </w:pPr>
       <w:r>
+        <w:rPr>
+          <w:noProof/>
+        </w:rPr>
         <w:drawing>
           <wp:inline distT="0" distB="0" distL="0" distR="0" wp14:anchorId="21B1245A" wp14:editId="1F4E3BA8">
             <wp:extent cx="4686300" cy="2241872"/>
@@ -4290,16 +4097,23 @@
     </w:p>
     <w:p>
       <w:pPr>
-        <w:pStyle w:val="Ttulo2"/>
-        <w:spacing w:before="200" w:after="120"/>
-      </w:pPr>
-      <w:r>
-        <w:rPr>
-          <w:b/>
-          <w:bCs/>
-          <w:color w:val="2E5C8A"/>
-          <w:sz w:val="25"/>
-          <w:szCs w:val="25"/>
+        <w:keepNext/>
+        <w:spacing w:before="200" w:after="60"/>
+        <w:rPr>
+          <w:b/>
+          <w:bCs/>
+          <w:color w:val="215E99" w:themeColor="text2" w:themeTint="BF"/>
+          <w:sz w:val="28"/>
+          <w:szCs w:val="28"/>
+        </w:rPr>
+      </w:pPr>
+      <w:r>
+        <w:rPr>
+          <w:b/>
+          <w:bCs/>
+          <w:color w:val="215E99" w:themeColor="text2" w:themeTint="BF"/>
+          <w:sz w:val="28"/>
+          <w:szCs w:val="28"/>
         </w:rPr>
         <w:lastRenderedPageBreak/>
         <w:t>8.4 Consultas e indicador</w:t>
@@ -4315,7 +4129,6 @@
           <w:b/>
           <w:bCs/>
         </w:rPr>
-        <w:lastRenderedPageBreak/>
         <w:t>Prueba 14. GET /api/ordenes/estado/PENDIENTE — órdenes por estado</w:t>
       </w:r>
     </w:p>
@@ -4351,8 +4164,11 @@
         <w:spacing w:after="80"/>
       </w:pPr>
       <w:r>
+        <w:rPr>
+          <w:noProof/>
+        </w:rPr>
         <w:drawing>
-          <wp:inline distT="0" distB="0" distL="0" distR="0" wp14:anchorId="1C63399B" wp14:editId="33D1DF06">
+          <wp:inline distT="0" distB="0" distL="0" distR="0" wp14:anchorId="14C6163A" wp14:editId="0E4F61F3">
             <wp:extent cx="4651011" cy="2197100"/>
             <wp:effectExtent l="0" t="0" r="0" b="0"/>
             <wp:docPr id="1475110691" name="Imagen 1"/>
@@ -4449,8 +4265,11 @@
         <w:spacing w:after="80"/>
       </w:pPr>
       <w:r>
+        <w:rPr>
+          <w:noProof/>
+        </w:rPr>
         <w:drawing>
-          <wp:inline distT="0" distB="0" distL="0" distR="0" wp14:anchorId="47A7A179" wp14:editId="2BF8D7AD">
+          <wp:inline distT="0" distB="0" distL="0" distR="0" wp14:anchorId="166D6792" wp14:editId="7E2AF9AB">
             <wp:extent cx="4705350" cy="1851154"/>
             <wp:effectExtent l="0" t="0" r="0" b="0"/>
             <wp:docPr id="1652041141" name="Imagen 1"/>
@@ -4547,8 +4366,12 @@
         <w:spacing w:after="80"/>
       </w:pPr>
       <w:r>
+        <w:rPr>
+          <w:noProof/>
+        </w:rPr>
+        <w:lastRenderedPageBreak/>
         <w:drawing>
-          <wp:inline distT="0" distB="0" distL="0" distR="0" wp14:anchorId="39F82443" wp14:editId="335814B9">
+          <wp:inline distT="0" distB="0" distL="0" distR="0" wp14:anchorId="51B906B6" wp14:editId="42435C0B">
             <wp:extent cx="5017026" cy="2387600"/>
             <wp:effectExtent l="0" t="0" r="0" b="0"/>
             <wp:docPr id="1226849550" name="Imagen 1"/>
@@ -4594,7 +4417,6 @@
           <w:b/>
           <w:bCs/>
         </w:rPr>
-        <w:lastRenderedPageBreak/>
         <w:t>Prueba 17. GET /api/ordenes/cliente/</w:t>
       </w:r>
       <w:proofErr w:type="spellStart"/>
@@ -4678,8 +4500,11 @@
         <w:spacing w:after="80"/>
       </w:pPr>
       <w:r>
+        <w:rPr>
+          <w:noProof/>
+        </w:rPr>
         <w:drawing>
-          <wp:inline distT="0" distB="0" distL="0" distR="0" wp14:anchorId="20DFA483" wp14:editId="3EB704F0">
+          <wp:inline distT="0" distB="0" distL="0" distR="0" wp14:anchorId="2D2EE95D" wp14:editId="7BBB66AE">
             <wp:extent cx="5612130" cy="1526540"/>
             <wp:effectExtent l="0" t="0" r="7620" b="0"/>
             <wp:docPr id="1262515170" name="Imagen 1"/>
@@ -4776,8 +4601,11 @@
         <w:spacing w:after="80"/>
       </w:pPr>
       <w:r>
+        <w:rPr>
+          <w:noProof/>
+        </w:rPr>
         <w:drawing>
-          <wp:inline distT="0" distB="0" distL="0" distR="0" wp14:anchorId="71664AAF" wp14:editId="7C4BFEB3">
+          <wp:inline distT="0" distB="0" distL="0" distR="0" wp14:anchorId="5F5F0F81" wp14:editId="5CE2B016">
             <wp:extent cx="5612130" cy="1475105"/>
             <wp:effectExtent l="0" t="0" r="7620" b="0"/>
             <wp:docPr id="887305249" name="Imagen 1"/>
@@ -4817,8 +4645,6 @@
       <w:pPr>
         <w:pStyle w:val="Ttulo2"/>
         <w:spacing w:before="200" w:after="120"/>
-      </w:pPr>
-      <w:r>
         <w:rPr>
           <w:b/>
           <w:bCs/>
@@ -4826,6 +4652,74 @@
           <w:sz w:val="25"/>
           <w:szCs w:val="25"/>
         </w:rPr>
+      </w:pPr>
+    </w:p>
+    <w:p>
+      <w:pPr>
+        <w:pStyle w:val="Ttulo2"/>
+        <w:spacing w:before="200" w:after="120"/>
+        <w:rPr>
+          <w:b/>
+          <w:bCs/>
+          <w:color w:val="2E5C8A"/>
+          <w:sz w:val="25"/>
+          <w:szCs w:val="25"/>
+        </w:rPr>
+      </w:pPr>
+    </w:p>
+    <w:p>
+      <w:pPr>
+        <w:pStyle w:val="Ttulo2"/>
+        <w:spacing w:before="200" w:after="120"/>
+        <w:rPr>
+          <w:b/>
+          <w:bCs/>
+          <w:color w:val="2E5C8A"/>
+          <w:sz w:val="25"/>
+          <w:szCs w:val="25"/>
+        </w:rPr>
+      </w:pPr>
+    </w:p>
+    <w:p>
+      <w:pPr>
+        <w:pStyle w:val="Ttulo2"/>
+        <w:spacing w:before="200" w:after="120"/>
+        <w:rPr>
+          <w:b/>
+          <w:bCs/>
+          <w:color w:val="2E5C8A"/>
+          <w:sz w:val="25"/>
+          <w:szCs w:val="25"/>
+        </w:rPr>
+      </w:pPr>
+    </w:p>
+    <w:p>
+      <w:pPr>
+        <w:pStyle w:val="Ttulo2"/>
+        <w:spacing w:before="200" w:after="120"/>
+        <w:rPr>
+          <w:b/>
+          <w:bCs/>
+          <w:color w:val="2E5C8A"/>
+          <w:sz w:val="25"/>
+          <w:szCs w:val="25"/>
+        </w:rPr>
+      </w:pPr>
+    </w:p>
+    <w:p>
+      <w:pPr>
+        <w:pStyle w:val="Ttulo2"/>
+        <w:spacing w:before="200" w:after="120"/>
+      </w:pPr>
+      <w:r>
+        <w:rPr>
+          <w:b/>
+          <w:bCs/>
+          <w:color w:val="2E5C8A"/>
+          <w:sz w:val="25"/>
+          <w:szCs w:val="25"/>
+        </w:rPr>
+        <w:lastRenderedPageBreak/>
         <w:t>8.5 Eliminación</w:t>
       </w:r>
     </w:p>
@@ -4865,14 +4759,7 @@
           <w:sz w:val="21"/>
           <w:szCs w:val="21"/>
         </w:rPr>
-        <w:t>204 No Content</w:t>
-      </w:r>
-      <w:r>
-        <w:rPr>
-          <w:sz w:val="21"/>
-          <w:szCs w:val="21"/>
-        </w:rPr>
-        <w:t xml:space="preserve"> o 409 </w:t>
+        <w:t xml:space="preserve">204 No Content o 409 </w:t>
       </w:r>
       <w:proofErr w:type="spellStart"/>
       <w:r>
@@ -4897,8 +4784,11 @@
         <w:spacing w:after="80"/>
       </w:pPr>
       <w:r>
+        <w:rPr>
+          <w:noProof/>
+        </w:rPr>
         <w:drawing>
-          <wp:inline distT="0" distB="0" distL="0" distR="0" wp14:anchorId="05D3DB62" wp14:editId="2B93FE84">
+          <wp:inline distT="0" distB="0" distL="0" distR="0" wp14:anchorId="7F8A2F3A" wp14:editId="7342D235">
             <wp:extent cx="5612130" cy="1654175"/>
             <wp:effectExtent l="0" t="0" r="7620" b="3175"/>
             <wp:docPr id="65761371" name="Imagen 1"/>
@@ -4938,6 +4828,8 @@
       <w:pPr>
         <w:pStyle w:val="Ttulo1"/>
         <w:spacing w:before="280" w:after="160"/>
+      </w:pPr>
+      <w:r>
         <w:rPr>
           <w:b/>
           <w:bCs/>
@@ -4945,61 +4837,6 @@
           <w:sz w:val="30"/>
           <w:szCs w:val="30"/>
         </w:rPr>
-      </w:pPr>
-    </w:p>
-    <w:p>
-      <w:pPr>
-        <w:pStyle w:val="Ttulo1"/>
-        <w:spacing w:before="280" w:after="160"/>
-        <w:rPr>
-          <w:b/>
-          <w:bCs/>
-          <w:color w:val="1F4E79"/>
-          <w:sz w:val="30"/>
-          <w:szCs w:val="30"/>
-        </w:rPr>
-      </w:pPr>
-    </w:p>
-    <w:p>
-      <w:pPr>
-        <w:pStyle w:val="Ttulo1"/>
-        <w:spacing w:before="280" w:after="160"/>
-        <w:rPr>
-          <w:b/>
-          <w:bCs/>
-          <w:color w:val="1F4E79"/>
-          <w:sz w:val="30"/>
-          <w:szCs w:val="30"/>
-        </w:rPr>
-      </w:pPr>
-    </w:p>
-    <w:p>
-      <w:pPr>
-        <w:pStyle w:val="Ttulo1"/>
-        <w:spacing w:before="280" w:after="160"/>
-        <w:rPr>
-          <w:b/>
-          <w:bCs/>
-          <w:color w:val="1F4E79"/>
-          <w:sz w:val="30"/>
-          <w:szCs w:val="30"/>
-        </w:rPr>
-      </w:pPr>
-    </w:p>
-    <w:p>
-      <w:pPr>
-        <w:pStyle w:val="Ttulo1"/>
-        <w:spacing w:before="280" w:after="160"/>
-      </w:pPr>
-      <w:r>
-        <w:rPr>
-          <w:b/>
-          <w:bCs/>
-          <w:color w:val="1F4E79"/>
-          <w:sz w:val="30"/>
-          <w:szCs w:val="30"/>
-        </w:rPr>
-        <w:lastRenderedPageBreak/>
         <w:t>9. Consultas de los datos almacenados en PostgreSQL</w:t>
       </w:r>
     </w:p>
@@ -5048,7 +4885,7 @@
           <w:noProof/>
         </w:rPr>
         <w:drawing>
-          <wp:inline distT="0" distB="0" distL="0" distR="0" wp14:anchorId="763F3400" wp14:editId="71BACDF2">
+          <wp:inline distT="0" distB="0" distL="0" distR="0" wp14:anchorId="65872B1F" wp14:editId="0D8E2572">
             <wp:extent cx="5715000" cy="2838450"/>
             <wp:effectExtent l="0" t="0" r="0" b="0"/>
             <wp:docPr id="1660070346" name="fig13" descr="SELECT * FROM servicio_taller ORDER BY id — servicios registrados durante las pruebas (el servicio 1 aparece desactivado)." title="SELECT * FROM servicio_taller ORDER BY id — servicios registrados durante las pruebas (el servicio 1 aparece desactivado)."/>
@@ -5097,6 +4934,7 @@
           <w:b/>
           <w:bCs/>
         </w:rPr>
+        <w:lastRenderedPageBreak/>
         <w:t xml:space="preserve">Consulta. SELECT * FROM </w:t>
       </w:r>
       <w:proofErr w:type="spellStart"/>
@@ -5180,8 +5018,11 @@
         <w:spacing w:after="80"/>
       </w:pPr>
       <w:r>
+        <w:rPr>
+          <w:noProof/>
+        </w:rPr>
         <w:drawing>
-          <wp:inline distT="0" distB="0" distL="0" distR="0" wp14:anchorId="437C7A10" wp14:editId="19639793">
+          <wp:inline distT="0" distB="0" distL="0" distR="0" wp14:anchorId="213F5072" wp14:editId="14FDEA93">
             <wp:extent cx="5612130" cy="2141855"/>
             <wp:effectExtent l="0" t="0" r="7620" b="0"/>
             <wp:docPr id="1394255332" name="Imagen 1"/>
@@ -5288,6 +5129,10 @@
       <w:pPr>
         <w:keepNext/>
         <w:spacing w:after="80"/>
+        <w:rPr>
+          <w:sz w:val="21"/>
+          <w:szCs w:val="21"/>
+        </w:rPr>
       </w:pPr>
       <w:r>
         <w:rPr>
@@ -5315,7 +5160,19 @@
         <w:t xml:space="preserve"> progresivos que muestran el desarrollo del proyecto.</w:t>
       </w:r>
     </w:p>
+    <w:p>
+      <w:pPr>
+        <w:keepNext/>
+        <w:spacing w:after="80"/>
+      </w:pPr>
+    </w:p>
     <w:p/>
+    <w:p>
+      <w:pPr>
+        <w:pStyle w:val="Ttulo2"/>
+        <w:spacing w:before="200" w:after="120"/>
+      </w:pPr>
+    </w:p>
     <w:sectPr>
       <w:footerReference w:type="default" r:id="rId40"/>
       <w:pgSz w:w="12240" w:h="15840"/>
@@ -5978,6 +5835,7 @@
   </w:style>
   <w:style w:type="paragraph" w:styleId="Ttulo1">
     <w:name w:val="heading 1"/>
+    <w:link w:val="Ttulo1Car"/>
     <w:uiPriority w:val="9"/>
     <w:qFormat/>
     <w:pPr>
@@ -5991,6 +5849,7 @@
   </w:style>
   <w:style w:type="paragraph" w:styleId="Ttulo2">
     <w:name w:val="heading 2"/>
+    <w:link w:val="Ttulo2Car"/>
     <w:uiPriority w:val="9"/>
     <w:unhideWhenUsed/>
     <w:qFormat/>
@@ -6188,6 +6047,30 @@
     <w:rPr>
       <w:color w:val="605E5C"/>
       <w:shd w:val="clear" w:color="auto" w:fill="E1DFDD"/>
+    </w:rPr>
+  </w:style>
+  <w:style w:type="character" w:customStyle="1" w:styleId="Ttulo1Car">
+    <w:name w:val="Título 1 Car"/>
+    <w:basedOn w:val="Fuentedeprrafopredeter"/>
+    <w:link w:val="Ttulo1"/>
+    <w:uiPriority w:val="9"/>
+    <w:rsid w:val="00AA5AA9"/>
+    <w:rPr>
+      <w:color w:val="2E74B5"/>
+      <w:sz w:val="32"/>
+      <w:szCs w:val="32"/>
+    </w:rPr>
+  </w:style>
+  <w:style w:type="character" w:customStyle="1" w:styleId="Ttulo2Car">
+    <w:name w:val="Título 2 Car"/>
+    <w:basedOn w:val="Fuentedeprrafopredeter"/>
+    <w:link w:val="Ttulo2"/>
+    <w:uiPriority w:val="9"/>
+    <w:rsid w:val="00AA5AA9"/>
+    <w:rPr>
+      <w:color w:val="2E74B5"/>
+      <w:sz w:val="26"/>
+      <w:szCs w:val="26"/>
     </w:rPr>
   </w:style>
 </w:styles>

</xml_diff>

<commit_message>
Documento de evidencias final del avance
</commit_message>
<xml_diff>
--- a/evidencias/Evidencias_PF02_Avance2.docx
+++ b/evidencias/Evidencias_PF02_Avance2.docx
@@ -437,25 +437,7 @@
                 <w:sz w:val="21"/>
                 <w:szCs w:val="21"/>
               </w:rPr>
-              <w:t xml:space="preserve">Java 21, Maven, Spring Boot 4.1.2 (Web, Data JPA, </w:t>
-            </w:r>
-            <w:proofErr w:type="spellStart"/>
-            <w:r>
-              <w:rPr>
-                <w:color w:val="000000"/>
-                <w:sz w:val="21"/>
-                <w:szCs w:val="21"/>
-              </w:rPr>
-              <w:t>Validation</w:t>
-            </w:r>
-            <w:proofErr w:type="spellEnd"/>
-            <w:r>
-              <w:rPr>
-                <w:color w:val="000000"/>
-                <w:sz w:val="21"/>
-                <w:szCs w:val="21"/>
-              </w:rPr>
-              <w:t>), PostgreSQL 14</w:t>
+              <w:t>Java 21, Maven, Spring Boot 4.1.2 (Web, Data JPA, Validation), PostgreSQL 14, HTML, CSS y JavaScript</w:t>
             </w:r>
           </w:p>
         </w:tc>
@@ -505,23 +487,13 @@
             </w:tcMar>
           </w:tcPr>
           <w:p>
-            <w:proofErr w:type="spellStart"/>
             <w:r>
               <w:rPr>
                 <w:color w:val="000000"/>
                 <w:sz w:val="21"/>
                 <w:szCs w:val="21"/>
               </w:rPr>
-              <w:t>taller_bicicletas</w:t>
-            </w:r>
-            <w:proofErr w:type="spellEnd"/>
-            <w:r>
-              <w:rPr>
-                <w:color w:val="000000"/>
-                <w:sz w:val="21"/>
-                <w:szCs w:val="21"/>
-              </w:rPr>
-              <w:t xml:space="preserve"> (PostgreSQL, puerto 5433)</w:t>
+              <w:t>taller_bicicletas (PostgreSQL, puerto 5433)</w:t>
             </w:r>
           </w:p>
         </w:tc>
@@ -797,43 +769,7 @@
                 <w:sz w:val="21"/>
                 <w:szCs w:val="21"/>
               </w:rPr>
-              <w:t xml:space="preserve">Entidades </w:t>
-            </w:r>
-            <w:proofErr w:type="spellStart"/>
-            <w:r>
-              <w:rPr>
-                <w:color w:val="000000"/>
-                <w:sz w:val="21"/>
-                <w:szCs w:val="21"/>
-              </w:rPr>
-              <w:t>ServicioTaller</w:t>
-            </w:r>
-            <w:proofErr w:type="spellEnd"/>
-            <w:r>
-              <w:rPr>
-                <w:color w:val="000000"/>
-                <w:sz w:val="21"/>
-                <w:szCs w:val="21"/>
-              </w:rPr>
-              <w:t xml:space="preserve"> y </w:t>
-            </w:r>
-            <w:proofErr w:type="spellStart"/>
-            <w:r>
-              <w:rPr>
-                <w:color w:val="000000"/>
-                <w:sz w:val="21"/>
-                <w:szCs w:val="21"/>
-              </w:rPr>
-              <w:t>OrdenReparacion</w:t>
-            </w:r>
-            <w:proofErr w:type="spellEnd"/>
-            <w:r>
-              <w:rPr>
-                <w:color w:val="000000"/>
-                <w:sz w:val="21"/>
-                <w:szCs w:val="21"/>
-              </w:rPr>
-              <w:t xml:space="preserve"> con relación @ManyToOne</w:t>
+              <w:t>Entidades ServicioTaller y OrdenReparacion con relación @ManyToOne</w:t>
             </w:r>
           </w:p>
         </w:tc>
@@ -889,108 +825,8 @@
                 <w:sz w:val="21"/>
                 <w:szCs w:val="21"/>
               </w:rPr>
-              <w:t xml:space="preserve">Arquitectura por capas: </w:t>
+              <w:t>Arquitectura por capas: controller, service, repository, entity, dto, exception</w:t>
             </w:r>
-            <w:proofErr w:type="spellStart"/>
-            <w:r>
-              <w:rPr>
-                <w:color w:val="000000"/>
-                <w:sz w:val="21"/>
-                <w:szCs w:val="21"/>
-              </w:rPr>
-              <w:t>controller</w:t>
-            </w:r>
-            <w:proofErr w:type="spellEnd"/>
-            <w:r>
-              <w:rPr>
-                <w:color w:val="000000"/>
-                <w:sz w:val="21"/>
-                <w:szCs w:val="21"/>
-              </w:rPr>
-              <w:t xml:space="preserve">, </w:t>
-            </w:r>
-            <w:proofErr w:type="spellStart"/>
-            <w:r>
-              <w:rPr>
-                <w:color w:val="000000"/>
-                <w:sz w:val="21"/>
-                <w:szCs w:val="21"/>
-              </w:rPr>
-              <w:t>service</w:t>
-            </w:r>
-            <w:proofErr w:type="spellEnd"/>
-            <w:r>
-              <w:rPr>
-                <w:color w:val="000000"/>
-                <w:sz w:val="21"/>
-                <w:szCs w:val="21"/>
-              </w:rPr>
-              <w:t xml:space="preserve">, </w:t>
-            </w:r>
-            <w:proofErr w:type="spellStart"/>
-            <w:r>
-              <w:rPr>
-                <w:color w:val="000000"/>
-                <w:sz w:val="21"/>
-                <w:szCs w:val="21"/>
-              </w:rPr>
-              <w:t>repository</w:t>
-            </w:r>
-            <w:proofErr w:type="spellEnd"/>
-            <w:r>
-              <w:rPr>
-                <w:color w:val="000000"/>
-                <w:sz w:val="21"/>
-                <w:szCs w:val="21"/>
-              </w:rPr>
-              <w:t xml:space="preserve">, </w:t>
-            </w:r>
-            <w:proofErr w:type="spellStart"/>
-            <w:r>
-              <w:rPr>
-                <w:color w:val="000000"/>
-                <w:sz w:val="21"/>
-                <w:szCs w:val="21"/>
-              </w:rPr>
-              <w:t>entity</w:t>
-            </w:r>
-            <w:proofErr w:type="spellEnd"/>
-            <w:r>
-              <w:rPr>
-                <w:color w:val="000000"/>
-                <w:sz w:val="21"/>
-                <w:szCs w:val="21"/>
-              </w:rPr>
-              <w:t xml:space="preserve">, </w:t>
-            </w:r>
-            <w:proofErr w:type="spellStart"/>
-            <w:r>
-              <w:rPr>
-                <w:color w:val="000000"/>
-                <w:sz w:val="21"/>
-                <w:szCs w:val="21"/>
-              </w:rPr>
-              <w:t>dto</w:t>
-            </w:r>
-            <w:proofErr w:type="spellEnd"/>
-            <w:r>
-              <w:rPr>
-                <w:color w:val="000000"/>
-                <w:sz w:val="21"/>
-                <w:szCs w:val="21"/>
-              </w:rPr>
-              <w:t xml:space="preserve">, </w:t>
-            </w:r>
-            <w:proofErr w:type="spellStart"/>
-            <w:r>
-              <w:rPr>
-                <w:color w:val="000000"/>
-                <w:sz w:val="21"/>
-                <w:szCs w:val="21"/>
-              </w:rPr>
-              <w:t>exception</w:t>
-            </w:r>
-            <w:proofErr w:type="spellEnd"/>
           </w:p>
         </w:tc>
         <w:tc>
@@ -1458,6 +1294,153 @@
             </w:tcMar>
           </w:tcPr>
           <w:p>
+            <w:pPr>
+              <w:rPr>
+                <w:color w:val="000000"/>
+                <w:sz w:val="21"/>
+                <w:szCs w:val="21"/>
+              </w:rPr>
+            </w:pPr>
+            <w:r>
+              <w:rPr>
+                <w:color w:val="000000"/>
+                <w:sz w:val="21"/>
+                <w:szCs w:val="21"/>
+              </w:rPr>
+              <w:t>Terminada</w:t>
+            </w:r>
+          </w:p>
+        </w:tc>
+      </w:tr>
+      <w:tr>
+        <w:tc>
+          <w:tcPr>
+            <w:tcW w:w="7160" w:type="dxa"/>
+            <w:tcBorders>
+              <w:top w:val="single" w:sz="4" w:space="0" w:color="BFBFBF"/>
+              <w:left w:val="single" w:sz="4" w:space="0" w:color="BFBFBF"/>
+              <w:bottom w:val="single" w:sz="4" w:space="0" w:color="BFBFBF"/>
+              <w:right w:val="single" w:sz="4" w:space="0" w:color="BFBFBF"/>
+            </w:tcBorders>
+            <w:tcMar>
+              <w:top w:w="70" w:type="dxa"/>
+              <w:left w:w="110" w:type="dxa"/>
+              <w:bottom w:w="70" w:type="dxa"/>
+              <w:right w:w="110" w:type="dxa"/>
+            </w:tcMar>
+          </w:tcPr>
+          <w:p>
+            <w:pPr>
+              <w:rPr>
+                <w:color w:val="000000"/>
+                <w:sz w:val="21"/>
+                <w:szCs w:val="21"/>
+              </w:rPr>
+            </w:pPr>
+            <w:r>
+              <w:rPr>
+                <w:color w:val="000000"/>
+                <w:sz w:val="21"/>
+                <w:szCs w:val="21"/>
+              </w:rPr>
+              <w:t>Interfaz web (HTML, CSS y JavaScript) que consume la API REST</w:t>
+            </w:r>
+          </w:p>
+        </w:tc>
+        <w:tc>
+          <w:tcPr>
+            <w:tcW w:w="2200" w:type="dxa"/>
+            <w:tcBorders>
+              <w:top w:val="single" w:sz="4" w:space="0" w:color="BFBFBF"/>
+              <w:left w:val="single" w:sz="4" w:space="0" w:color="BFBFBF"/>
+              <w:bottom w:val="single" w:sz="4" w:space="0" w:color="BFBFBF"/>
+              <w:right w:val="single" w:sz="4" w:space="0" w:color="BFBFBF"/>
+            </w:tcBorders>
+            <w:tcMar>
+              <w:top w:w="70" w:type="dxa"/>
+              <w:left w:w="110" w:type="dxa"/>
+              <w:bottom w:w="70" w:type="dxa"/>
+              <w:right w:w="110" w:type="dxa"/>
+            </w:tcMar>
+          </w:tcPr>
+          <w:p>
+            <w:pPr>
+              <w:rPr>
+                <w:color w:val="000000"/>
+                <w:sz w:val="21"/>
+                <w:szCs w:val="21"/>
+              </w:rPr>
+            </w:pPr>
+            <w:r>
+              <w:rPr>
+                <w:color w:val="000000"/>
+                <w:sz w:val="21"/>
+                <w:szCs w:val="21"/>
+              </w:rPr>
+              <w:t>Terminada</w:t>
+            </w:r>
+          </w:p>
+        </w:tc>
+      </w:tr>
+      <w:tr>
+        <w:tc>
+          <w:tcPr>
+            <w:tcW w:w="7160" w:type="dxa"/>
+            <w:tcBorders>
+              <w:top w:val="single" w:sz="4" w:space="0" w:color="BFBFBF"/>
+              <w:left w:val="single" w:sz="4" w:space="0" w:color="BFBFBF"/>
+              <w:bottom w:val="single" w:sz="4" w:space="0" w:color="BFBFBF"/>
+              <w:right w:val="single" w:sz="4" w:space="0" w:color="BFBFBF"/>
+            </w:tcBorders>
+            <w:tcMar>
+              <w:top w:w="70" w:type="dxa"/>
+              <w:left w:w="110" w:type="dxa"/>
+              <w:bottom w:w="70" w:type="dxa"/>
+              <w:right w:w="110" w:type="dxa"/>
+            </w:tcMar>
+          </w:tcPr>
+          <w:p>
+            <w:pPr>
+              <w:rPr>
+                <w:color w:val="000000"/>
+                <w:sz w:val="21"/>
+                <w:szCs w:val="21"/>
+              </w:rPr>
+            </w:pPr>
+            <w:r>
+              <w:rPr>
+                <w:color w:val="000000"/>
+                <w:sz w:val="21"/>
+                <w:szCs w:val="21"/>
+              </w:rPr>
+              <w:t>README y colección de Postman en el repositorio</w:t>
+            </w:r>
+          </w:p>
+        </w:tc>
+        <w:tc>
+          <w:tcPr>
+            <w:tcW w:w="2200" w:type="dxa"/>
+            <w:tcBorders>
+              <w:top w:val="single" w:sz="4" w:space="0" w:color="BFBFBF"/>
+              <w:left w:val="single" w:sz="4" w:space="0" w:color="BFBFBF"/>
+              <w:bottom w:val="single" w:sz="4" w:space="0" w:color="BFBFBF"/>
+              <w:right w:val="single" w:sz="4" w:space="0" w:color="BFBFBF"/>
+            </w:tcBorders>
+            <w:tcMar>
+              <w:top w:w="70" w:type="dxa"/>
+              <w:left w:w="110" w:type="dxa"/>
+              <w:bottom w:w="70" w:type="dxa"/>
+              <w:right w:w="110" w:type="dxa"/>
+            </w:tcMar>
+          </w:tcPr>
+          <w:p>
+            <w:pPr>
+              <w:rPr>
+                <w:color w:val="000000"/>
+                <w:sz w:val="21"/>
+                <w:szCs w:val="21"/>
+              </w:rPr>
+            </w:pPr>
             <w:r>
               <w:rPr>
                 <w:color w:val="000000"/>
@@ -1470,19 +1453,6 @@
         </w:tc>
       </w:tr>
     </w:tbl>
-    <w:p>
-      <w:pPr>
-        <w:pStyle w:val="Ttulo1"/>
-        <w:spacing w:before="280" w:after="160"/>
-        <w:rPr>
-          <w:b/>
-          <w:bCs/>
-          <w:color w:val="1F4E79"/>
-          <w:sz w:val="30"/>
-          <w:szCs w:val="30"/>
-        </w:rPr>
-      </w:pPr>
-    </w:p>
     <w:p>
       <w:pPr>
         <w:pStyle w:val="Ttulo1"/>
@@ -1765,87 +1735,7 @@
           <w:sz w:val="21"/>
           <w:szCs w:val="21"/>
         </w:rPr>
-        <w:t xml:space="preserve">2. Tablas </w:t>
-      </w:r>
-      <w:proofErr w:type="spellStart"/>
-      <w:r>
-        <w:rPr>
-          <w:b/>
-          <w:bCs/>
-          <w:sz w:val="21"/>
-          <w:szCs w:val="21"/>
-        </w:rPr>
-        <w:t>servicio_taller</w:t>
-      </w:r>
-      <w:proofErr w:type="spellEnd"/>
-      <w:r>
-        <w:rPr>
-          <w:b/>
-          <w:bCs/>
-          <w:sz w:val="21"/>
-          <w:szCs w:val="21"/>
-        </w:rPr>
-        <w:t xml:space="preserve"> y </w:t>
-      </w:r>
-      <w:proofErr w:type="spellStart"/>
-      <w:r>
-        <w:rPr>
-          <w:b/>
-          <w:bCs/>
-          <w:sz w:val="21"/>
-          <w:szCs w:val="21"/>
-        </w:rPr>
-        <w:t>orden_reparacion</w:t>
-      </w:r>
-      <w:proofErr w:type="spellEnd"/>
-      <w:r>
-        <w:rPr>
-          <w:b/>
-          <w:bCs/>
-          <w:sz w:val="21"/>
-          <w:szCs w:val="21"/>
-        </w:rPr>
-        <w:t xml:space="preserve"> creadas en la base </w:t>
-      </w:r>
-      <w:proofErr w:type="spellStart"/>
-      <w:r>
-        <w:rPr>
-          <w:b/>
-          <w:bCs/>
-          <w:sz w:val="21"/>
-          <w:szCs w:val="21"/>
-        </w:rPr>
-        <w:t>taller_bicicletas</w:t>
-      </w:r>
-      <w:proofErr w:type="spellEnd"/>
-      <w:r>
-        <w:rPr>
-          <w:b/>
-          <w:bCs/>
-          <w:sz w:val="21"/>
-          <w:szCs w:val="21"/>
-        </w:rPr>
-        <w:t xml:space="preserve"> (</w:t>
-      </w:r>
-      <w:proofErr w:type="spellStart"/>
-      <w:r>
-        <w:rPr>
-          <w:b/>
-          <w:bCs/>
-          <w:sz w:val="21"/>
-          <w:szCs w:val="21"/>
-        </w:rPr>
-        <w:t>pgAdmin</w:t>
-      </w:r>
-      <w:proofErr w:type="spellEnd"/>
-      <w:r>
-        <w:rPr>
-          <w:b/>
-          <w:bCs/>
-          <w:sz w:val="21"/>
-          <w:szCs w:val="21"/>
-        </w:rPr>
-        <w:t>).</w:t>
+        <w:t>2. Tablas servicio_taller y orden_reparacion creadas en la base taller_bicicletas (pgAdmin).</w:t>
       </w:r>
     </w:p>
     <w:p>
@@ -1909,27 +1799,7 @@
           <w:sz w:val="21"/>
           <w:szCs w:val="21"/>
         </w:rPr>
-        <w:t>3. Arranque de la aplicación: conexión con PostgreSQL (</w:t>
-      </w:r>
-      <w:proofErr w:type="spellStart"/>
-      <w:r>
-        <w:rPr>
-          <w:b/>
-          <w:bCs/>
-          <w:sz w:val="21"/>
-          <w:szCs w:val="21"/>
-        </w:rPr>
-        <w:t>HikariPool</w:t>
-      </w:r>
-      <w:proofErr w:type="spellEnd"/>
-      <w:r>
-        <w:rPr>
-          <w:b/>
-          <w:bCs/>
-          <w:sz w:val="21"/>
-          <w:szCs w:val="21"/>
-        </w:rPr>
-        <w:t>), JPA inicializado y Tomcat en el puerto 8080.</w:t>
+        <w:t>3. Arranque de la aplicación: conexión con PostgreSQL (HikariPool), JPA inicializado y Tomcat en el puerto 8080.</w:t>
       </w:r>
     </w:p>
     <w:p>
@@ -2128,27 +1998,7 @@
           <w:sz w:val="21"/>
           <w:szCs w:val="21"/>
         </w:rPr>
-        <w:t xml:space="preserve">Prueba 2. POST http://localhost:8080/api/servicios — registro de un servicio (201 </w:t>
-      </w:r>
-      <w:proofErr w:type="spellStart"/>
-      <w:r>
-        <w:rPr>
-          <w:b/>
-          <w:bCs/>
-          <w:sz w:val="21"/>
-          <w:szCs w:val="21"/>
-        </w:rPr>
-        <w:t>Created</w:t>
-      </w:r>
-      <w:proofErr w:type="spellEnd"/>
-      <w:r>
-        <w:rPr>
-          <w:b/>
-          <w:bCs/>
-          <w:sz w:val="21"/>
-          <w:szCs w:val="21"/>
-        </w:rPr>
-        <w:t>).</w:t>
+        <w:t>Prueba 2. POST http://localhost:8080/api/servicios — registro de un servicio (201 Created).</w:t>
       </w:r>
     </w:p>
     <w:p>
@@ -2358,27 +2208,7 @@
           <w:szCs w:val="21"/>
         </w:rPr>
         <w:lastRenderedPageBreak/>
-        <w:t xml:space="preserve">Prueba 5. POST con nombre vacío y costo negativo — datos inválidos (400 Bad </w:t>
-      </w:r>
-      <w:proofErr w:type="spellStart"/>
-      <w:r>
-        <w:rPr>
-          <w:b/>
-          <w:bCs/>
-          <w:sz w:val="21"/>
-          <w:szCs w:val="21"/>
-        </w:rPr>
-        <w:t>Request</w:t>
-      </w:r>
-      <w:proofErr w:type="spellEnd"/>
-      <w:r>
-        <w:rPr>
-          <w:b/>
-          <w:bCs/>
-          <w:sz w:val="21"/>
-          <w:szCs w:val="21"/>
-        </w:rPr>
-        <w:t>).</w:t>
+        <w:t>Prueba 5. POST con nombre vacío y costo negativo — datos inválidos (400 Bad Request).</w:t>
       </w:r>
     </w:p>
     <w:p>
@@ -2442,27 +2272,7 @@
           <w:sz w:val="21"/>
           <w:szCs w:val="21"/>
         </w:rPr>
-        <w:t xml:space="preserve">Prueba 6. POST con un nombre ya registrado — servicio duplicado (409 </w:t>
-      </w:r>
-      <w:proofErr w:type="spellStart"/>
-      <w:r>
-        <w:rPr>
-          <w:b/>
-          <w:bCs/>
-          <w:sz w:val="21"/>
-          <w:szCs w:val="21"/>
-        </w:rPr>
-        <w:t>Conflict</w:t>
-      </w:r>
-      <w:proofErr w:type="spellEnd"/>
-      <w:r>
-        <w:rPr>
-          <w:b/>
-          <w:bCs/>
-          <w:sz w:val="21"/>
-          <w:szCs w:val="21"/>
-        </w:rPr>
-        <w:t>).</w:t>
+        <w:t>Prueba 6. POST con un nombre ya registrado — servicio duplicado (409 Conflict).</w:t>
       </w:r>
     </w:p>
     <w:p>
@@ -2527,27 +2337,7 @@
           <w:szCs w:val="21"/>
         </w:rPr>
         <w:lastRenderedPageBreak/>
-        <w:t xml:space="preserve">Prueba 7. PUT con nombre vacío y costo negativo — datos inválidos (400 Bad </w:t>
-      </w:r>
-      <w:proofErr w:type="spellStart"/>
-      <w:r>
-        <w:rPr>
-          <w:b/>
-          <w:bCs/>
-          <w:sz w:val="21"/>
-          <w:szCs w:val="21"/>
-        </w:rPr>
-        <w:t>Request</w:t>
-      </w:r>
-      <w:proofErr w:type="spellEnd"/>
-      <w:r>
-        <w:rPr>
-          <w:b/>
-          <w:bCs/>
-          <w:sz w:val="21"/>
-          <w:szCs w:val="21"/>
-        </w:rPr>
-        <w:t>).</w:t>
+        <w:t>Prueba 7. PUT con nombre vacío y costo negativo — datos inválidos (400 Bad Request).</w:t>
       </w:r>
     </w:p>
     <w:p>
@@ -2819,23 +2609,7 @@
           <w:sz w:val="21"/>
           <w:szCs w:val="21"/>
         </w:rPr>
-        <w:t xml:space="preserve">201 </w:t>
-      </w:r>
-      <w:proofErr w:type="spellStart"/>
-      <w:r>
-        <w:rPr>
-          <w:sz w:val="21"/>
-          <w:szCs w:val="21"/>
-        </w:rPr>
-        <w:t>Created</w:t>
-      </w:r>
-      <w:proofErr w:type="spellEnd"/>
-      <w:r>
-        <w:rPr>
-          <w:sz w:val="21"/>
-          <w:szCs w:val="21"/>
-        </w:rPr>
-        <w:t xml:space="preserve">, estado PENDIENTE y costo estimado = costo base + recargo </w:t>
+        <w:t xml:space="preserve">201 Created, estado PENDIENTE y costo estimado = costo base + recargo </w:t>
       </w:r>
     </w:p>
     <w:p>
@@ -3255,23 +3029,7 @@
           <w:b/>
           <w:bCs/>
         </w:rPr>
-        <w:t xml:space="preserve">Prueba 5. POST con </w:t>
-      </w:r>
-      <w:proofErr w:type="spellStart"/>
-      <w:r>
-        <w:rPr>
-          <w:b/>
-          <w:bCs/>
-        </w:rPr>
-        <w:t>servicioId</w:t>
-      </w:r>
-      <w:proofErr w:type="spellEnd"/>
-      <w:r>
-        <w:rPr>
-          <w:b/>
-          <w:bCs/>
-        </w:rPr>
-        <w:t xml:space="preserve"> inexistente</w:t>
+        <w:t>Prueba 5. POST con servicioId inexistente</w:t>
       </w:r>
     </w:p>
     <w:p>
@@ -3390,23 +3148,7 @@
           <w:sz w:val="21"/>
           <w:szCs w:val="21"/>
         </w:rPr>
-        <w:t xml:space="preserve">409 </w:t>
-      </w:r>
-      <w:proofErr w:type="spellStart"/>
-      <w:r>
-        <w:rPr>
-          <w:sz w:val="21"/>
-          <w:szCs w:val="21"/>
-        </w:rPr>
-        <w:t>Conflict</w:t>
-      </w:r>
-      <w:proofErr w:type="spellEnd"/>
-      <w:r>
-        <w:rPr>
-          <w:sz w:val="21"/>
-          <w:szCs w:val="21"/>
-        </w:rPr>
-        <w:t>: el servicio está desactivado.</w:t>
+        <w:t>409 Conflict: el servicio está desactivado.</w:t>
       </w:r>
     </w:p>
     <w:p>
@@ -3491,23 +3233,7 @@
           <w:sz w:val="21"/>
           <w:szCs w:val="21"/>
         </w:rPr>
-        <w:t xml:space="preserve">400 Bad </w:t>
-      </w:r>
-      <w:proofErr w:type="spellStart"/>
-      <w:r>
-        <w:rPr>
-          <w:sz w:val="21"/>
-          <w:szCs w:val="21"/>
-        </w:rPr>
-        <w:t>Request</w:t>
-      </w:r>
-      <w:proofErr w:type="spellEnd"/>
-      <w:r>
-        <w:rPr>
-          <w:sz w:val="21"/>
-          <w:szCs w:val="21"/>
-        </w:rPr>
-        <w:t xml:space="preserve"> con el detalle de los errores por campo.</w:t>
+        <w:t>400 Bad Request con el detalle de los errores por campo.</w:t>
       </w:r>
     </w:p>
     <w:p>
@@ -3840,23 +3566,7 @@
           <w:sz w:val="21"/>
           <w:szCs w:val="21"/>
         </w:rPr>
-        <w:t xml:space="preserve">409 </w:t>
-      </w:r>
-      <w:proofErr w:type="spellStart"/>
-      <w:r>
-        <w:rPr>
-          <w:sz w:val="21"/>
-          <w:szCs w:val="21"/>
-        </w:rPr>
-        <w:t>Conflict</w:t>
-      </w:r>
-      <w:proofErr w:type="spellEnd"/>
-      <w:r>
-        <w:rPr>
-          <w:sz w:val="21"/>
-          <w:szCs w:val="21"/>
-        </w:rPr>
-        <w:t>: una orden terminada no puede regresar al estado PENDIENTE.</w:t>
+        <w:t>409 Conflict: una orden terminada no puede regresar al estado PENDIENTE.</w:t>
       </w:r>
     </w:p>
     <w:p>
@@ -3941,23 +3651,7 @@
           <w:sz w:val="21"/>
           <w:szCs w:val="21"/>
         </w:rPr>
-        <w:t xml:space="preserve">409 </w:t>
-      </w:r>
-      <w:proofErr w:type="spellStart"/>
-      <w:r>
-        <w:rPr>
-          <w:sz w:val="21"/>
-          <w:szCs w:val="21"/>
-        </w:rPr>
-        <w:t>Conflict</w:t>
-      </w:r>
-      <w:proofErr w:type="spellEnd"/>
-      <w:r>
-        <w:rPr>
-          <w:sz w:val="21"/>
-          <w:szCs w:val="21"/>
-        </w:rPr>
-        <w:t>: no se puede modificar una orden terminada.</w:t>
+        <w:t>409 Conflict: no se puede modificar una orden terminada.</w:t>
       </w:r>
     </w:p>
     <w:p>
@@ -4240,23 +3934,7 @@
           <w:sz w:val="21"/>
           <w:szCs w:val="21"/>
         </w:rPr>
-        <w:t xml:space="preserve">400 Bad </w:t>
-      </w:r>
-      <w:proofErr w:type="spellStart"/>
-      <w:r>
-        <w:rPr>
-          <w:sz w:val="21"/>
-          <w:szCs w:val="21"/>
-        </w:rPr>
-        <w:t>Request</w:t>
-      </w:r>
-      <w:proofErr w:type="spellEnd"/>
-      <w:r>
-        <w:rPr>
-          <w:sz w:val="21"/>
-          <w:szCs w:val="21"/>
-        </w:rPr>
-        <w:t xml:space="preserve"> con los estados permitidos.</w:t>
+        <w:t>400 Bad Request con los estados permitidos.</w:t>
       </w:r>
     </w:p>
     <w:p>
@@ -4315,23 +3993,7 @@
           <w:b/>
           <w:bCs/>
         </w:rPr>
-        <w:t>Prueba 16. GET /api/ordenes/cliente/</w:t>
-      </w:r>
-      <w:proofErr w:type="spellStart"/>
-      <w:r>
-        <w:rPr>
-          <w:b/>
-          <w:bCs/>
-        </w:rPr>
-        <w:t>carlos</w:t>
-      </w:r>
-      <w:proofErr w:type="spellEnd"/>
-      <w:r>
-        <w:rPr>
-          <w:b/>
-          <w:bCs/>
-        </w:rPr>
-        <w:t xml:space="preserve"> — órdenes por cliente</w:t>
+        <w:t>Prueba 16. GET /api/ordenes/cliente/carlos — órdenes por cliente</w:t>
       </w:r>
     </w:p>
     <w:p>
@@ -4417,23 +4079,7 @@
           <w:b/>
           <w:bCs/>
         </w:rPr>
-        <w:t>Prueba 17. GET /api/ordenes/cliente/</w:t>
-      </w:r>
-      <w:proofErr w:type="spellStart"/>
-      <w:r>
-        <w:rPr>
-          <w:b/>
-          <w:bCs/>
-        </w:rPr>
-        <w:t>carlos</w:t>
-      </w:r>
-      <w:proofErr w:type="spellEnd"/>
-      <w:r>
-        <w:rPr>
-          <w:b/>
-          <w:bCs/>
-        </w:rPr>
-        <w:t>/total — total a pagar por cliente</w:t>
+        <w:t>Prueba 17. GET /api/ordenes/cliente/carlos/total — total a pagar por cliente</w:t>
       </w:r>
     </w:p>
     <w:p>
@@ -4459,39 +4105,7 @@
           <w:sz w:val="21"/>
           <w:szCs w:val="21"/>
         </w:rPr>
-        <w:t xml:space="preserve">200 OK con </w:t>
-      </w:r>
-      <w:proofErr w:type="spellStart"/>
-      <w:r>
-        <w:rPr>
-          <w:sz w:val="21"/>
-          <w:szCs w:val="21"/>
-        </w:rPr>
-        <w:t>cantidadOrdenes</w:t>
-      </w:r>
-      <w:proofErr w:type="spellEnd"/>
-      <w:r>
-        <w:rPr>
-          <w:sz w:val="21"/>
-          <w:szCs w:val="21"/>
-        </w:rPr>
-        <w:t xml:space="preserve"> y </w:t>
-      </w:r>
-      <w:proofErr w:type="spellStart"/>
-      <w:r>
-        <w:rPr>
-          <w:sz w:val="21"/>
-          <w:szCs w:val="21"/>
-        </w:rPr>
-        <w:t>totalEstimado</w:t>
-      </w:r>
-      <w:proofErr w:type="spellEnd"/>
-      <w:r>
-        <w:rPr>
-          <w:sz w:val="21"/>
-          <w:szCs w:val="21"/>
-        </w:rPr>
-        <w:t>.</w:t>
+        <w:t>200 OK con cantidadOrdenes y totalEstimado.</w:t>
       </w:r>
     </w:p>
     <w:p>
@@ -4576,23 +4190,7 @@
           <w:sz w:val="21"/>
           <w:szCs w:val="21"/>
         </w:rPr>
-        <w:t xml:space="preserve">200 OK con </w:t>
-      </w:r>
-      <w:proofErr w:type="spellStart"/>
-      <w:r>
-        <w:rPr>
-          <w:sz w:val="21"/>
-          <w:szCs w:val="21"/>
-        </w:rPr>
-        <w:t>cantidadPendientes</w:t>
-      </w:r>
-      <w:proofErr w:type="spellEnd"/>
-      <w:r>
-        <w:rPr>
-          <w:sz w:val="21"/>
-          <w:szCs w:val="21"/>
-        </w:rPr>
-        <w:t>.</w:t>
+        <w:t>200 OK con cantidadPendientes.</w:t>
       </w:r>
     </w:p>
     <w:p>
@@ -4759,23 +4357,7 @@
           <w:sz w:val="21"/>
           <w:szCs w:val="21"/>
         </w:rPr>
-        <w:t xml:space="preserve">204 No Content o 409 </w:t>
-      </w:r>
-      <w:proofErr w:type="spellStart"/>
-      <w:r>
-        <w:rPr>
-          <w:sz w:val="21"/>
-          <w:szCs w:val="21"/>
-        </w:rPr>
-        <w:t>Conflict</w:t>
-      </w:r>
-      <w:proofErr w:type="spellEnd"/>
-      <w:r>
-        <w:rPr>
-          <w:sz w:val="21"/>
-          <w:szCs w:val="21"/>
-        </w:rPr>
-        <w:t xml:space="preserve"> </w:t>
+        <w:t xml:space="preserve">204 No Content o 409 Conflict </w:t>
       </w:r>
     </w:p>
     <w:p>
@@ -4852,27 +4434,7 @@
           <w:sz w:val="21"/>
           <w:szCs w:val="21"/>
         </w:rPr>
-        <w:t xml:space="preserve"> SELECT * FROM </w:t>
-      </w:r>
-      <w:proofErr w:type="spellStart"/>
-      <w:r>
-        <w:rPr>
-          <w:b/>
-          <w:bCs/>
-          <w:sz w:val="21"/>
-          <w:szCs w:val="21"/>
-        </w:rPr>
-        <w:t>servicio_taller</w:t>
-      </w:r>
-      <w:proofErr w:type="spellEnd"/>
-      <w:r>
-        <w:rPr>
-          <w:b/>
-          <w:bCs/>
-          <w:sz w:val="21"/>
-          <w:szCs w:val="21"/>
-        </w:rPr>
-        <w:t xml:space="preserve"> ORDER BY id — servicios registrados durante las pruebas (el servicio 1 aparece desactivado).</w:t>
+        <w:t xml:space="preserve"> SELECT * FROM servicio_taller ORDER BY id — servicios registrados durante las pruebas (el servicio 1 aparece desactivado).</w:t>
       </w:r>
     </w:p>
     <w:p>
@@ -4935,23 +4497,7 @@
           <w:bCs/>
         </w:rPr>
         <w:lastRenderedPageBreak/>
-        <w:t xml:space="preserve">Consulta. SELECT * FROM </w:t>
-      </w:r>
-      <w:proofErr w:type="spellStart"/>
-      <w:r>
-        <w:rPr>
-          <w:b/>
-          <w:bCs/>
-        </w:rPr>
-        <w:t>orden_reparacion</w:t>
-      </w:r>
-      <w:proofErr w:type="spellEnd"/>
-      <w:r>
-        <w:rPr>
-          <w:b/>
-          <w:bCs/>
-        </w:rPr>
-        <w:t xml:space="preserve"> ORDER BY id — órdenes registradas</w:t>
+        <w:t>Consulta. SELECT * FROM orden_reparacion ORDER BY id — órdenes registradas</w:t>
       </w:r>
     </w:p>
     <w:p>
@@ -4977,39 +4523,7 @@
           <w:sz w:val="21"/>
           <w:szCs w:val="21"/>
         </w:rPr>
-        <w:t xml:space="preserve">Registros con cliente, estado, recargo, </w:t>
-      </w:r>
-      <w:proofErr w:type="spellStart"/>
-      <w:r>
-        <w:rPr>
-          <w:sz w:val="21"/>
-          <w:szCs w:val="21"/>
-        </w:rPr>
-        <w:t>costo_estimado</w:t>
-      </w:r>
-      <w:proofErr w:type="spellEnd"/>
-      <w:r>
-        <w:rPr>
-          <w:sz w:val="21"/>
-          <w:szCs w:val="21"/>
-        </w:rPr>
-        <w:t xml:space="preserve"> y </w:t>
-      </w:r>
-      <w:proofErr w:type="spellStart"/>
-      <w:r>
-        <w:rPr>
-          <w:sz w:val="21"/>
-          <w:szCs w:val="21"/>
-        </w:rPr>
-        <w:t>servicio_id</w:t>
-      </w:r>
-      <w:proofErr w:type="spellEnd"/>
-      <w:r>
-        <w:rPr>
-          <w:sz w:val="21"/>
-          <w:szCs w:val="21"/>
-        </w:rPr>
-        <w:t>.</w:t>
+        <w:t>Registros con cliente, estado, recargo, costo_estimado y servicio_id.</w:t>
       </w:r>
     </w:p>
     <w:p>
@@ -5062,8 +4576,6 @@
       <w:pPr>
         <w:pStyle w:val="Ttulo1"/>
         <w:spacing w:before="280" w:after="160"/>
-      </w:pPr>
-      <w:r>
         <w:rPr>
           <w:b/>
           <w:bCs/>
@@ -5071,9 +4583,7 @@
           <w:sz w:val="30"/>
           <w:szCs w:val="30"/>
         </w:rPr>
-        <w:t xml:space="preserve">10. Historial de </w:t>
-      </w:r>
-      <w:proofErr w:type="spellStart"/>
+      </w:pPr>
       <w:r>
         <w:rPr>
           <w:b/>
@@ -5082,9 +4592,8 @@
           <w:sz w:val="30"/>
           <w:szCs w:val="30"/>
         </w:rPr>
-        <w:t>commits</w:t>
-      </w:r>
-      <w:proofErr w:type="spellEnd"/>
+        <w:t xml:space="preserve">10. </w:t>
+      </w:r>
       <w:r>
         <w:rPr>
           <w:b/>
@@ -5093,80 +4602,1075 @@
           <w:sz w:val="30"/>
           <w:szCs w:val="30"/>
         </w:rPr>
-        <w:t xml:space="preserve"> en GitHub</w:t>
-      </w:r>
-    </w:p>
-    <w:p>
-      <w:pPr>
-        <w:keepNext/>
-        <w:spacing w:before="200" w:after="60"/>
-      </w:pPr>
-      <w:r>
-        <w:rPr>
-          <w:b/>
-          <w:bCs/>
-        </w:rPr>
-        <w:t xml:space="preserve">Evidencia. Historial de </w:t>
-      </w:r>
-      <w:proofErr w:type="spellStart"/>
-      <w:r>
-        <w:rPr>
-          <w:b/>
-          <w:bCs/>
-        </w:rPr>
-        <w:t>commits</w:t>
-      </w:r>
-      <w:proofErr w:type="spellEnd"/>
-      <w:r>
-        <w:rPr>
-          <w:b/>
-          <w:bCs/>
-        </w:rPr>
-        <w:t xml:space="preserve"> del repositorio</w:t>
-      </w:r>
-    </w:p>
-    <w:p>
-      <w:pPr>
-        <w:keepNext/>
-        <w:spacing w:after="80"/>
-        <w:rPr>
-          <w:sz w:val="21"/>
-          <w:szCs w:val="21"/>
-        </w:rPr>
-      </w:pPr>
-      <w:r>
-        <w:rPr>
-          <w:b/>
-          <w:bCs/>
-          <w:sz w:val="21"/>
-          <w:szCs w:val="21"/>
-        </w:rPr>
-        <w:t xml:space="preserve">Resultado esperado: </w:t>
-      </w:r>
-      <w:proofErr w:type="spellStart"/>
-      <w:r>
-        <w:rPr>
-          <w:sz w:val="21"/>
-          <w:szCs w:val="21"/>
-        </w:rPr>
-        <w:t>Commits</w:t>
-      </w:r>
-      <w:proofErr w:type="spellEnd"/>
-      <w:r>
-        <w:rPr>
-          <w:sz w:val="21"/>
-          <w:szCs w:val="21"/>
-        </w:rPr>
-        <w:t xml:space="preserve"> progresivos que muestran el desarrollo del proyecto.</w:t>
-      </w:r>
-    </w:p>
-    <w:p>
-      <w:pPr>
-        <w:keepNext/>
-        <w:spacing w:after="80"/>
-      </w:pPr>
-    </w:p>
-    <w:p/>
+        <w:t>Pruebas del frontend</w:t>
+      </w:r>
+    </w:p>
+    <w:p>
+      <w:pPr>
+        <w:pStyle w:val="Ttulo1"/>
+        <w:numPr>
+          <w:ilvl w:val="0"/>
+          <w:numId w:val="3"/>
+        </w:numPr>
+        <w:spacing w:before="280" w:after="160"/>
+        <w:rPr>
+          <w:b/>
+          <w:bCs/>
+          <w:color w:val="auto"/>
+          <w:sz w:val="30"/>
+          <w:szCs w:val="30"/>
+        </w:rPr>
+      </w:pPr>
+      <w:r>
+        <w:rPr>
+          <w:b/>
+          <w:bCs/>
+          <w:color w:val="auto"/>
+          <w:sz w:val="30"/>
+          <w:szCs w:val="30"/>
+        </w:rPr>
+        <w:t>La lista de órdenes cargada, con el indicador de pendientes.</w:t>
+      </w:r>
+    </w:p>
+    <w:p>
+      <w:pPr>
+        <w:pStyle w:val="Ttulo1"/>
+        <w:spacing w:before="280" w:after="160"/>
+        <w:ind w:left="360"/>
+        <w:rPr>
+          <w:b/>
+          <w:bCs/>
+          <w:color w:val="auto"/>
+          <w:sz w:val="30"/>
+          <w:szCs w:val="30"/>
+        </w:rPr>
+      </w:pPr>
+      <w:r>
+        <w:drawing>
+          <wp:inline distT="0" distB="0" distL="0" distR="0" wp14:anchorId="120C1E2D" wp14:editId="75EE68C1">
+            <wp:extent cx="5612130" cy="2701925"/>
+            <wp:effectExtent l="0" t="0" r="7620" b="3175"/>
+            <wp:docPr id="1934024035" name="Imagen 1"/>
+            <wp:cNvGraphicFramePr>
+              <a:graphicFrameLocks xmlns:a="http://schemas.openxmlformats.org/drawingml/2006/main" noChangeAspect="1"/>
+            </wp:cNvGraphicFramePr>
+            <a:graphic xmlns:a="http://schemas.openxmlformats.org/drawingml/2006/main">
+              <a:graphicData uri="http://schemas.openxmlformats.org/drawingml/2006/picture">
+                <pic:pic xmlns:pic="http://schemas.openxmlformats.org/drawingml/2006/picture">
+                  <pic:nvPicPr>
+                    <pic:cNvPr id="1934024035" name=""/>
+                    <pic:cNvPicPr/>
+                  </pic:nvPicPr>
+                  <pic:blipFill>
+                    <a:blip r:embed="rId40"/>
+                    <a:stretch>
+                      <a:fillRect/>
+                    </a:stretch>
+                  </pic:blipFill>
+                  <pic:spPr>
+                    <a:xfrm>
+                      <a:off x="0" y="0"/>
+                      <a:ext cx="5612130" cy="2701925"/>
+                    </a:xfrm>
+                    <a:prstGeom prst="rect">
+                      <a:avLst/>
+                    </a:prstGeom>
+                  </pic:spPr>
+                </pic:pic>
+              </a:graphicData>
+            </a:graphic>
+          </wp:inline>
+        </w:drawing>
+      </w:r>
+    </w:p>
+    <w:p>
+      <w:pPr>
+        <w:pStyle w:val="Ttulo1"/>
+        <w:spacing w:before="280" w:after="160"/>
+        <w:ind w:left="360"/>
+        <w:rPr>
+          <w:b/>
+          <w:bCs/>
+          <w:color w:val="auto"/>
+          <w:sz w:val="30"/>
+          <w:szCs w:val="30"/>
+        </w:rPr>
+      </w:pPr>
+      <w:r>
+        <w:lastRenderedPageBreak/>
+        <w:drawing>
+          <wp:inline distT="0" distB="0" distL="0" distR="0" wp14:anchorId="5635AE18" wp14:editId="6464C3D4">
+            <wp:extent cx="5612130" cy="2781935"/>
+            <wp:effectExtent l="0" t="0" r="7620" b="0"/>
+            <wp:docPr id="1449936726" name="Imagen 1"/>
+            <wp:cNvGraphicFramePr>
+              <a:graphicFrameLocks xmlns:a="http://schemas.openxmlformats.org/drawingml/2006/main" noChangeAspect="1"/>
+            </wp:cNvGraphicFramePr>
+            <a:graphic xmlns:a="http://schemas.openxmlformats.org/drawingml/2006/main">
+              <a:graphicData uri="http://schemas.openxmlformats.org/drawingml/2006/picture">
+                <pic:pic xmlns:pic="http://schemas.openxmlformats.org/drawingml/2006/picture">
+                  <pic:nvPicPr>
+                    <pic:cNvPr id="1449936726" name=""/>
+                    <pic:cNvPicPr/>
+                  </pic:nvPicPr>
+                  <pic:blipFill>
+                    <a:blip r:embed="rId41"/>
+                    <a:stretch>
+                      <a:fillRect/>
+                    </a:stretch>
+                  </pic:blipFill>
+                  <pic:spPr>
+                    <a:xfrm>
+                      <a:off x="0" y="0"/>
+                      <a:ext cx="5612130" cy="2781935"/>
+                    </a:xfrm>
+                    <a:prstGeom prst="rect">
+                      <a:avLst/>
+                    </a:prstGeom>
+                  </pic:spPr>
+                </pic:pic>
+              </a:graphicData>
+            </a:graphic>
+          </wp:inline>
+        </w:drawing>
+      </w:r>
+    </w:p>
+    <w:p>
+      <w:pPr>
+        <w:pStyle w:val="Ttulo1"/>
+        <w:numPr>
+          <w:ilvl w:val="0"/>
+          <w:numId w:val="3"/>
+        </w:numPr>
+        <w:spacing w:before="280" w:after="160"/>
+        <w:rPr>
+          <w:b/>
+          <w:bCs/>
+          <w:color w:val="auto"/>
+          <w:sz w:val="30"/>
+          <w:szCs w:val="30"/>
+        </w:rPr>
+      </w:pPr>
+      <w:r>
+        <w:rPr>
+          <w:b/>
+          <w:bCs/>
+          <w:color w:val="auto"/>
+          <w:sz w:val="30"/>
+          <w:szCs w:val="30"/>
+        </w:rPr>
+        <w:t>El formulario de Nueva orden con el costo previo calculado</w:t>
+      </w:r>
+    </w:p>
+    <w:p>
+      <w:pPr>
+        <w:pStyle w:val="Ttulo1"/>
+        <w:spacing w:before="280" w:after="160"/>
+        <w:ind w:left="360"/>
+        <w:rPr>
+          <w:b/>
+          <w:bCs/>
+          <w:color w:val="auto"/>
+          <w:sz w:val="30"/>
+          <w:szCs w:val="30"/>
+        </w:rPr>
+      </w:pPr>
+      <w:r>
+        <w:rPr>
+          <w:b/>
+          <w:bCs/>
+          <w:color w:val="auto"/>
+          <w:sz w:val="30"/>
+          <w:szCs w:val="30"/>
+        </w:rPr>
+        <w:drawing>
+          <wp:inline distT="0" distB="0" distL="0" distR="0" wp14:anchorId="08B9988D" wp14:editId="531E085A">
+            <wp:extent cx="3153181" cy="3614468"/>
+            <wp:effectExtent l="0" t="0" r="9525" b="5080"/>
+            <wp:docPr id="259642386" name="Imagen 1"/>
+            <wp:cNvGraphicFramePr>
+              <a:graphicFrameLocks xmlns:a="http://schemas.openxmlformats.org/drawingml/2006/main" noChangeAspect="1"/>
+            </wp:cNvGraphicFramePr>
+            <a:graphic xmlns:a="http://schemas.openxmlformats.org/drawingml/2006/main">
+              <a:graphicData uri="http://schemas.openxmlformats.org/drawingml/2006/picture">
+                <pic:pic xmlns:pic="http://schemas.openxmlformats.org/drawingml/2006/picture">
+                  <pic:nvPicPr>
+                    <pic:cNvPr id="259642386" name=""/>
+                    <pic:cNvPicPr/>
+                  </pic:nvPicPr>
+                  <pic:blipFill>
+                    <a:blip r:embed="rId42"/>
+                    <a:stretch>
+                      <a:fillRect/>
+                    </a:stretch>
+                  </pic:blipFill>
+                  <pic:spPr>
+                    <a:xfrm>
+                      <a:off x="0" y="0"/>
+                      <a:ext cx="3161354" cy="3623837"/>
+                    </a:xfrm>
+                    <a:prstGeom prst="rect">
+                      <a:avLst/>
+                    </a:prstGeom>
+                  </pic:spPr>
+                </pic:pic>
+              </a:graphicData>
+            </a:graphic>
+          </wp:inline>
+        </w:drawing>
+      </w:r>
+    </w:p>
+    <w:p>
+      <w:pPr>
+        <w:pStyle w:val="Ttulo1"/>
+        <w:spacing w:before="280" w:after="160"/>
+        <w:ind w:left="360"/>
+        <w:rPr>
+          <w:b/>
+          <w:bCs/>
+          <w:color w:val="auto"/>
+          <w:sz w:val="30"/>
+          <w:szCs w:val="30"/>
+        </w:rPr>
+      </w:pPr>
+    </w:p>
+    <w:p>
+      <w:pPr>
+        <w:pStyle w:val="Ttulo1"/>
+        <w:spacing w:before="280" w:after="160"/>
+        <w:ind w:left="360"/>
+        <w:rPr>
+          <w:b/>
+          <w:bCs/>
+          <w:color w:val="auto"/>
+          <w:sz w:val="30"/>
+          <w:szCs w:val="30"/>
+        </w:rPr>
+      </w:pPr>
+    </w:p>
+    <w:p>
+      <w:pPr>
+        <w:pStyle w:val="Ttulo1"/>
+        <w:spacing w:before="280" w:after="160"/>
+        <w:ind w:left="360"/>
+        <w:rPr>
+          <w:b/>
+          <w:bCs/>
+          <w:color w:val="auto"/>
+          <w:sz w:val="30"/>
+          <w:szCs w:val="30"/>
+        </w:rPr>
+      </w:pPr>
+    </w:p>
+    <w:p>
+      <w:pPr>
+        <w:pStyle w:val="Ttulo1"/>
+        <w:numPr>
+          <w:ilvl w:val="0"/>
+          <w:numId w:val="3"/>
+        </w:numPr>
+        <w:spacing w:before="280" w:after="160"/>
+        <w:rPr>
+          <w:b/>
+          <w:bCs/>
+          <w:color w:val="auto"/>
+          <w:sz w:val="30"/>
+          <w:szCs w:val="30"/>
+        </w:rPr>
+      </w:pPr>
+      <w:r>
+        <w:rPr>
+          <w:b/>
+          <w:bCs/>
+          <w:color w:val="auto"/>
+          <w:sz w:val="30"/>
+          <w:szCs w:val="30"/>
+        </w:rPr>
+        <w:lastRenderedPageBreak/>
+        <w:t>El mensaje verde de éxito</w:t>
+      </w:r>
+    </w:p>
+    <w:p>
+      <w:pPr>
+        <w:pStyle w:val="Ttulo1"/>
+        <w:spacing w:before="280" w:after="160"/>
+        <w:ind w:left="360"/>
+        <w:rPr>
+          <w:b/>
+          <w:bCs/>
+          <w:color w:val="auto"/>
+          <w:sz w:val="30"/>
+          <w:szCs w:val="30"/>
+        </w:rPr>
+      </w:pPr>
+      <w:r>
+        <w:rPr>
+          <w:b/>
+          <w:bCs/>
+          <w:color w:val="auto"/>
+          <w:sz w:val="30"/>
+          <w:szCs w:val="30"/>
+        </w:rPr>
+        <w:drawing>
+          <wp:inline distT="0" distB="0" distL="0" distR="0" wp14:anchorId="42334833" wp14:editId="4465AEC2">
+            <wp:extent cx="5943600" cy="2768600"/>
+            <wp:effectExtent l="0" t="0" r="0" b="0"/>
+            <wp:docPr id="217055601" name="Imagen 1"/>
+            <wp:cNvGraphicFramePr>
+              <a:graphicFrameLocks xmlns:a="http://schemas.openxmlformats.org/drawingml/2006/main" noChangeAspect="1"/>
+            </wp:cNvGraphicFramePr>
+            <a:graphic xmlns:a="http://schemas.openxmlformats.org/drawingml/2006/main">
+              <a:graphicData uri="http://schemas.openxmlformats.org/drawingml/2006/picture">
+                <pic:pic xmlns:pic="http://schemas.openxmlformats.org/drawingml/2006/picture">
+                  <pic:nvPicPr>
+                    <pic:cNvPr id="217055601" name=""/>
+                    <pic:cNvPicPr/>
+                  </pic:nvPicPr>
+                  <pic:blipFill>
+                    <a:blip r:embed="rId43"/>
+                    <a:stretch>
+                      <a:fillRect/>
+                    </a:stretch>
+                  </pic:blipFill>
+                  <pic:spPr>
+                    <a:xfrm>
+                      <a:off x="0" y="0"/>
+                      <a:ext cx="5943600" cy="2768600"/>
+                    </a:xfrm>
+                    <a:prstGeom prst="rect">
+                      <a:avLst/>
+                    </a:prstGeom>
+                  </pic:spPr>
+                </pic:pic>
+              </a:graphicData>
+            </a:graphic>
+          </wp:inline>
+        </w:drawing>
+      </w:r>
+    </w:p>
+    <w:p>
+      <w:pPr>
+        <w:pStyle w:val="Ttulo1"/>
+        <w:numPr>
+          <w:ilvl w:val="0"/>
+          <w:numId w:val="3"/>
+        </w:numPr>
+        <w:spacing w:before="280" w:after="160"/>
+        <w:rPr>
+          <w:b/>
+          <w:bCs/>
+          <w:color w:val="auto"/>
+          <w:sz w:val="30"/>
+          <w:szCs w:val="30"/>
+        </w:rPr>
+      </w:pPr>
+      <w:r>
+        <w:rPr>
+          <w:b/>
+          <w:bCs/>
+          <w:color w:val="auto"/>
+          <w:sz w:val="30"/>
+          <w:szCs w:val="30"/>
+        </w:rPr>
+        <w:t>Formulario enviado vacío, error de validación en rojo</w:t>
+      </w:r>
+    </w:p>
+    <w:p>
+      <w:pPr>
+        <w:pStyle w:val="Ttulo1"/>
+        <w:spacing w:before="280" w:after="160"/>
+        <w:ind w:left="360"/>
+        <w:rPr>
+          <w:b/>
+          <w:bCs/>
+          <w:color w:val="auto"/>
+          <w:sz w:val="30"/>
+          <w:szCs w:val="30"/>
+        </w:rPr>
+      </w:pPr>
+      <w:r>
+        <w:rPr>
+          <w:b/>
+          <w:bCs/>
+          <w:color w:val="auto"/>
+          <w:sz w:val="30"/>
+          <w:szCs w:val="30"/>
+        </w:rPr>
+        <w:drawing>
+          <wp:inline distT="0" distB="0" distL="0" distR="0" wp14:anchorId="0BEE2757" wp14:editId="4A67E66F">
+            <wp:extent cx="3648974" cy="4095041"/>
+            <wp:effectExtent l="0" t="0" r="8890" b="1270"/>
+            <wp:docPr id="1796154654" name="Imagen 1"/>
+            <wp:cNvGraphicFramePr>
+              <a:graphicFrameLocks xmlns:a="http://schemas.openxmlformats.org/drawingml/2006/main" noChangeAspect="1"/>
+            </wp:cNvGraphicFramePr>
+            <a:graphic xmlns:a="http://schemas.openxmlformats.org/drawingml/2006/main">
+              <a:graphicData uri="http://schemas.openxmlformats.org/drawingml/2006/picture">
+                <pic:pic xmlns:pic="http://schemas.openxmlformats.org/drawingml/2006/picture">
+                  <pic:nvPicPr>
+                    <pic:cNvPr id="1796154654" name=""/>
+                    <pic:cNvPicPr/>
+                  </pic:nvPicPr>
+                  <pic:blipFill>
+                    <a:blip r:embed="rId44"/>
+                    <a:stretch>
+                      <a:fillRect/>
+                    </a:stretch>
+                  </pic:blipFill>
+                  <pic:spPr>
+                    <a:xfrm>
+                      <a:off x="0" y="0"/>
+                      <a:ext cx="3654579" cy="4101331"/>
+                    </a:xfrm>
+                    <a:prstGeom prst="rect">
+                      <a:avLst/>
+                    </a:prstGeom>
+                  </pic:spPr>
+                </pic:pic>
+              </a:graphicData>
+            </a:graphic>
+          </wp:inline>
+        </w:drawing>
+      </w:r>
+    </w:p>
+    <w:p>
+      <w:pPr>
+        <w:pStyle w:val="Ttulo1"/>
+        <w:numPr>
+          <w:ilvl w:val="0"/>
+          <w:numId w:val="3"/>
+        </w:numPr>
+        <w:spacing w:before="280" w:after="160"/>
+        <w:rPr>
+          <w:b/>
+          <w:bCs/>
+          <w:color w:val="auto"/>
+          <w:sz w:val="30"/>
+          <w:szCs w:val="30"/>
+        </w:rPr>
+      </w:pPr>
+      <w:r>
+        <w:rPr>
+          <w:b/>
+          <w:bCs/>
+          <w:color w:val="auto"/>
+          <w:sz w:val="30"/>
+          <w:szCs w:val="30"/>
+        </w:rPr>
+        <w:lastRenderedPageBreak/>
+        <w:t>Filtro por estado</w:t>
+      </w:r>
+    </w:p>
+    <w:p>
+      <w:pPr>
+        <w:pStyle w:val="Ttulo1"/>
+        <w:spacing w:before="280" w:after="160"/>
+        <w:ind w:left="360"/>
+        <w:rPr>
+          <w:b/>
+          <w:bCs/>
+          <w:color w:val="auto"/>
+          <w:sz w:val="30"/>
+          <w:szCs w:val="30"/>
+        </w:rPr>
+      </w:pPr>
+      <w:r>
+        <w:rPr>
+          <w:b/>
+          <w:bCs/>
+          <w:color w:val="auto"/>
+          <w:sz w:val="30"/>
+          <w:szCs w:val="30"/>
+        </w:rPr>
+        <w:drawing>
+          <wp:inline distT="0" distB="0" distL="0" distR="0" wp14:anchorId="0F000226" wp14:editId="0E5F2CC5">
+            <wp:extent cx="5943600" cy="2945765"/>
+            <wp:effectExtent l="0" t="0" r="0" b="6985"/>
+            <wp:docPr id="475428233" name="Imagen 1"/>
+            <wp:cNvGraphicFramePr>
+              <a:graphicFrameLocks xmlns:a="http://schemas.openxmlformats.org/drawingml/2006/main" noChangeAspect="1"/>
+            </wp:cNvGraphicFramePr>
+            <a:graphic xmlns:a="http://schemas.openxmlformats.org/drawingml/2006/main">
+              <a:graphicData uri="http://schemas.openxmlformats.org/drawingml/2006/picture">
+                <pic:pic xmlns:pic="http://schemas.openxmlformats.org/drawingml/2006/picture">
+                  <pic:nvPicPr>
+                    <pic:cNvPr id="475428233" name=""/>
+                    <pic:cNvPicPr/>
+                  </pic:nvPicPr>
+                  <pic:blipFill>
+                    <a:blip r:embed="rId45"/>
+                    <a:stretch>
+                      <a:fillRect/>
+                    </a:stretch>
+                  </pic:blipFill>
+                  <pic:spPr>
+                    <a:xfrm>
+                      <a:off x="0" y="0"/>
+                      <a:ext cx="5943600" cy="2945765"/>
+                    </a:xfrm>
+                    <a:prstGeom prst="rect">
+                      <a:avLst/>
+                    </a:prstGeom>
+                  </pic:spPr>
+                </pic:pic>
+              </a:graphicData>
+            </a:graphic>
+          </wp:inline>
+        </w:drawing>
+      </w:r>
+    </w:p>
+    <w:p>
+      <w:pPr>
+        <w:pStyle w:val="Ttulo1"/>
+        <w:numPr>
+          <w:ilvl w:val="0"/>
+          <w:numId w:val="3"/>
+        </w:numPr>
+        <w:spacing w:before="280" w:after="160"/>
+        <w:rPr>
+          <w:b/>
+          <w:bCs/>
+          <w:color w:val="auto"/>
+          <w:sz w:val="30"/>
+          <w:szCs w:val="30"/>
+        </w:rPr>
+      </w:pPr>
+      <w:r>
+        <w:rPr>
+          <w:b/>
+          <w:bCs/>
+          <w:color w:val="auto"/>
+          <w:sz w:val="30"/>
+          <w:szCs w:val="30"/>
+        </w:rPr>
+        <w:t>búsqueda por cliente con la tarjeta del total a pagar.</w:t>
+      </w:r>
+    </w:p>
+    <w:p>
+      <w:pPr>
+        <w:pStyle w:val="Ttulo1"/>
+        <w:spacing w:before="280" w:after="160"/>
+        <w:ind w:left="360"/>
+        <w:rPr>
+          <w:b/>
+          <w:bCs/>
+          <w:color w:val="auto"/>
+          <w:sz w:val="30"/>
+          <w:szCs w:val="30"/>
+        </w:rPr>
+      </w:pPr>
+      <w:r>
+        <w:rPr>
+          <w:b/>
+          <w:bCs/>
+          <w:color w:val="auto"/>
+          <w:sz w:val="30"/>
+          <w:szCs w:val="30"/>
+        </w:rPr>
+        <w:drawing>
+          <wp:inline distT="0" distB="0" distL="0" distR="0" wp14:anchorId="7445478C" wp14:editId="20D6B8BA">
+            <wp:extent cx="5943600" cy="2955290"/>
+            <wp:effectExtent l="0" t="0" r="0" b="0"/>
+            <wp:docPr id="398118939" name="Imagen 1"/>
+            <wp:cNvGraphicFramePr>
+              <a:graphicFrameLocks xmlns:a="http://schemas.openxmlformats.org/drawingml/2006/main" noChangeAspect="1"/>
+            </wp:cNvGraphicFramePr>
+            <a:graphic xmlns:a="http://schemas.openxmlformats.org/drawingml/2006/main">
+              <a:graphicData uri="http://schemas.openxmlformats.org/drawingml/2006/picture">
+                <pic:pic xmlns:pic="http://schemas.openxmlformats.org/drawingml/2006/picture">
+                  <pic:nvPicPr>
+                    <pic:cNvPr id="398118939" name=""/>
+                    <pic:cNvPicPr/>
+                  </pic:nvPicPr>
+                  <pic:blipFill>
+                    <a:blip r:embed="rId46"/>
+                    <a:stretch>
+                      <a:fillRect/>
+                    </a:stretch>
+                  </pic:blipFill>
+                  <pic:spPr>
+                    <a:xfrm>
+                      <a:off x="0" y="0"/>
+                      <a:ext cx="5943600" cy="2955290"/>
+                    </a:xfrm>
+                    <a:prstGeom prst="rect">
+                      <a:avLst/>
+                    </a:prstGeom>
+                  </pic:spPr>
+                </pic:pic>
+              </a:graphicData>
+            </a:graphic>
+          </wp:inline>
+        </w:drawing>
+      </w:r>
+    </w:p>
+    <w:p>
+      <w:pPr>
+        <w:pStyle w:val="Ttulo1"/>
+        <w:spacing w:before="280" w:after="160"/>
+        <w:ind w:left="360"/>
+        <w:rPr>
+          <w:b/>
+          <w:bCs/>
+          <w:color w:val="auto"/>
+          <w:sz w:val="30"/>
+          <w:szCs w:val="30"/>
+        </w:rPr>
+      </w:pPr>
+    </w:p>
+    <w:p>
+      <w:pPr>
+        <w:pStyle w:val="Ttulo1"/>
+        <w:spacing w:before="280" w:after="160"/>
+        <w:ind w:left="360"/>
+        <w:rPr>
+          <w:b/>
+          <w:bCs/>
+          <w:color w:val="auto"/>
+          <w:sz w:val="30"/>
+          <w:szCs w:val="30"/>
+        </w:rPr>
+      </w:pPr>
+    </w:p>
+    <w:p>
+      <w:pPr>
+        <w:pStyle w:val="Ttulo1"/>
+        <w:spacing w:before="280" w:after="160"/>
+        <w:ind w:left="360"/>
+        <w:rPr>
+          <w:b/>
+          <w:bCs/>
+          <w:color w:val="auto"/>
+          <w:sz w:val="30"/>
+          <w:szCs w:val="30"/>
+        </w:rPr>
+      </w:pPr>
+    </w:p>
+    <w:p>
+      <w:pPr>
+        <w:pStyle w:val="Ttulo1"/>
+        <w:numPr>
+          <w:ilvl w:val="0"/>
+          <w:numId w:val="3"/>
+        </w:numPr>
+        <w:spacing w:before="280" w:after="160"/>
+        <w:rPr>
+          <w:b/>
+          <w:bCs/>
+          <w:color w:val="auto"/>
+          <w:sz w:val="30"/>
+          <w:szCs w:val="30"/>
+        </w:rPr>
+      </w:pPr>
+      <w:r>
+        <w:rPr>
+          <w:b/>
+          <w:bCs/>
+          <w:color w:val="auto"/>
+          <w:sz w:val="30"/>
+          <w:szCs w:val="30"/>
+        </w:rPr>
+        <w:lastRenderedPageBreak/>
+        <w:t>C</w:t>
+      </w:r>
+      <w:r>
+        <w:rPr>
+          <w:b/>
+          <w:bCs/>
+          <w:color w:val="auto"/>
+          <w:sz w:val="30"/>
+          <w:szCs w:val="30"/>
+        </w:rPr>
+        <w:t>ambio de estado de una orden</w:t>
+      </w:r>
+    </w:p>
+    <w:p>
+      <w:pPr>
+        <w:pStyle w:val="Ttulo1"/>
+        <w:spacing w:before="280" w:after="160"/>
+        <w:ind w:left="360"/>
+        <w:rPr>
+          <w:b/>
+          <w:bCs/>
+          <w:color w:val="auto"/>
+          <w:sz w:val="30"/>
+          <w:szCs w:val="30"/>
+        </w:rPr>
+      </w:pPr>
+      <w:r>
+        <w:rPr>
+          <w:b/>
+          <w:bCs/>
+          <w:color w:val="auto"/>
+          <w:sz w:val="30"/>
+          <w:szCs w:val="30"/>
+        </w:rPr>
+        <w:drawing>
+          <wp:inline distT="0" distB="0" distL="0" distR="0" wp14:anchorId="68797C94" wp14:editId="17AD1EC6">
+            <wp:extent cx="5943600" cy="2403475"/>
+            <wp:effectExtent l="0" t="0" r="0" b="0"/>
+            <wp:docPr id="1822305829" name="Imagen 1"/>
+            <wp:cNvGraphicFramePr>
+              <a:graphicFrameLocks xmlns:a="http://schemas.openxmlformats.org/drawingml/2006/main" noChangeAspect="1"/>
+            </wp:cNvGraphicFramePr>
+            <a:graphic xmlns:a="http://schemas.openxmlformats.org/drawingml/2006/main">
+              <a:graphicData uri="http://schemas.openxmlformats.org/drawingml/2006/picture">
+                <pic:pic xmlns:pic="http://schemas.openxmlformats.org/drawingml/2006/picture">
+                  <pic:nvPicPr>
+                    <pic:cNvPr id="1822305829" name=""/>
+                    <pic:cNvPicPr/>
+                  </pic:nvPicPr>
+                  <pic:blipFill>
+                    <a:blip r:embed="rId47"/>
+                    <a:stretch>
+                      <a:fillRect/>
+                    </a:stretch>
+                  </pic:blipFill>
+                  <pic:spPr>
+                    <a:xfrm>
+                      <a:off x="0" y="0"/>
+                      <a:ext cx="5943600" cy="2403475"/>
+                    </a:xfrm>
+                    <a:prstGeom prst="rect">
+                      <a:avLst/>
+                    </a:prstGeom>
+                  </pic:spPr>
+                </pic:pic>
+              </a:graphicData>
+            </a:graphic>
+          </wp:inline>
+        </w:drawing>
+      </w:r>
+    </w:p>
+    <w:p>
+      <w:pPr>
+        <w:pStyle w:val="Ttulo1"/>
+        <w:numPr>
+          <w:ilvl w:val="0"/>
+          <w:numId w:val="3"/>
+        </w:numPr>
+        <w:spacing w:before="280" w:after="160"/>
+        <w:rPr>
+          <w:b/>
+          <w:bCs/>
+          <w:color w:val="auto"/>
+          <w:sz w:val="30"/>
+          <w:szCs w:val="30"/>
+        </w:rPr>
+      </w:pPr>
+      <w:r>
+        <w:rPr>
+          <w:b/>
+          <w:bCs/>
+          <w:color w:val="auto"/>
+          <w:sz w:val="30"/>
+          <w:szCs w:val="30"/>
+        </w:rPr>
+        <w:t>Error devuelto por la API</w:t>
+      </w:r>
+    </w:p>
+    <w:p>
+      <w:pPr>
+        <w:pStyle w:val="Ttulo1"/>
+        <w:spacing w:before="280" w:after="160"/>
+        <w:ind w:left="360"/>
+        <w:rPr>
+          <w:b/>
+          <w:bCs/>
+          <w:color w:val="auto"/>
+          <w:sz w:val="30"/>
+          <w:szCs w:val="30"/>
+        </w:rPr>
+      </w:pPr>
+      <w:r>
+        <w:rPr>
+          <w:b/>
+          <w:bCs/>
+          <w:color w:val="auto"/>
+          <w:sz w:val="30"/>
+          <w:szCs w:val="30"/>
+        </w:rPr>
+        <w:drawing>
+          <wp:inline distT="0" distB="0" distL="0" distR="0" wp14:anchorId="67823FB5" wp14:editId="0AD30249">
+            <wp:extent cx="5943600" cy="2708275"/>
+            <wp:effectExtent l="0" t="0" r="0" b="0"/>
+            <wp:docPr id="850135170" name="Imagen 1"/>
+            <wp:cNvGraphicFramePr>
+              <a:graphicFrameLocks xmlns:a="http://schemas.openxmlformats.org/drawingml/2006/main" noChangeAspect="1"/>
+            </wp:cNvGraphicFramePr>
+            <a:graphic xmlns:a="http://schemas.openxmlformats.org/drawingml/2006/main">
+              <a:graphicData uri="http://schemas.openxmlformats.org/drawingml/2006/picture">
+                <pic:pic xmlns:pic="http://schemas.openxmlformats.org/drawingml/2006/picture">
+                  <pic:nvPicPr>
+                    <pic:cNvPr id="850135170" name=""/>
+                    <pic:cNvPicPr/>
+                  </pic:nvPicPr>
+                  <pic:blipFill>
+                    <a:blip r:embed="rId48"/>
+                    <a:stretch>
+                      <a:fillRect/>
+                    </a:stretch>
+                  </pic:blipFill>
+                  <pic:spPr>
+                    <a:xfrm>
+                      <a:off x="0" y="0"/>
+                      <a:ext cx="5943600" cy="2708275"/>
+                    </a:xfrm>
+                    <a:prstGeom prst="rect">
+                      <a:avLst/>
+                    </a:prstGeom>
+                  </pic:spPr>
+                </pic:pic>
+              </a:graphicData>
+            </a:graphic>
+          </wp:inline>
+        </w:drawing>
+      </w:r>
+    </w:p>
+    <w:p>
+      <w:pPr>
+        <w:pStyle w:val="Ttulo1"/>
+        <w:spacing w:before="280" w:after="160"/>
+        <w:ind w:left="360"/>
+        <w:rPr>
+          <w:b/>
+          <w:bCs/>
+          <w:color w:val="auto"/>
+          <w:sz w:val="30"/>
+          <w:szCs w:val="30"/>
+        </w:rPr>
+      </w:pPr>
+      <w:r>
+        <w:rPr>
+          <w:b/>
+          <w:bCs/>
+          <w:color w:val="auto"/>
+          <w:sz w:val="30"/>
+          <w:szCs w:val="30"/>
+        </w:rPr>
+        <w:lastRenderedPageBreak/>
+        <w:drawing>
+          <wp:inline distT="0" distB="0" distL="0" distR="0" wp14:anchorId="5C0B63D7" wp14:editId="3C020739">
+            <wp:extent cx="4203485" cy="4744528"/>
+            <wp:effectExtent l="0" t="0" r="6985" b="0"/>
+            <wp:docPr id="1671915586" name="Imagen 1"/>
+            <wp:cNvGraphicFramePr>
+              <a:graphicFrameLocks xmlns:a="http://schemas.openxmlformats.org/drawingml/2006/main" noChangeAspect="1"/>
+            </wp:cNvGraphicFramePr>
+            <a:graphic xmlns:a="http://schemas.openxmlformats.org/drawingml/2006/main">
+              <a:graphicData uri="http://schemas.openxmlformats.org/drawingml/2006/picture">
+                <pic:pic xmlns:pic="http://schemas.openxmlformats.org/drawingml/2006/picture">
+                  <pic:nvPicPr>
+                    <pic:cNvPr id="1671915586" name=""/>
+                    <pic:cNvPicPr/>
+                  </pic:nvPicPr>
+                  <pic:blipFill>
+                    <a:blip r:embed="rId49"/>
+                    <a:stretch>
+                      <a:fillRect/>
+                    </a:stretch>
+                  </pic:blipFill>
+                  <pic:spPr>
+                    <a:xfrm>
+                      <a:off x="0" y="0"/>
+                      <a:ext cx="4259211" cy="4807426"/>
+                    </a:xfrm>
+                    <a:prstGeom prst="rect">
+                      <a:avLst/>
+                    </a:prstGeom>
+                  </pic:spPr>
+                </pic:pic>
+              </a:graphicData>
+            </a:graphic>
+          </wp:inline>
+        </w:drawing>
+      </w:r>
+    </w:p>
+    <w:p>
+      <w:pPr>
+        <w:pStyle w:val="Ttulo1"/>
+        <w:numPr>
+          <w:ilvl w:val="0"/>
+          <w:numId w:val="3"/>
+        </w:numPr>
+        <w:spacing w:before="280" w:after="160"/>
+        <w:rPr>
+          <w:b/>
+          <w:bCs/>
+          <w:color w:val="auto"/>
+          <w:sz w:val="30"/>
+          <w:szCs w:val="30"/>
+        </w:rPr>
+      </w:pPr>
+      <w:r>
+        <w:rPr>
+          <w:b/>
+          <w:bCs/>
+          <w:color w:val="auto"/>
+          <w:sz w:val="30"/>
+          <w:szCs w:val="30"/>
+        </w:rPr>
+        <w:t>Pestaña Servicios</w:t>
+      </w:r>
+    </w:p>
+    <w:p>
+      <w:pPr>
+        <w:pStyle w:val="Ttulo1"/>
+        <w:spacing w:before="280" w:after="160"/>
+        <w:ind w:left="360"/>
+        <w:rPr>
+          <w:b/>
+          <w:bCs/>
+          <w:color w:val="auto"/>
+          <w:sz w:val="30"/>
+          <w:szCs w:val="30"/>
+        </w:rPr>
+      </w:pPr>
+      <w:r>
+        <w:rPr>
+          <w:b/>
+          <w:bCs/>
+          <w:color w:val="auto"/>
+          <w:sz w:val="30"/>
+          <w:szCs w:val="30"/>
+        </w:rPr>
+        <w:drawing>
+          <wp:inline distT="0" distB="0" distL="0" distR="0" wp14:anchorId="34DBE090" wp14:editId="4B26BB7E">
+            <wp:extent cx="5822158" cy="2881222"/>
+            <wp:effectExtent l="0" t="0" r="7620" b="0"/>
+            <wp:docPr id="2125998017" name="Imagen 1"/>
+            <wp:cNvGraphicFramePr>
+              <a:graphicFrameLocks xmlns:a="http://schemas.openxmlformats.org/drawingml/2006/main" noChangeAspect="1"/>
+            </wp:cNvGraphicFramePr>
+            <a:graphic xmlns:a="http://schemas.openxmlformats.org/drawingml/2006/main">
+              <a:graphicData uri="http://schemas.openxmlformats.org/drawingml/2006/picture">
+                <pic:pic xmlns:pic="http://schemas.openxmlformats.org/drawingml/2006/picture">
+                  <pic:nvPicPr>
+                    <pic:cNvPr id="2125998017" name=""/>
+                    <pic:cNvPicPr/>
+                  </pic:nvPicPr>
+                  <pic:blipFill>
+                    <a:blip r:embed="rId50"/>
+                    <a:stretch>
+                      <a:fillRect/>
+                    </a:stretch>
+                  </pic:blipFill>
+                  <pic:spPr>
+                    <a:xfrm>
+                      <a:off x="0" y="0"/>
+                      <a:ext cx="5847567" cy="2893796"/>
+                    </a:xfrm>
+                    <a:prstGeom prst="rect">
+                      <a:avLst/>
+                    </a:prstGeom>
+                  </pic:spPr>
+                </pic:pic>
+              </a:graphicData>
+            </a:graphic>
+          </wp:inline>
+        </w:drawing>
+      </w:r>
+    </w:p>
+    <w:p>
+      <w:pPr>
+        <w:pStyle w:val="Ttulo1"/>
+        <w:spacing w:before="280" w:after="160"/>
+        <w:rPr>
+          <w:b/>
+          <w:bCs/>
+          <w:color w:val="1F4E79"/>
+          <w:sz w:val="30"/>
+          <w:szCs w:val="30"/>
+        </w:rPr>
+      </w:pPr>
+      <w:r>
+        <w:rPr>
+          <w:b/>
+          <w:bCs/>
+          <w:color w:val="1F4E79"/>
+          <w:sz w:val="30"/>
+          <w:szCs w:val="30"/>
+        </w:rPr>
+        <w:lastRenderedPageBreak/>
+        <w:t>11. Historial de commits en GitHub</w:t>
+      </w:r>
+    </w:p>
+    <w:p>
+      <w:pPr>
+        <w:pStyle w:val="Ttulo1"/>
+        <w:spacing w:before="280" w:after="160"/>
+      </w:pPr>
+      <w:r>
+        <w:drawing>
+          <wp:inline distT="0" distB="0" distL="0" distR="0" wp14:anchorId="4D010189" wp14:editId="6492060C">
+            <wp:extent cx="5943600" cy="2924810"/>
+            <wp:effectExtent l="0" t="0" r="0" b="8890"/>
+            <wp:docPr id="1909124827" name="Imagen 1"/>
+            <wp:cNvGraphicFramePr>
+              <a:graphicFrameLocks xmlns:a="http://schemas.openxmlformats.org/drawingml/2006/main" noChangeAspect="1"/>
+            </wp:cNvGraphicFramePr>
+            <a:graphic xmlns:a="http://schemas.openxmlformats.org/drawingml/2006/main">
+              <a:graphicData uri="http://schemas.openxmlformats.org/drawingml/2006/picture">
+                <pic:pic xmlns:pic="http://schemas.openxmlformats.org/drawingml/2006/picture">
+                  <pic:nvPicPr>
+                    <pic:cNvPr id="1909124827" name=""/>
+                    <pic:cNvPicPr/>
+                  </pic:nvPicPr>
+                  <pic:blipFill>
+                    <a:blip r:embed="rId51"/>
+                    <a:stretch>
+                      <a:fillRect/>
+                    </a:stretch>
+                  </pic:blipFill>
+                  <pic:spPr>
+                    <a:xfrm>
+                      <a:off x="0" y="0"/>
+                      <a:ext cx="5943600" cy="2924810"/>
+                    </a:xfrm>
+                    <a:prstGeom prst="rect">
+                      <a:avLst/>
+                    </a:prstGeom>
+                  </pic:spPr>
+                </pic:pic>
+              </a:graphicData>
+            </a:graphic>
+          </wp:inline>
+        </w:drawing>
+      </w:r>
+    </w:p>
+    <w:p>
+      <w:pPr>
+        <w:pStyle w:val="Ttulo1"/>
+        <w:spacing w:before="280" w:after="160"/>
+        <w:rPr>
+          <w:b/>
+          <w:bCs/>
+          <w:color w:val="auto"/>
+          <w:sz w:val="30"/>
+          <w:szCs w:val="30"/>
+        </w:rPr>
+      </w:pPr>
+    </w:p>
+    <w:p>
+      <w:pPr>
+        <w:pStyle w:val="Ttulo1"/>
+        <w:spacing w:before="280" w:after="160"/>
+        <w:ind w:left="360"/>
+        <w:rPr>
+          <w:b/>
+          <w:bCs/>
+          <w:color w:val="auto"/>
+          <w:sz w:val="30"/>
+          <w:szCs w:val="30"/>
+        </w:rPr>
+      </w:pPr>
+    </w:p>
+    <w:p>
+      <w:pPr>
+        <w:pStyle w:val="Ttulo1"/>
+        <w:spacing w:before="280" w:after="160"/>
+      </w:pPr>
+    </w:p>
     <w:p>
       <w:pPr>
         <w:pStyle w:val="Ttulo2"/>
@@ -5174,7 +5678,7 @@
       </w:pPr>
     </w:p>
     <w:sectPr>
-      <w:footerReference w:type="default" r:id="rId40"/>
+      <w:footerReference w:type="default" r:id="rId52"/>
       <w:pgSz w:w="12240" w:h="15840"/>
       <w:pgMar w:top="1440" w:right="1440" w:bottom="1440" w:left="1440" w:header="708" w:footer="708" w:gutter="0"/>
       <w:cols w:space="720"/>
@@ -5284,6 +5788,92 @@
 <file path=word/numbering.xml><?xml version="1.0" encoding="utf-8"?>
 <w:numbering xmlns:wpc="http://schemas.microsoft.com/office/word/2010/wordprocessingCanvas" xmlns:cx="http://schemas.microsoft.com/office/drawing/2014/chartex" xmlns:cx1="http://schemas.microsoft.com/office/drawing/2015/9/8/chartex" xmlns:cx2="http://schemas.microsoft.com/office/drawing/2015/10/21/chartex" xmlns:cx3="http://schemas.microsoft.com/office/drawing/2016/5/9/chartex" xmlns:cx4="http://schemas.microsoft.com/office/drawing/2016/5/10/chartex" xmlns:cx5="http://schemas.microsoft.com/office/drawing/2016/5/11/chartex" xmlns:cx6="http://schemas.microsoft.com/office/drawing/2016/5/12/chartex" xmlns:cx7="http://schemas.microsoft.com/office/drawing/2016/5/13/chartex" xmlns:cx8="http://schemas.microsoft.com/office/drawing/2016/5/14/chartex" xmlns:mc="http://schemas.openxmlformats.org/markup-compatibility/2006" xmlns:aink="http://schemas.microsoft.com/office/drawing/2016/ink" xmlns:am3d="http://schemas.microsoft.com/office/drawing/2017/model3d" xmlns:o="urn:schemas-microsoft-com:office:office" xmlns:oel="http://schemas.microsoft.com/office/2019/extlst" xmlns:r="http://schemas.openxmlformats.org/officeDocument/2006/relationships" xmlns:m="http://schemas.openxmlformats.org/officeDocument/2006/math" xmlns:v="urn:schemas-microsoft-com:vml" xmlns:wp14="http://schemas.microsoft.com/office/word/2010/wordprocessingDrawing" xmlns:wp="http://schemas.openxmlformats.org/drawingml/2006/wordprocessingDrawing" xmlns:w10="urn:schemas-microsoft-com:office:word" xmlns:w="http://schemas.openxmlformats.org/wordprocessingml/2006/main" xmlns:w14="http://schemas.microsoft.com/office/word/2010/wordml" xmlns:w15="http://schemas.microsoft.com/office/word/2012/wordml" xmlns:w16cex="http://schemas.microsoft.com/office/word/2018/wordml/cex" xmlns:w16cid="http://schemas.microsoft.com/office/word/2016/wordml/cid" xmlns:w16="http://schemas.microsoft.com/office/word/2018/wordml" xmlns:w16du="http://schemas.microsoft.com/office/word/2023/wordml/word16du" xmlns:w16sdtdh="http://schemas.microsoft.com/office/word/2020/wordml/sdtdatahash" xmlns:w16sdtfl="http://schemas.microsoft.com/office/word/2024/wordml/sdtformatlock" xmlns:w16se="http://schemas.microsoft.com/office/word/2015/wordml/symex" xmlns:wpg="http://schemas.microsoft.com/office/word/2010/wordprocessingGroup" xmlns:wpi="http://schemas.microsoft.com/office/word/2010/wordprocessingInk" xmlns:wne="http://schemas.microsoft.com/office/word/2006/wordml" xmlns:wps="http://schemas.microsoft.com/office/word/2010/wordprocessingShape" mc:Ignorable="w14 w15 w16se w16cid w16 w16cex w16sdtdh w16sdtfl w16du wp14">
   <w:abstractNum w:abstractNumId="0" w15:restartNumberingAfterBreak="0">
+    <w:nsid w:val="29600FC0"/>
+    <w:multiLevelType w:val="hybridMultilevel"/>
+    <w:tmpl w:val="66E8398A"/>
+    <w:lvl w:ilvl="0" w:tplc="100A000F">
+      <w:start w:val="1"/>
+      <w:numFmt w:val="decimal"/>
+      <w:lvlText w:val="%1."/>
+      <w:lvlJc w:val="left"/>
+      <w:pPr>
+        <w:ind w:left="720" w:hanging="360"/>
+      </w:pPr>
+    </w:lvl>
+    <w:lvl w:ilvl="1" w:tplc="100A0019" w:tentative="1">
+      <w:start w:val="1"/>
+      <w:numFmt w:val="lowerLetter"/>
+      <w:lvlText w:val="%2."/>
+      <w:lvlJc w:val="left"/>
+      <w:pPr>
+        <w:ind w:left="1440" w:hanging="360"/>
+      </w:pPr>
+    </w:lvl>
+    <w:lvl w:ilvl="2" w:tplc="100A001B" w:tentative="1">
+      <w:start w:val="1"/>
+      <w:numFmt w:val="lowerRoman"/>
+      <w:lvlText w:val="%3."/>
+      <w:lvlJc w:val="right"/>
+      <w:pPr>
+        <w:ind w:left="2160" w:hanging="180"/>
+      </w:pPr>
+    </w:lvl>
+    <w:lvl w:ilvl="3" w:tplc="100A000F" w:tentative="1">
+      <w:start w:val="1"/>
+      <w:numFmt w:val="decimal"/>
+      <w:lvlText w:val="%4."/>
+      <w:lvlJc w:val="left"/>
+      <w:pPr>
+        <w:ind w:left="2880" w:hanging="360"/>
+      </w:pPr>
+    </w:lvl>
+    <w:lvl w:ilvl="4" w:tplc="100A0019" w:tentative="1">
+      <w:start w:val="1"/>
+      <w:numFmt w:val="lowerLetter"/>
+      <w:lvlText w:val="%5."/>
+      <w:lvlJc w:val="left"/>
+      <w:pPr>
+        <w:ind w:left="3600" w:hanging="360"/>
+      </w:pPr>
+    </w:lvl>
+    <w:lvl w:ilvl="5" w:tplc="100A001B" w:tentative="1">
+      <w:start w:val="1"/>
+      <w:numFmt w:val="lowerRoman"/>
+      <w:lvlText w:val="%6."/>
+      <w:lvlJc w:val="right"/>
+      <w:pPr>
+        <w:ind w:left="4320" w:hanging="180"/>
+      </w:pPr>
+    </w:lvl>
+    <w:lvl w:ilvl="6" w:tplc="100A000F" w:tentative="1">
+      <w:start w:val="1"/>
+      <w:numFmt w:val="decimal"/>
+      <w:lvlText w:val="%7."/>
+      <w:lvlJc w:val="left"/>
+      <w:pPr>
+        <w:ind w:left="5040" w:hanging="360"/>
+      </w:pPr>
+    </w:lvl>
+    <w:lvl w:ilvl="7" w:tplc="100A0019" w:tentative="1">
+      <w:start w:val="1"/>
+      <w:numFmt w:val="lowerLetter"/>
+      <w:lvlText w:val="%8."/>
+      <w:lvlJc w:val="left"/>
+      <w:pPr>
+        <w:ind w:left="5760" w:hanging="360"/>
+      </w:pPr>
+    </w:lvl>
+    <w:lvl w:ilvl="8" w:tplc="100A001B" w:tentative="1">
+      <w:start w:val="1"/>
+      <w:numFmt w:val="lowerRoman"/>
+      <w:lvlText w:val="%9."/>
+      <w:lvlJc w:val="right"/>
+      <w:pPr>
+        <w:ind w:left="6480" w:hanging="180"/>
+      </w:pPr>
+    </w:lvl>
+  </w:abstractNum>
+  <w:abstractNum w:abstractNumId="1" w15:restartNumberingAfterBreak="0">
     <w:nsid w:val="38497FF1"/>
     <w:multiLevelType w:val="hybridMultilevel"/>
     <w:tmpl w:val="39584D6A"/>
@@ -5337,7 +5927,7 @@
       <w:lvlJc w:val="left"/>
     </w:lvl>
   </w:abstractNum>
-  <w:abstractNum w:abstractNumId="1" w15:restartNumberingAfterBreak="0">
+  <w:abstractNum w:abstractNumId="2" w15:restartNumberingAfterBreak="0">
     <w:nsid w:val="3D3138FE"/>
     <w:multiLevelType w:val="hybridMultilevel"/>
     <w:tmpl w:val="152A5246"/>
@@ -5424,16 +6014,19 @@
     </w:lvl>
   </w:abstractNum>
   <w:num w:numId="1" w16cid:durableId="1899854210">
+    <w:abstractNumId w:val="2"/>
+    <w:lvlOverride w:ilvl="0">
+      <w:startOverride w:val="1"/>
+    </w:lvlOverride>
+  </w:num>
+  <w:num w:numId="2" w16cid:durableId="1458180148">
     <w:abstractNumId w:val="1"/>
     <w:lvlOverride w:ilvl="0">
       <w:startOverride w:val="1"/>
     </w:lvlOverride>
   </w:num>
-  <w:num w:numId="2" w16cid:durableId="1458180148">
+  <w:num w:numId="3" w16cid:durableId="458692666">
     <w:abstractNumId w:val="0"/>
-    <w:lvlOverride w:ilvl="0">
-      <w:startOverride w:val="1"/>
-    </w:lvlOverride>
   </w:num>
 </w:numbering>
 </file>
@@ -5921,7 +6514,6 @@
   <w:style w:type="character" w:default="1" w:styleId="Fuentedeprrafopredeter">
     <w:name w:val="Default Paragraph Font"/>
     <w:uiPriority w:val="1"/>
-    <w:semiHidden/>
     <w:unhideWhenUsed/>
   </w:style>
   <w:style w:type="table" w:default="1" w:styleId="Tablanormal">

</xml_diff>

<commit_message>
Documento de evidencias final con reflexion y pruebas completas
</commit_message>
<xml_diff>
--- a/evidencias/Evidencias_PF02_Avance2.docx
+++ b/evidencias/Evidencias_PF02_Avance2.docx
@@ -437,7 +437,25 @@
                 <w:sz w:val="21"/>
                 <w:szCs w:val="21"/>
               </w:rPr>
-              <w:t>Java 21, Maven, Spring Boot 4.1.2 (Web, Data JPA, Validation), PostgreSQL 14, HTML, CSS y JavaScript</w:t>
+              <w:t xml:space="preserve">Java 21, Maven, Spring Boot 4.1.2 (Web, Data JPA, </w:t>
+            </w:r>
+            <w:proofErr w:type="spellStart"/>
+            <w:r>
+              <w:rPr>
+                <w:color w:val="000000"/>
+                <w:sz w:val="21"/>
+                <w:szCs w:val="21"/>
+              </w:rPr>
+              <w:t>Validation</w:t>
+            </w:r>
+            <w:proofErr w:type="spellEnd"/>
+            <w:r>
+              <w:rPr>
+                <w:color w:val="000000"/>
+                <w:sz w:val="21"/>
+                <w:szCs w:val="21"/>
+              </w:rPr>
+              <w:t>), PostgreSQL 14, HTML, CSS y JavaScript</w:t>
             </w:r>
           </w:p>
         </w:tc>
@@ -487,13 +505,23 @@
             </w:tcMar>
           </w:tcPr>
           <w:p>
+            <w:proofErr w:type="spellStart"/>
             <w:r>
               <w:rPr>
                 <w:color w:val="000000"/>
                 <w:sz w:val="21"/>
                 <w:szCs w:val="21"/>
               </w:rPr>
-              <w:t>taller_bicicletas (PostgreSQL, puerto 5433)</w:t>
+              <w:t>taller_bicicletas</w:t>
+            </w:r>
+            <w:proofErr w:type="spellEnd"/>
+            <w:r>
+              <w:rPr>
+                <w:color w:val="000000"/>
+                <w:sz w:val="21"/>
+                <w:szCs w:val="21"/>
+              </w:rPr>
+              <w:t xml:space="preserve"> (PostgreSQL, puerto 5433)</w:t>
             </w:r>
           </w:p>
         </w:tc>
@@ -769,7 +797,43 @@
                 <w:sz w:val="21"/>
                 <w:szCs w:val="21"/>
               </w:rPr>
-              <w:t>Entidades ServicioTaller y OrdenReparacion con relación @ManyToOne</w:t>
+              <w:t xml:space="preserve">Entidades </w:t>
+            </w:r>
+            <w:proofErr w:type="spellStart"/>
+            <w:r>
+              <w:rPr>
+                <w:color w:val="000000"/>
+                <w:sz w:val="21"/>
+                <w:szCs w:val="21"/>
+              </w:rPr>
+              <w:t>ServicioTaller</w:t>
+            </w:r>
+            <w:proofErr w:type="spellEnd"/>
+            <w:r>
+              <w:rPr>
+                <w:color w:val="000000"/>
+                <w:sz w:val="21"/>
+                <w:szCs w:val="21"/>
+              </w:rPr>
+              <w:t xml:space="preserve"> y </w:t>
+            </w:r>
+            <w:proofErr w:type="spellStart"/>
+            <w:r>
+              <w:rPr>
+                <w:color w:val="000000"/>
+                <w:sz w:val="21"/>
+                <w:szCs w:val="21"/>
+              </w:rPr>
+              <w:t>OrdenReparacion</w:t>
+            </w:r>
+            <w:proofErr w:type="spellEnd"/>
+            <w:r>
+              <w:rPr>
+                <w:color w:val="000000"/>
+                <w:sz w:val="21"/>
+                <w:szCs w:val="21"/>
+              </w:rPr>
+              <w:t xml:space="preserve"> con relación @ManyToOne</w:t>
             </w:r>
           </w:p>
         </w:tc>
@@ -825,8 +889,108 @@
                 <w:sz w:val="21"/>
                 <w:szCs w:val="21"/>
               </w:rPr>
-              <w:t>Arquitectura por capas: controller, service, repository, entity, dto, exception</w:t>
+              <w:t xml:space="preserve">Arquitectura por capas: </w:t>
             </w:r>
+            <w:proofErr w:type="spellStart"/>
+            <w:r>
+              <w:rPr>
+                <w:color w:val="000000"/>
+                <w:sz w:val="21"/>
+                <w:szCs w:val="21"/>
+              </w:rPr>
+              <w:t>controller</w:t>
+            </w:r>
+            <w:proofErr w:type="spellEnd"/>
+            <w:r>
+              <w:rPr>
+                <w:color w:val="000000"/>
+                <w:sz w:val="21"/>
+                <w:szCs w:val="21"/>
+              </w:rPr>
+              <w:t xml:space="preserve">, </w:t>
+            </w:r>
+            <w:proofErr w:type="spellStart"/>
+            <w:r>
+              <w:rPr>
+                <w:color w:val="000000"/>
+                <w:sz w:val="21"/>
+                <w:szCs w:val="21"/>
+              </w:rPr>
+              <w:t>service</w:t>
+            </w:r>
+            <w:proofErr w:type="spellEnd"/>
+            <w:r>
+              <w:rPr>
+                <w:color w:val="000000"/>
+                <w:sz w:val="21"/>
+                <w:szCs w:val="21"/>
+              </w:rPr>
+              <w:t xml:space="preserve">, </w:t>
+            </w:r>
+            <w:proofErr w:type="spellStart"/>
+            <w:r>
+              <w:rPr>
+                <w:color w:val="000000"/>
+                <w:sz w:val="21"/>
+                <w:szCs w:val="21"/>
+              </w:rPr>
+              <w:t>repository</w:t>
+            </w:r>
+            <w:proofErr w:type="spellEnd"/>
+            <w:r>
+              <w:rPr>
+                <w:color w:val="000000"/>
+                <w:sz w:val="21"/>
+                <w:szCs w:val="21"/>
+              </w:rPr>
+              <w:t xml:space="preserve">, </w:t>
+            </w:r>
+            <w:proofErr w:type="spellStart"/>
+            <w:r>
+              <w:rPr>
+                <w:color w:val="000000"/>
+                <w:sz w:val="21"/>
+                <w:szCs w:val="21"/>
+              </w:rPr>
+              <w:t>entity</w:t>
+            </w:r>
+            <w:proofErr w:type="spellEnd"/>
+            <w:r>
+              <w:rPr>
+                <w:color w:val="000000"/>
+                <w:sz w:val="21"/>
+                <w:szCs w:val="21"/>
+              </w:rPr>
+              <w:t xml:space="preserve">, </w:t>
+            </w:r>
+            <w:proofErr w:type="spellStart"/>
+            <w:r>
+              <w:rPr>
+                <w:color w:val="000000"/>
+                <w:sz w:val="21"/>
+                <w:szCs w:val="21"/>
+              </w:rPr>
+              <w:t>dto</w:t>
+            </w:r>
+            <w:proofErr w:type="spellEnd"/>
+            <w:r>
+              <w:rPr>
+                <w:color w:val="000000"/>
+                <w:sz w:val="21"/>
+                <w:szCs w:val="21"/>
+              </w:rPr>
+              <w:t xml:space="preserve">, </w:t>
+            </w:r>
+            <w:proofErr w:type="spellStart"/>
+            <w:r>
+              <w:rPr>
+                <w:color w:val="000000"/>
+                <w:sz w:val="21"/>
+                <w:szCs w:val="21"/>
+              </w:rPr>
+              <w:t>exception</w:t>
+            </w:r>
+            <w:proofErr w:type="spellEnd"/>
           </w:p>
         </w:tc>
         <w:tc>
@@ -1735,7 +1899,87 @@
           <w:sz w:val="21"/>
           <w:szCs w:val="21"/>
         </w:rPr>
-        <w:t>2. Tablas servicio_taller y orden_reparacion creadas en la base taller_bicicletas (pgAdmin).</w:t>
+        <w:t xml:space="preserve">2. Tablas </w:t>
+      </w:r>
+      <w:proofErr w:type="spellStart"/>
+      <w:r>
+        <w:rPr>
+          <w:b/>
+          <w:bCs/>
+          <w:sz w:val="21"/>
+          <w:szCs w:val="21"/>
+        </w:rPr>
+        <w:t>servicio_taller</w:t>
+      </w:r>
+      <w:proofErr w:type="spellEnd"/>
+      <w:r>
+        <w:rPr>
+          <w:b/>
+          <w:bCs/>
+          <w:sz w:val="21"/>
+          <w:szCs w:val="21"/>
+        </w:rPr>
+        <w:t xml:space="preserve"> y </w:t>
+      </w:r>
+      <w:proofErr w:type="spellStart"/>
+      <w:r>
+        <w:rPr>
+          <w:b/>
+          <w:bCs/>
+          <w:sz w:val="21"/>
+          <w:szCs w:val="21"/>
+        </w:rPr>
+        <w:t>orden_reparacion</w:t>
+      </w:r>
+      <w:proofErr w:type="spellEnd"/>
+      <w:r>
+        <w:rPr>
+          <w:b/>
+          <w:bCs/>
+          <w:sz w:val="21"/>
+          <w:szCs w:val="21"/>
+        </w:rPr>
+        <w:t xml:space="preserve"> creadas en la base </w:t>
+      </w:r>
+      <w:proofErr w:type="spellStart"/>
+      <w:r>
+        <w:rPr>
+          <w:b/>
+          <w:bCs/>
+          <w:sz w:val="21"/>
+          <w:szCs w:val="21"/>
+        </w:rPr>
+        <w:t>taller_bicicletas</w:t>
+      </w:r>
+      <w:proofErr w:type="spellEnd"/>
+      <w:r>
+        <w:rPr>
+          <w:b/>
+          <w:bCs/>
+          <w:sz w:val="21"/>
+          <w:szCs w:val="21"/>
+        </w:rPr>
+        <w:t xml:space="preserve"> (</w:t>
+      </w:r>
+      <w:proofErr w:type="spellStart"/>
+      <w:r>
+        <w:rPr>
+          <w:b/>
+          <w:bCs/>
+          <w:sz w:val="21"/>
+          <w:szCs w:val="21"/>
+        </w:rPr>
+        <w:t>pgAdmin</w:t>
+      </w:r>
+      <w:proofErr w:type="spellEnd"/>
+      <w:r>
+        <w:rPr>
+          <w:b/>
+          <w:bCs/>
+          <w:sz w:val="21"/>
+          <w:szCs w:val="21"/>
+        </w:rPr>
+        <w:t>).</w:t>
       </w:r>
     </w:p>
     <w:p>
@@ -1799,7 +2043,27 @@
           <w:sz w:val="21"/>
           <w:szCs w:val="21"/>
         </w:rPr>
-        <w:t>3. Arranque de la aplicación: conexión con PostgreSQL (HikariPool), JPA inicializado y Tomcat en el puerto 8080.</w:t>
+        <w:t>3. Arranque de la aplicación: conexión con PostgreSQL (</w:t>
+      </w:r>
+      <w:proofErr w:type="spellStart"/>
+      <w:r>
+        <w:rPr>
+          <w:b/>
+          <w:bCs/>
+          <w:sz w:val="21"/>
+          <w:szCs w:val="21"/>
+        </w:rPr>
+        <w:t>HikariPool</w:t>
+      </w:r>
+      <w:proofErr w:type="spellEnd"/>
+      <w:r>
+        <w:rPr>
+          <w:b/>
+          <w:bCs/>
+          <w:sz w:val="21"/>
+          <w:szCs w:val="21"/>
+        </w:rPr>
+        <w:t>), JPA inicializado y Tomcat en el puerto 8080.</w:t>
       </w:r>
     </w:p>
     <w:p>
@@ -1998,7 +2262,27 @@
           <w:sz w:val="21"/>
           <w:szCs w:val="21"/>
         </w:rPr>
-        <w:t>Prueba 2. POST http://localhost:8080/api/servicios — registro de un servicio (201 Created).</w:t>
+        <w:t xml:space="preserve">Prueba 2. POST http://localhost:8080/api/servicios — registro de un servicio (201 </w:t>
+      </w:r>
+      <w:proofErr w:type="spellStart"/>
+      <w:r>
+        <w:rPr>
+          <w:b/>
+          <w:bCs/>
+          <w:sz w:val="21"/>
+          <w:szCs w:val="21"/>
+        </w:rPr>
+        <w:t>Created</w:t>
+      </w:r>
+      <w:proofErr w:type="spellEnd"/>
+      <w:r>
+        <w:rPr>
+          <w:b/>
+          <w:bCs/>
+          <w:sz w:val="21"/>
+          <w:szCs w:val="21"/>
+        </w:rPr>
+        <w:t>).</w:t>
       </w:r>
     </w:p>
     <w:p>
@@ -2208,7 +2492,27 @@
           <w:szCs w:val="21"/>
         </w:rPr>
         <w:lastRenderedPageBreak/>
-        <w:t>Prueba 5. POST con nombre vacío y costo negativo — datos inválidos (400 Bad Request).</w:t>
+        <w:t xml:space="preserve">Prueba 5. POST con nombre vacío y costo negativo — datos inválidos (400 Bad </w:t>
+      </w:r>
+      <w:proofErr w:type="spellStart"/>
+      <w:r>
+        <w:rPr>
+          <w:b/>
+          <w:bCs/>
+          <w:sz w:val="21"/>
+          <w:szCs w:val="21"/>
+        </w:rPr>
+        <w:t>Request</w:t>
+      </w:r>
+      <w:proofErr w:type="spellEnd"/>
+      <w:r>
+        <w:rPr>
+          <w:b/>
+          <w:bCs/>
+          <w:sz w:val="21"/>
+          <w:szCs w:val="21"/>
+        </w:rPr>
+        <w:t>).</w:t>
       </w:r>
     </w:p>
     <w:p>
@@ -2272,7 +2576,27 @@
           <w:sz w:val="21"/>
           <w:szCs w:val="21"/>
         </w:rPr>
-        <w:t>Prueba 6. POST con un nombre ya registrado — servicio duplicado (409 Conflict).</w:t>
+        <w:t xml:space="preserve">Prueba 6. POST con un nombre ya registrado — servicio duplicado (409 </w:t>
+      </w:r>
+      <w:proofErr w:type="spellStart"/>
+      <w:r>
+        <w:rPr>
+          <w:b/>
+          <w:bCs/>
+          <w:sz w:val="21"/>
+          <w:szCs w:val="21"/>
+        </w:rPr>
+        <w:t>Conflict</w:t>
+      </w:r>
+      <w:proofErr w:type="spellEnd"/>
+      <w:r>
+        <w:rPr>
+          <w:b/>
+          <w:bCs/>
+          <w:sz w:val="21"/>
+          <w:szCs w:val="21"/>
+        </w:rPr>
+        <w:t>).</w:t>
       </w:r>
     </w:p>
     <w:p>
@@ -2337,7 +2661,27 @@
           <w:szCs w:val="21"/>
         </w:rPr>
         <w:lastRenderedPageBreak/>
-        <w:t>Prueba 7. PUT con nombre vacío y costo negativo — datos inválidos (400 Bad Request).</w:t>
+        <w:t xml:space="preserve">Prueba 7. PUT con nombre vacío y costo negativo — datos inválidos (400 Bad </w:t>
+      </w:r>
+      <w:proofErr w:type="spellStart"/>
+      <w:r>
+        <w:rPr>
+          <w:b/>
+          <w:bCs/>
+          <w:sz w:val="21"/>
+          <w:szCs w:val="21"/>
+        </w:rPr>
+        <w:t>Request</w:t>
+      </w:r>
+      <w:proofErr w:type="spellEnd"/>
+      <w:r>
+        <w:rPr>
+          <w:b/>
+          <w:bCs/>
+          <w:sz w:val="21"/>
+          <w:szCs w:val="21"/>
+        </w:rPr>
+        <w:t>).</w:t>
       </w:r>
     </w:p>
     <w:p>
@@ -2609,7 +2953,23 @@
           <w:sz w:val="21"/>
           <w:szCs w:val="21"/>
         </w:rPr>
-        <w:t xml:space="preserve">201 Created, estado PENDIENTE y costo estimado = costo base + recargo </w:t>
+        <w:t xml:space="preserve">201 </w:t>
+      </w:r>
+      <w:proofErr w:type="spellStart"/>
+      <w:r>
+        <w:rPr>
+          <w:sz w:val="21"/>
+          <w:szCs w:val="21"/>
+        </w:rPr>
+        <w:t>Created</w:t>
+      </w:r>
+      <w:proofErr w:type="spellEnd"/>
+      <w:r>
+        <w:rPr>
+          <w:sz w:val="21"/>
+          <w:szCs w:val="21"/>
+        </w:rPr>
+        <w:t xml:space="preserve">, estado PENDIENTE y costo estimado = costo base + recargo </w:t>
       </w:r>
     </w:p>
     <w:p>
@@ -3029,7 +3389,23 @@
           <w:b/>
           <w:bCs/>
         </w:rPr>
-        <w:t>Prueba 5. POST con servicioId inexistente</w:t>
+        <w:t xml:space="preserve">Prueba 5. POST con </w:t>
+      </w:r>
+      <w:proofErr w:type="spellStart"/>
+      <w:r>
+        <w:rPr>
+          <w:b/>
+          <w:bCs/>
+        </w:rPr>
+        <w:t>servicioId</w:t>
+      </w:r>
+      <w:proofErr w:type="spellEnd"/>
+      <w:r>
+        <w:rPr>
+          <w:b/>
+          <w:bCs/>
+        </w:rPr>
+        <w:t xml:space="preserve"> inexistente</w:t>
       </w:r>
     </w:p>
     <w:p>
@@ -3148,7 +3524,23 @@
           <w:sz w:val="21"/>
           <w:szCs w:val="21"/>
         </w:rPr>
-        <w:t>409 Conflict: el servicio está desactivado.</w:t>
+        <w:t xml:space="preserve">409 </w:t>
+      </w:r>
+      <w:proofErr w:type="spellStart"/>
+      <w:r>
+        <w:rPr>
+          <w:sz w:val="21"/>
+          <w:szCs w:val="21"/>
+        </w:rPr>
+        <w:t>Conflict</w:t>
+      </w:r>
+      <w:proofErr w:type="spellEnd"/>
+      <w:r>
+        <w:rPr>
+          <w:sz w:val="21"/>
+          <w:szCs w:val="21"/>
+        </w:rPr>
+        <w:t>: el servicio está desactivado.</w:t>
       </w:r>
     </w:p>
     <w:p>
@@ -3233,7 +3625,23 @@
           <w:sz w:val="21"/>
           <w:szCs w:val="21"/>
         </w:rPr>
-        <w:t>400 Bad Request con el detalle de los errores por campo.</w:t>
+        <w:t xml:space="preserve">400 Bad </w:t>
+      </w:r>
+      <w:proofErr w:type="spellStart"/>
+      <w:r>
+        <w:rPr>
+          <w:sz w:val="21"/>
+          <w:szCs w:val="21"/>
+        </w:rPr>
+        <w:t>Request</w:t>
+      </w:r>
+      <w:proofErr w:type="spellEnd"/>
+      <w:r>
+        <w:rPr>
+          <w:sz w:val="21"/>
+          <w:szCs w:val="21"/>
+        </w:rPr>
+        <w:t xml:space="preserve"> con el detalle de los errores por campo.</w:t>
       </w:r>
     </w:p>
     <w:p>
@@ -3566,7 +3974,23 @@
           <w:sz w:val="21"/>
           <w:szCs w:val="21"/>
         </w:rPr>
-        <w:t>409 Conflict: una orden terminada no puede regresar al estado PENDIENTE.</w:t>
+        <w:t xml:space="preserve">409 </w:t>
+      </w:r>
+      <w:proofErr w:type="spellStart"/>
+      <w:r>
+        <w:rPr>
+          <w:sz w:val="21"/>
+          <w:szCs w:val="21"/>
+        </w:rPr>
+        <w:t>Conflict</w:t>
+      </w:r>
+      <w:proofErr w:type="spellEnd"/>
+      <w:r>
+        <w:rPr>
+          <w:sz w:val="21"/>
+          <w:szCs w:val="21"/>
+        </w:rPr>
+        <w:t>: una orden terminada no puede regresar al estado PENDIENTE.</w:t>
       </w:r>
     </w:p>
     <w:p>
@@ -3651,7 +4075,23 @@
           <w:sz w:val="21"/>
           <w:szCs w:val="21"/>
         </w:rPr>
-        <w:t>409 Conflict: no se puede modificar una orden terminada.</w:t>
+        <w:t xml:space="preserve">409 </w:t>
+      </w:r>
+      <w:proofErr w:type="spellStart"/>
+      <w:r>
+        <w:rPr>
+          <w:sz w:val="21"/>
+          <w:szCs w:val="21"/>
+        </w:rPr>
+        <w:t>Conflict</w:t>
+      </w:r>
+      <w:proofErr w:type="spellEnd"/>
+      <w:r>
+        <w:rPr>
+          <w:sz w:val="21"/>
+          <w:szCs w:val="21"/>
+        </w:rPr>
+        <w:t>: no se puede modificar una orden terminada.</w:t>
       </w:r>
     </w:p>
     <w:p>
@@ -3823,7 +4263,21 @@
           <w:b/>
           <w:bCs/>
         </w:rPr>
-        <w:t>Prueba 14. GET /api/ordenes/estado/PENDIENTE — órdenes por estado</w:t>
+        <w:t>Prueba 1</w:t>
+      </w:r>
+      <w:r>
+        <w:rPr>
+          <w:b/>
+          <w:bCs/>
+        </w:rPr>
+        <w:t>3</w:t>
+      </w:r>
+      <w:r>
+        <w:rPr>
+          <w:b/>
+          <w:bCs/>
+        </w:rPr>
+        <w:t>. GET /api/ordenes/estado/PENDIENTE — órdenes por estado</w:t>
       </w:r>
     </w:p>
     <w:p>
@@ -3908,7 +4362,21 @@
           <w:b/>
           <w:bCs/>
         </w:rPr>
-        <w:t>Prueba 15. GET /api/ordenes/estado/XYZ — estado no permitido</w:t>
+        <w:t>Prueba 1</w:t>
+      </w:r>
+      <w:r>
+        <w:rPr>
+          <w:b/>
+          <w:bCs/>
+        </w:rPr>
+        <w:t>4</w:t>
+      </w:r>
+      <w:r>
+        <w:rPr>
+          <w:b/>
+          <w:bCs/>
+        </w:rPr>
+        <w:t>. GET /api/ordenes/estado/XYZ — estado no permitido</w:t>
       </w:r>
     </w:p>
     <w:p>
@@ -3934,7 +4402,23 @@
           <w:sz w:val="21"/>
           <w:szCs w:val="21"/>
         </w:rPr>
-        <w:t>400 Bad Request con los estados permitidos.</w:t>
+        <w:t xml:space="preserve">400 Bad </w:t>
+      </w:r>
+      <w:proofErr w:type="spellStart"/>
+      <w:r>
+        <w:rPr>
+          <w:sz w:val="21"/>
+          <w:szCs w:val="21"/>
+        </w:rPr>
+        <w:t>Request</w:t>
+      </w:r>
+      <w:proofErr w:type="spellEnd"/>
+      <w:r>
+        <w:rPr>
+          <w:sz w:val="21"/>
+          <w:szCs w:val="21"/>
+        </w:rPr>
+        <w:t xml:space="preserve"> con los estados permitidos.</w:t>
       </w:r>
     </w:p>
     <w:p>
@@ -3993,7 +4477,37 @@
           <w:b/>
           <w:bCs/>
         </w:rPr>
-        <w:t>Prueba 16. GET /api/ordenes/cliente/carlos — órdenes por cliente</w:t>
+        <w:t>Prueba 1</w:t>
+      </w:r>
+      <w:r>
+        <w:rPr>
+          <w:b/>
+          <w:bCs/>
+        </w:rPr>
+        <w:t>5</w:t>
+      </w:r>
+      <w:r>
+        <w:rPr>
+          <w:b/>
+          <w:bCs/>
+        </w:rPr>
+        <w:t>. GET /api/ordenes/cliente/</w:t>
+      </w:r>
+      <w:proofErr w:type="spellStart"/>
+      <w:r>
+        <w:rPr>
+          <w:b/>
+          <w:bCs/>
+        </w:rPr>
+        <w:t>carlos</w:t>
+      </w:r>
+      <w:proofErr w:type="spellEnd"/>
+      <w:r>
+        <w:rPr>
+          <w:b/>
+          <w:bCs/>
+        </w:rPr>
+        <w:t xml:space="preserve"> — órdenes por cliente</w:t>
       </w:r>
     </w:p>
     <w:p>
@@ -4079,7 +4593,37 @@
           <w:b/>
           <w:bCs/>
         </w:rPr>
-        <w:t>Prueba 17. GET /api/ordenes/cliente/carlos/total — total a pagar por cliente</w:t>
+        <w:t>Prueba 1</w:t>
+      </w:r>
+      <w:r>
+        <w:rPr>
+          <w:b/>
+          <w:bCs/>
+        </w:rPr>
+        <w:t>6</w:t>
+      </w:r>
+      <w:r>
+        <w:rPr>
+          <w:b/>
+          <w:bCs/>
+        </w:rPr>
+        <w:t>. GET /api/ordenes/cliente/</w:t>
+      </w:r>
+      <w:proofErr w:type="spellStart"/>
+      <w:r>
+        <w:rPr>
+          <w:b/>
+          <w:bCs/>
+        </w:rPr>
+        <w:t>carlos</w:t>
+      </w:r>
+      <w:proofErr w:type="spellEnd"/>
+      <w:r>
+        <w:rPr>
+          <w:b/>
+          <w:bCs/>
+        </w:rPr>
+        <w:t>/total — total a pagar por cliente</w:t>
       </w:r>
     </w:p>
     <w:p>
@@ -4105,7 +4649,39 @@
           <w:sz w:val="21"/>
           <w:szCs w:val="21"/>
         </w:rPr>
-        <w:t>200 OK con cantidadOrdenes y totalEstimado.</w:t>
+        <w:t xml:space="preserve">200 OK con </w:t>
+      </w:r>
+      <w:proofErr w:type="spellStart"/>
+      <w:r>
+        <w:rPr>
+          <w:sz w:val="21"/>
+          <w:szCs w:val="21"/>
+        </w:rPr>
+        <w:t>cantidadOrdenes</w:t>
+      </w:r>
+      <w:proofErr w:type="spellEnd"/>
+      <w:r>
+        <w:rPr>
+          <w:sz w:val="21"/>
+          <w:szCs w:val="21"/>
+        </w:rPr>
+        <w:t xml:space="preserve"> y </w:t>
+      </w:r>
+      <w:proofErr w:type="spellStart"/>
+      <w:r>
+        <w:rPr>
+          <w:sz w:val="21"/>
+          <w:szCs w:val="21"/>
+        </w:rPr>
+        <w:t>totalEstimado</w:t>
+      </w:r>
+      <w:proofErr w:type="spellEnd"/>
+      <w:r>
+        <w:rPr>
+          <w:sz w:val="21"/>
+          <w:szCs w:val="21"/>
+        </w:rPr>
+        <w:t>.</w:t>
       </w:r>
     </w:p>
     <w:p>
@@ -4164,7 +4740,21 @@
           <w:b/>
           <w:bCs/>
         </w:rPr>
-        <w:t>Prueba 18. GET /api/ordenes/pendientes/cantidad — indicador</w:t>
+        <w:t>Prueba 1</w:t>
+      </w:r>
+      <w:r>
+        <w:rPr>
+          <w:b/>
+          <w:bCs/>
+        </w:rPr>
+        <w:t>7</w:t>
+      </w:r>
+      <w:r>
+        <w:rPr>
+          <w:b/>
+          <w:bCs/>
+        </w:rPr>
+        <w:t>. GET /api/ordenes/pendientes/cantidad — indicador</w:t>
       </w:r>
     </w:p>
     <w:p>
@@ -4190,7 +4780,23 @@
           <w:sz w:val="21"/>
           <w:szCs w:val="21"/>
         </w:rPr>
-        <w:t>200 OK con cantidadPendientes.</w:t>
+        <w:t xml:space="preserve">200 OK con </w:t>
+      </w:r>
+      <w:proofErr w:type="spellStart"/>
+      <w:r>
+        <w:rPr>
+          <w:sz w:val="21"/>
+          <w:szCs w:val="21"/>
+        </w:rPr>
+        <w:t>cantidadPendientes</w:t>
+      </w:r>
+      <w:proofErr w:type="spellEnd"/>
+      <w:r>
+        <w:rPr>
+          <w:sz w:val="21"/>
+          <w:szCs w:val="21"/>
+        </w:rPr>
+        <w:t>.</w:t>
       </w:r>
     </w:p>
     <w:p>
@@ -4331,7 +4937,21 @@
           <w:b/>
           <w:bCs/>
         </w:rPr>
-        <w:t>Prueba 19. DELETE /api/ordenes/{id} — eliminar una orden pendiente</w:t>
+        <w:t>Prueba 1</w:t>
+      </w:r>
+      <w:r>
+        <w:rPr>
+          <w:b/>
+          <w:bCs/>
+        </w:rPr>
+        <w:t>8</w:t>
+      </w:r>
+      <w:r>
+        <w:rPr>
+          <w:b/>
+          <w:bCs/>
+        </w:rPr>
+        <w:t>. DELETE /api/ordenes/{id} — eliminar una orden pendiente</w:t>
       </w:r>
     </w:p>
     <w:p>
@@ -4357,7 +4977,23 @@
           <w:sz w:val="21"/>
           <w:szCs w:val="21"/>
         </w:rPr>
-        <w:t xml:space="preserve">204 No Content o 409 Conflict </w:t>
+        <w:t xml:space="preserve">204 No Content o 409 </w:t>
+      </w:r>
+      <w:proofErr w:type="spellStart"/>
+      <w:r>
+        <w:rPr>
+          <w:sz w:val="21"/>
+          <w:szCs w:val="21"/>
+        </w:rPr>
+        <w:t>Conflict</w:t>
+      </w:r>
+      <w:proofErr w:type="spellEnd"/>
+      <w:r>
+        <w:rPr>
+          <w:sz w:val="21"/>
+          <w:szCs w:val="21"/>
+        </w:rPr>
+        <w:t xml:space="preserve"> </w:t>
       </w:r>
     </w:p>
     <w:p>
@@ -4434,7 +5070,27 @@
           <w:sz w:val="21"/>
           <w:szCs w:val="21"/>
         </w:rPr>
-        <w:t xml:space="preserve"> SELECT * FROM servicio_taller ORDER BY id — servicios registrados durante las pruebas (el servicio 1 aparece desactivado).</w:t>
+        <w:t xml:space="preserve"> SELECT * FROM </w:t>
+      </w:r>
+      <w:proofErr w:type="spellStart"/>
+      <w:r>
+        <w:rPr>
+          <w:b/>
+          <w:bCs/>
+          <w:sz w:val="21"/>
+          <w:szCs w:val="21"/>
+        </w:rPr>
+        <w:t>servicio_taller</w:t>
+      </w:r>
+      <w:proofErr w:type="spellEnd"/>
+      <w:r>
+        <w:rPr>
+          <w:b/>
+          <w:bCs/>
+          <w:sz w:val="21"/>
+          <w:szCs w:val="21"/>
+        </w:rPr>
+        <w:t xml:space="preserve"> ORDER BY id — servicios registrados durante las pruebas (el servicio 1 aparece desactivado).</w:t>
       </w:r>
     </w:p>
     <w:p>
@@ -4497,33 +5153,23 @@
           <w:bCs/>
         </w:rPr>
         <w:lastRenderedPageBreak/>
-        <w:t>Consulta. SELECT * FROM orden_reparacion ORDER BY id — órdenes registradas</w:t>
-      </w:r>
-    </w:p>
-    <w:p>
-      <w:pPr>
-        <w:keepNext/>
-        <w:spacing w:after="80"/>
-        <w:rPr>
-          <w:sz w:val="21"/>
-          <w:szCs w:val="21"/>
-        </w:rPr>
-      </w:pPr>
-      <w:r>
-        <w:rPr>
-          <w:b/>
-          <w:bCs/>
-          <w:sz w:val="21"/>
-          <w:szCs w:val="21"/>
-        </w:rPr>
-        <w:t xml:space="preserve">Resultado esperado: </w:t>
-      </w:r>
-      <w:r>
-        <w:rPr>
-          <w:sz w:val="21"/>
-          <w:szCs w:val="21"/>
-        </w:rPr>
-        <w:t>Registros con cliente, estado, recargo, costo_estimado y servicio_id.</w:t>
+        <w:t xml:space="preserve">Consulta. SELECT * FROM </w:t>
+      </w:r>
+      <w:proofErr w:type="spellStart"/>
+      <w:r>
+        <w:rPr>
+          <w:b/>
+          <w:bCs/>
+        </w:rPr>
+        <w:t>orden_reparacion</w:t>
+      </w:r>
+      <w:proofErr w:type="spellEnd"/>
+      <w:r>
+        <w:rPr>
+          <w:b/>
+          <w:bCs/>
+        </w:rPr>
+        <w:t xml:space="preserve"> ORDER BY id — órdenes registradas</w:t>
       </w:r>
     </w:p>
     <w:p>
@@ -4602,8 +5248,20 @@
           <w:sz w:val="30"/>
           <w:szCs w:val="30"/>
         </w:rPr>
-        <w:t>Pruebas del frontend</w:t>
-      </w:r>
+        <w:t xml:space="preserve">Pruebas del </w:t>
+      </w:r>
+      <w:proofErr w:type="spellStart"/>
+      <w:r>
+        <w:rPr>
+          <w:b/>
+          <w:bCs/>
+          <w:color w:val="1F4E79"/>
+          <w:sz w:val="30"/>
+          <w:szCs w:val="30"/>
+        </w:rPr>
+        <w:t>frontend</w:t>
+      </w:r>
+      <w:proofErr w:type="spellEnd"/>
     </w:p>
     <w:p>
       <w:pPr>
@@ -4646,6 +5304,9 @@
         </w:rPr>
       </w:pPr>
       <w:r>
+        <w:rPr>
+          <w:noProof/>
+        </w:rPr>
         <w:drawing>
           <wp:inline distT="0" distB="0" distL="0" distR="0" wp14:anchorId="120C1E2D" wp14:editId="75EE68C1">
             <wp:extent cx="5612130" cy="2701925"/>
@@ -4697,6 +5358,9 @@
         </w:rPr>
       </w:pPr>
       <w:r>
+        <w:rPr>
+          <w:noProof/>
+        </w:rPr>
         <w:lastRenderedPageBreak/>
         <w:drawing>
           <wp:inline distT="0" distB="0" distL="0" distR="0" wp14:anchorId="5635AE18" wp14:editId="6464C3D4">
@@ -4779,6 +5443,7 @@
         <w:rPr>
           <w:b/>
           <w:bCs/>
+          <w:noProof/>
           <w:color w:val="auto"/>
           <w:sz w:val="30"/>
           <w:szCs w:val="30"/>
@@ -4907,6 +5572,7 @@
         <w:rPr>
           <w:b/>
           <w:bCs/>
+          <w:noProof/>
           <w:color w:val="auto"/>
           <w:sz w:val="30"/>
           <w:szCs w:val="30"/>
@@ -4992,6 +5658,7 @@
         <w:rPr>
           <w:b/>
           <w:bCs/>
+          <w:noProof/>
           <w:color w:val="auto"/>
           <w:sz w:val="30"/>
           <w:szCs w:val="30"/>
@@ -5078,6 +5745,7 @@
         <w:rPr>
           <w:b/>
           <w:bCs/>
+          <w:noProof/>
           <w:color w:val="auto"/>
           <w:sz w:val="30"/>
           <w:szCs w:val="30"/>
@@ -5163,6 +5831,7 @@
         <w:rPr>
           <w:b/>
           <w:bCs/>
+          <w:noProof/>
           <w:color w:val="auto"/>
           <w:sz w:val="30"/>
           <w:szCs w:val="30"/>
@@ -5301,6 +5970,7 @@
         <w:rPr>
           <w:b/>
           <w:bCs/>
+          <w:noProof/>
           <w:color w:val="auto"/>
           <w:sz w:val="30"/>
           <w:szCs w:val="30"/>
@@ -5386,6 +6056,7 @@
         <w:rPr>
           <w:b/>
           <w:bCs/>
+          <w:noProof/>
           <w:color w:val="auto"/>
           <w:sz w:val="30"/>
           <w:szCs w:val="30"/>
@@ -5444,6 +6115,7 @@
         <w:rPr>
           <w:b/>
           <w:bCs/>
+          <w:noProof/>
           <w:color w:val="auto"/>
           <w:sz w:val="30"/>
           <w:szCs w:val="30"/>
@@ -5530,6 +6202,7 @@
         <w:rPr>
           <w:b/>
           <w:bCs/>
+          <w:noProof/>
           <w:color w:val="auto"/>
           <w:sz w:val="30"/>
           <w:szCs w:val="30"/>
@@ -5592,7 +6265,29 @@
           <w:szCs w:val="30"/>
         </w:rPr>
         <w:lastRenderedPageBreak/>
-        <w:t>11. Historial de commits en GitHub</w:t>
+        <w:t xml:space="preserve">11. Historial de </w:t>
+      </w:r>
+      <w:proofErr w:type="spellStart"/>
+      <w:r>
+        <w:rPr>
+          <w:b/>
+          <w:bCs/>
+          <w:color w:val="1F4E79"/>
+          <w:sz w:val="30"/>
+          <w:szCs w:val="30"/>
+        </w:rPr>
+        <w:t>commits</w:t>
+      </w:r>
+      <w:proofErr w:type="spellEnd"/>
+      <w:r>
+        <w:rPr>
+          <w:b/>
+          <w:bCs/>
+          <w:color w:val="1F4E79"/>
+          <w:sz w:val="30"/>
+          <w:szCs w:val="30"/>
+        </w:rPr>
+        <w:t xml:space="preserve"> en GitHub</w:t>
       </w:r>
     </w:p>
     <w:p>
@@ -5601,6 +6296,9 @@
         <w:spacing w:before="280" w:after="160"/>
       </w:pPr>
       <w:r>
+        <w:rPr>
+          <w:noProof/>
+        </w:rPr>
         <w:drawing>
           <wp:inline distT="0" distB="0" distL="0" distR="0" wp14:anchorId="4D010189" wp14:editId="6492060C">
             <wp:extent cx="5943600" cy="2924810"/>
@@ -5655,7 +6353,294 @@
       <w:pPr>
         <w:pStyle w:val="Ttulo1"/>
         <w:spacing w:before="280" w:after="160"/>
-        <w:ind w:left="360"/>
+        <w:rPr>
+          <w:b/>
+          <w:bCs/>
+          <w:color w:val="auto"/>
+          <w:sz w:val="30"/>
+          <w:szCs w:val="30"/>
+        </w:rPr>
+      </w:pPr>
+    </w:p>
+    <w:p>
+      <w:pPr>
+        <w:pStyle w:val="Ttulo1"/>
+        <w:spacing w:before="280" w:after="160"/>
+        <w:rPr>
+          <w:b/>
+          <w:bCs/>
+          <w:color w:val="auto"/>
+          <w:sz w:val="30"/>
+          <w:szCs w:val="30"/>
+        </w:rPr>
+      </w:pPr>
+    </w:p>
+    <w:p>
+      <w:pPr>
+        <w:pStyle w:val="Ttulo1"/>
+        <w:spacing w:before="280" w:after="160"/>
+        <w:rPr>
+          <w:b/>
+          <w:bCs/>
+          <w:color w:val="auto"/>
+          <w:sz w:val="30"/>
+          <w:szCs w:val="30"/>
+        </w:rPr>
+      </w:pPr>
+    </w:p>
+    <w:p>
+      <w:pPr>
+        <w:pStyle w:val="Ttulo1"/>
+        <w:spacing w:before="280" w:after="160"/>
+        <w:rPr>
+          <w:b/>
+          <w:bCs/>
+          <w:color w:val="auto"/>
+          <w:sz w:val="30"/>
+          <w:szCs w:val="30"/>
+        </w:rPr>
+      </w:pPr>
+    </w:p>
+    <w:p>
+      <w:pPr>
+        <w:pStyle w:val="Ttulo1"/>
+        <w:spacing w:before="280" w:after="160"/>
+        <w:rPr>
+          <w:b/>
+          <w:bCs/>
+          <w:color w:val="auto"/>
+          <w:sz w:val="30"/>
+          <w:szCs w:val="30"/>
+        </w:rPr>
+      </w:pPr>
+    </w:p>
+    <w:p>
+      <w:pPr>
+        <w:pStyle w:val="Ttulo1"/>
+        <w:spacing w:before="280" w:after="160"/>
+        <w:rPr>
+          <w:b/>
+          <w:bCs/>
+          <w:color w:val="auto"/>
+          <w:sz w:val="30"/>
+          <w:szCs w:val="30"/>
+        </w:rPr>
+      </w:pPr>
+    </w:p>
+    <w:p>
+      <w:pPr>
+        <w:pStyle w:val="Ttulo1"/>
+        <w:spacing w:before="280" w:after="160"/>
+        <w:rPr>
+          <w:b/>
+          <w:bCs/>
+          <w:color w:val="auto"/>
+          <w:sz w:val="30"/>
+          <w:szCs w:val="30"/>
+        </w:rPr>
+      </w:pPr>
+    </w:p>
+    <w:p>
+      <w:pPr>
+        <w:pStyle w:val="Ttulo1"/>
+        <w:spacing w:before="280" w:after="160"/>
+        <w:rPr>
+          <w:b/>
+          <w:bCs/>
+          <w:color w:val="auto"/>
+          <w:sz w:val="30"/>
+          <w:szCs w:val="30"/>
+        </w:rPr>
+      </w:pPr>
+    </w:p>
+    <w:p>
+      <w:pPr>
+        <w:pStyle w:val="Ttulo1"/>
+        <w:spacing w:before="280" w:after="160"/>
+        <w:rPr>
+          <w:b/>
+          <w:bCs/>
+          <w:color w:val="auto"/>
+          <w:sz w:val="30"/>
+          <w:szCs w:val="30"/>
+        </w:rPr>
+      </w:pPr>
+    </w:p>
+    <w:p>
+      <w:pPr>
+        <w:pStyle w:val="Ttulo1"/>
+        <w:spacing w:before="280" w:after="160"/>
+        <w:rPr>
+          <w:b/>
+          <w:bCs/>
+          <w:color w:val="auto"/>
+          <w:sz w:val="30"/>
+          <w:szCs w:val="30"/>
+        </w:rPr>
+      </w:pPr>
+    </w:p>
+    <w:p>
+      <w:pPr>
+        <w:pStyle w:val="Ttulo1"/>
+        <w:spacing w:before="280" w:after="160"/>
+        <w:rPr>
+          <w:b/>
+          <w:bCs/>
+          <w:color w:val="1F4E79"/>
+          <w:sz w:val="30"/>
+          <w:szCs w:val="30"/>
+        </w:rPr>
+      </w:pPr>
+      <w:r>
+        <w:rPr>
+          <w:b/>
+          <w:bCs/>
+          <w:color w:val="1F4E79"/>
+          <w:sz w:val="30"/>
+          <w:szCs w:val="30"/>
+        </w:rPr>
+        <w:lastRenderedPageBreak/>
+        <w:t>12</w:t>
+      </w:r>
+      <w:r>
+        <w:rPr>
+          <w:b/>
+          <w:bCs/>
+          <w:color w:val="auto"/>
+          <w:sz w:val="30"/>
+          <w:szCs w:val="30"/>
+        </w:rPr>
+        <w:t xml:space="preserve">. </w:t>
+      </w:r>
+      <w:r>
+        <w:rPr>
+          <w:b/>
+          <w:bCs/>
+          <w:color w:val="1F4E79"/>
+          <w:sz w:val="30"/>
+          <w:szCs w:val="30"/>
+        </w:rPr>
+        <w:t>Reflexión</w:t>
+      </w:r>
+      <w:r>
+        <w:rPr>
+          <w:b/>
+          <w:bCs/>
+          <w:color w:val="auto"/>
+          <w:sz w:val="30"/>
+          <w:szCs w:val="30"/>
+        </w:rPr>
+        <w:t xml:space="preserve"> </w:t>
+      </w:r>
+      <w:r>
+        <w:rPr>
+          <w:b/>
+          <w:bCs/>
+          <w:color w:val="1F4E79"/>
+          <w:sz w:val="30"/>
+          <w:szCs w:val="30"/>
+        </w:rPr>
+        <w:t>Final</w:t>
+      </w:r>
+    </w:p>
+    <w:p>
+      <w:pPr>
+        <w:pStyle w:val="Ttulo1"/>
+        <w:spacing w:before="280" w:after="160"/>
+        <w:rPr>
+          <w:color w:val="auto"/>
+          <w:sz w:val="30"/>
+          <w:szCs w:val="30"/>
+        </w:rPr>
+      </w:pPr>
+      <w:r>
+        <w:rPr>
+          <w:color w:val="auto"/>
+          <w:sz w:val="30"/>
+          <w:szCs w:val="30"/>
+        </w:rPr>
+        <w:t>Este proyecto me permitió integrar en una sola aplicación los conocimientos del curso: programación orientada a objetos, Maven, Spring Boot, API REST, persistencia con JPA y PostgreSQL, y una interfaz web que consume la API. Pasar de ejercicios separados a un sistema completo me ayudó a entender cómo se conectan las capas y por qué cada una tiene una responsabilidad clara: el controlador recibe la petición, el servicio aplica las reglas del negocio y el repositorio guarda los datos.</w:t>
+      </w:r>
+    </w:p>
+    <w:p>
+      <w:pPr>
+        <w:pStyle w:val="Ttulo1"/>
+        <w:spacing w:before="280" w:after="160"/>
+        <w:rPr>
+          <w:color w:val="auto"/>
+          <w:sz w:val="30"/>
+          <w:szCs w:val="30"/>
+        </w:rPr>
+      </w:pPr>
+      <w:r>
+        <w:rPr>
+          <w:color w:val="auto"/>
+          <w:sz w:val="30"/>
+          <w:szCs w:val="30"/>
+        </w:rPr>
+        <w:t xml:space="preserve">Durante el desarrollo enfrenté varios problemas reales. La sincronización de Maven falló por cortes de conexión; la autenticación con PostgreSQL me obligó a revisar el puerto (5433) y la contraseña del usuario; y la validación del esquema de </w:t>
+      </w:r>
+      <w:proofErr w:type="spellStart"/>
+      <w:r>
+        <w:rPr>
+          <w:color w:val="auto"/>
+          <w:sz w:val="30"/>
+          <w:szCs w:val="30"/>
+        </w:rPr>
+        <w:t>Hibernate</w:t>
+      </w:r>
+      <w:proofErr w:type="spellEnd"/>
+      <w:r>
+        <w:rPr>
+          <w:color w:val="auto"/>
+          <w:sz w:val="30"/>
+          <w:szCs w:val="30"/>
+        </w:rPr>
+        <w:t xml:space="preserve"> detectó que mis tablas usaban enteros de 4 bytes mientras las entidades usaban Long, lo que corregí ajustando las columnas a BIGINT. También aprendí a manejar el repositorio de Git, separando el proyecto en su propio repositorio y resolviendo un conflicto al unir historiales.</w:t>
+      </w:r>
+    </w:p>
+    <w:p>
+      <w:pPr>
+        <w:pStyle w:val="Ttulo1"/>
+        <w:spacing w:before="280" w:after="160"/>
+        <w:rPr>
+          <w:color w:val="auto"/>
+          <w:sz w:val="30"/>
+          <w:szCs w:val="30"/>
+        </w:rPr>
+      </w:pPr>
+      <w:r>
+        <w:rPr>
+          <w:color w:val="auto"/>
+          <w:sz w:val="30"/>
+          <w:szCs w:val="30"/>
+        </w:rPr>
+        <w:t>Lo más valioso fue implementar las reglas del negocio: el costo estimado calculado desde el servicio más el recargo, y la restricción de que una orden terminada no regrese a pendiente. Probar cada caso en Postman, incluidos los errores con sus códigos 400, 404 y 409, me mostró la importancia de las validaciones y del manejo centralizado de excepciones para que la API responda con mensajes comprensibles.</w:t>
+      </w:r>
+    </w:p>
+    <w:p>
+      <w:pPr>
+        <w:pStyle w:val="Ttulo1"/>
+        <w:spacing w:before="280" w:after="160"/>
+        <w:rPr>
+          <w:color w:val="auto"/>
+          <w:sz w:val="30"/>
+          <w:szCs w:val="30"/>
+        </w:rPr>
+      </w:pPr>
+      <w:r>
+        <w:rPr>
+          <w:color w:val="auto"/>
+          <w:sz w:val="30"/>
+          <w:szCs w:val="30"/>
+        </w:rPr>
+        <w:t>Como mejora futura, me gustaría agregar paginación en el listado de órdenes, pruebas automatizadas y un reporte de ingresos por periodo. En general, el proyecto reforzó mi capacidad para diseñar, probar y documentar un sistema completo de principio a fin.</w:t>
+      </w:r>
+    </w:p>
+    <w:p>
+      <w:pPr>
+        <w:pStyle w:val="Ttulo1"/>
+        <w:spacing w:before="280" w:after="160"/>
         <w:rPr>
           <w:b/>
           <w:bCs/>

</xml_diff>

<commit_message>
Actualizacion del historial de commits en las evidencias
</commit_message>
<xml_diff>
--- a/evidencias/Evidencias_PF02_Avance2.docx
+++ b/evidencias/Evidencias_PF02_Avance2.docx
@@ -6297,10 +6297,10 @@
       </w:pPr>
       <w:r>
         <w:drawing>
-          <wp:inline distT="0" distB="0" distL="0" distR="0" wp14:anchorId="332BFAD3" wp14:editId="2ED115A1">
-            <wp:extent cx="5943600" cy="2558415"/>
-            <wp:effectExtent l="0" t="0" r="0" b="0"/>
-            <wp:docPr id="1674376708" name="Imagen 1"/>
+          <wp:inline distT="0" distB="0" distL="0" distR="0" wp14:anchorId="47707C5D" wp14:editId="494EFEE2">
+            <wp:extent cx="5943600" cy="2336165"/>
+            <wp:effectExtent l="0" t="0" r="0" b="6985"/>
+            <wp:docPr id="1267405188" name="Imagen 1"/>
             <wp:cNvGraphicFramePr>
               <a:graphicFrameLocks xmlns:a="http://schemas.openxmlformats.org/drawingml/2006/main" noChangeAspect="1"/>
             </wp:cNvGraphicFramePr>
@@ -6308,7 +6308,7 @@
               <a:graphicData uri="http://schemas.openxmlformats.org/drawingml/2006/picture">
                 <pic:pic xmlns:pic="http://schemas.openxmlformats.org/drawingml/2006/picture">
                   <pic:nvPicPr>
-                    <pic:cNvPr id="1674376708" name=""/>
+                    <pic:cNvPr id="1267405188" name=""/>
                     <pic:cNvPicPr/>
                   </pic:nvPicPr>
                   <pic:blipFill>
@@ -6320,7 +6320,7 @@
                   <pic:spPr>
                     <a:xfrm>
                       <a:off x="0" y="0"/>
-                      <a:ext cx="5943600" cy="2558415"/>
+                      <a:ext cx="5943600" cy="2336165"/>
                     </a:xfrm>
                     <a:prstGeom prst="rect">
                       <a:avLst/>
@@ -6340,10 +6340,10 @@
       </w:pPr>
       <w:r>
         <w:drawing>
-          <wp:inline distT="0" distB="0" distL="0" distR="0" wp14:anchorId="6FAE0189" wp14:editId="6D6C806E">
-            <wp:extent cx="5943600" cy="2604135"/>
-            <wp:effectExtent l="0" t="0" r="0" b="5715"/>
-            <wp:docPr id="1751163198" name="Imagen 1"/>
+          <wp:inline distT="0" distB="0" distL="0" distR="0" wp14:anchorId="2D2FAB25" wp14:editId="1199AEF5">
+            <wp:extent cx="5943600" cy="2746375"/>
+            <wp:effectExtent l="0" t="0" r="0" b="0"/>
+            <wp:docPr id="538043814" name="Imagen 1"/>
             <wp:cNvGraphicFramePr>
               <a:graphicFrameLocks xmlns:a="http://schemas.openxmlformats.org/drawingml/2006/main" noChangeAspect="1"/>
             </wp:cNvGraphicFramePr>
@@ -6351,7 +6351,7 @@
               <a:graphicData uri="http://schemas.openxmlformats.org/drawingml/2006/picture">
                 <pic:pic xmlns:pic="http://schemas.openxmlformats.org/drawingml/2006/picture">
                   <pic:nvPicPr>
-                    <pic:cNvPr id="1751163198" name=""/>
+                    <pic:cNvPr id="538043814" name=""/>
                     <pic:cNvPicPr/>
                   </pic:nvPicPr>
                   <pic:blipFill>
@@ -6363,7 +6363,7 @@
                   <pic:spPr>
                     <a:xfrm>
                       <a:off x="0" y="0"/>
-                      <a:ext cx="5943600" cy="2604135"/>
+                      <a:ext cx="5943600" cy="2746375"/>
                     </a:xfrm>
                     <a:prstGeom prst="rect">
                       <a:avLst/>
@@ -6380,14 +6380,44 @@
       <w:pPr>
         <w:pStyle w:val="Ttulo1"/>
         <w:spacing w:before="280" w:after="160"/>
-        <w:rPr>
-          <w:b/>
-          <w:bCs/>
-          <w:color w:val="auto"/>
-          <w:sz w:val="30"/>
-          <w:szCs w:val="30"/>
-        </w:rPr>
-      </w:pPr>
+      </w:pPr>
+      <w:r>
+        <w:drawing>
+          <wp:inline distT="0" distB="0" distL="0" distR="0" wp14:anchorId="2FD01323" wp14:editId="073FC2A5">
+            <wp:extent cx="5943600" cy="570865"/>
+            <wp:effectExtent l="0" t="0" r="0" b="635"/>
+            <wp:docPr id="304806465" name="Imagen 1"/>
+            <wp:cNvGraphicFramePr>
+              <a:graphicFrameLocks xmlns:a="http://schemas.openxmlformats.org/drawingml/2006/main" noChangeAspect="1"/>
+            </wp:cNvGraphicFramePr>
+            <a:graphic xmlns:a="http://schemas.openxmlformats.org/drawingml/2006/main">
+              <a:graphicData uri="http://schemas.openxmlformats.org/drawingml/2006/picture">
+                <pic:pic xmlns:pic="http://schemas.openxmlformats.org/drawingml/2006/picture">
+                  <pic:nvPicPr>
+                    <pic:cNvPr id="304806465" name=""/>
+                    <pic:cNvPicPr/>
+                  </pic:nvPicPr>
+                  <pic:blipFill>
+                    <a:blip r:embed="rId53"/>
+                    <a:stretch>
+                      <a:fillRect/>
+                    </a:stretch>
+                  </pic:blipFill>
+                  <pic:spPr>
+                    <a:xfrm>
+                      <a:off x="0" y="0"/>
+                      <a:ext cx="5943600" cy="570865"/>
+                    </a:xfrm>
+                    <a:prstGeom prst="rect">
+                      <a:avLst/>
+                    </a:prstGeom>
+                  </pic:spPr>
+                </pic:pic>
+              </a:graphicData>
+            </a:graphic>
+          </wp:inline>
+        </w:drawing>
+      </w:r>
     </w:p>
     <w:p>
       <w:pPr>
@@ -6448,74 +6478,80 @@
         <w:rPr>
           <w:b/>
           <w:bCs/>
+          <w:color w:val="1F4E79"/>
+          <w:sz w:val="30"/>
+          <w:szCs w:val="30"/>
+        </w:rPr>
+      </w:pPr>
+      <w:r>
+        <w:rPr>
+          <w:b/>
+          <w:bCs/>
+          <w:color w:val="1F4E79"/>
+          <w:sz w:val="30"/>
+          <w:szCs w:val="30"/>
+        </w:rPr>
+        <w:lastRenderedPageBreak/>
+        <w:t>12</w:t>
+      </w:r>
+      <w:r>
+        <w:rPr>
+          <w:b/>
+          <w:bCs/>
           <w:color w:val="auto"/>
           <w:sz w:val="30"/>
           <w:szCs w:val="30"/>
         </w:rPr>
-      </w:pPr>
+        <w:t xml:space="preserve">. </w:t>
+      </w:r>
+      <w:r>
+        <w:rPr>
+          <w:b/>
+          <w:bCs/>
+          <w:color w:val="1F4E79"/>
+          <w:sz w:val="30"/>
+          <w:szCs w:val="30"/>
+        </w:rPr>
+        <w:t>Reflexión</w:t>
+      </w:r>
+      <w:r>
+        <w:rPr>
+          <w:b/>
+          <w:bCs/>
+          <w:color w:val="auto"/>
+          <w:sz w:val="30"/>
+          <w:szCs w:val="30"/>
+        </w:rPr>
+        <w:t xml:space="preserve"> </w:t>
+      </w:r>
+      <w:r>
+        <w:rPr>
+          <w:b/>
+          <w:bCs/>
+          <w:color w:val="1F4E79"/>
+          <w:sz w:val="30"/>
+          <w:szCs w:val="30"/>
+        </w:rPr>
+        <w:t>Final</w:t>
+      </w:r>
     </w:p>
     <w:p>
       <w:pPr>
         <w:pStyle w:val="Ttulo1"/>
         <w:spacing w:before="280" w:after="160"/>
         <w:rPr>
-          <w:b/>
-          <w:bCs/>
-          <w:color w:val="1F4E79"/>
-          <w:sz w:val="30"/>
-          <w:szCs w:val="30"/>
-        </w:rPr>
-      </w:pPr>
-      <w:r>
-        <w:rPr>
-          <w:b/>
-          <w:bCs/>
-          <w:color w:val="1F4E79"/>
-          <w:sz w:val="30"/>
-          <w:szCs w:val="30"/>
-        </w:rPr>
-        <w:lastRenderedPageBreak/>
-        <w:t>12</w:t>
-      </w:r>
-      <w:r>
-        <w:rPr>
-          <w:b/>
-          <w:bCs/>
           <w:color w:val="auto"/>
           <w:sz w:val="30"/>
           <w:szCs w:val="30"/>
         </w:rPr>
-        <w:t xml:space="preserve">. </w:t>
-      </w:r>
-      <w:r>
-        <w:rPr>
-          <w:b/>
-          <w:bCs/>
-          <w:color w:val="1F4E79"/>
-          <w:sz w:val="30"/>
-          <w:szCs w:val="30"/>
-        </w:rPr>
-        <w:t>Reflexión</w:t>
-      </w:r>
-      <w:r>
-        <w:rPr>
-          <w:b/>
-          <w:bCs/>
+      </w:pPr>
+      <w:r>
+        <w:rPr>
           <w:color w:val="auto"/>
           <w:sz w:val="30"/>
           <w:szCs w:val="30"/>
         </w:rPr>
-        <w:t xml:space="preserve"> </w:t>
-      </w:r>
-      <w:r>
-        <w:rPr>
-          <w:b/>
-          <w:bCs/>
-          <w:color w:val="1F4E79"/>
-          <w:sz w:val="30"/>
-          <w:szCs w:val="30"/>
-        </w:rPr>
-        <w:t>Final</w:t>
+        <w:t>Este proyecto me permitió integrar en una sola aplicación los conocimientos del curso: programación orientada a objetos, Maven, Spring Boot, API REST, persistencia con JPA y PostgreSQL, y una interfaz web que consume la API. Pasar de ejercicios separados a un sistema completo me ayudó a entender cómo se conectan las capas y por qué cada una tiene una responsabilidad clara: el controlador recibe la petición, el servicio aplica las reglas del negocio y el repositorio guarda los datos.</w:t>
       </w:r>
     </w:p>
     <w:p>
@@ -6534,7 +6570,25 @@
           <w:sz w:val="30"/>
           <w:szCs w:val="30"/>
         </w:rPr>
-        <w:t>Este proyecto me permitió integrar en una sola aplicación los conocimientos del curso: programación orientada a objetos, Maven, Spring Boot, API REST, persistencia con JPA y PostgreSQL, y una interfaz web que consume la API. Pasar de ejercicios separados a un sistema completo me ayudó a entender cómo se conectan las capas y por qué cada una tiene una responsabilidad clara: el controlador recibe la petición, el servicio aplica las reglas del negocio y el repositorio guarda los datos.</w:t>
+        <w:t xml:space="preserve">Durante el desarrollo enfrenté varios problemas reales. La sincronización de Maven falló por cortes de conexión; la autenticación con PostgreSQL me obligó a revisar el puerto (5433) y la contraseña del usuario; y la validación del esquema de </w:t>
+      </w:r>
+      <w:proofErr w:type="spellStart"/>
+      <w:r>
+        <w:rPr>
+          <w:color w:val="auto"/>
+          <w:sz w:val="30"/>
+          <w:szCs w:val="30"/>
+        </w:rPr>
+        <w:t>Hibernate</w:t>
+      </w:r>
+      <w:proofErr w:type="spellEnd"/>
+      <w:r>
+        <w:rPr>
+          <w:color w:val="auto"/>
+          <w:sz w:val="30"/>
+          <w:szCs w:val="30"/>
+        </w:rPr>
+        <w:t xml:space="preserve"> detectó que mis tablas usaban enteros de 4 bytes mientras las entidades usaban Long, lo que corregí ajustando las columnas a BIGINT. También aprendí a manejar el repositorio de Git, separando el proyecto en su propio repositorio y resolviendo un conflicto al unir historiales.</w:t>
       </w:r>
     </w:p>
     <w:p>
@@ -6553,25 +6607,7 @@
           <w:sz w:val="30"/>
           <w:szCs w:val="30"/>
         </w:rPr>
-        <w:t xml:space="preserve">Durante el desarrollo enfrenté varios problemas reales. La sincronización de Maven falló por cortes de conexión; la autenticación con PostgreSQL me obligó a revisar el puerto (5433) y la contraseña del usuario; y la validación del esquema de </w:t>
-      </w:r>
-      <w:proofErr w:type="spellStart"/>
-      <w:r>
-        <w:rPr>
-          <w:color w:val="auto"/>
-          <w:sz w:val="30"/>
-          <w:szCs w:val="30"/>
-        </w:rPr>
-        <w:t>Hibernate</w:t>
-      </w:r>
-      <w:proofErr w:type="spellEnd"/>
-      <w:r>
-        <w:rPr>
-          <w:color w:val="auto"/>
-          <w:sz w:val="30"/>
-          <w:szCs w:val="30"/>
-        </w:rPr>
-        <w:t xml:space="preserve"> detectó que mis tablas usaban enteros de 4 bytes mientras las entidades usaban Long, lo que corregí ajustando las columnas a BIGINT. También aprendí a manejar el repositorio de Git, separando el proyecto en su propio repositorio y resolviendo un conflicto al unir historiales.</w:t>
+        <w:t>Lo más valioso fue implementar las reglas del negocio: el costo estimado calculado desde el servicio más el recargo, y la restricción de que una orden terminada no regrese a pendiente. Probar cada caso en Postman, incluidos los errores con sus códigos 400, 404 y 409, me mostró la importancia de las validaciones y del manejo centralizado de excepciones para que la API responda con mensajes comprensibles.</w:t>
       </w:r>
     </w:p>
     <w:p>
@@ -6590,7 +6626,7 @@
           <w:sz w:val="30"/>
           <w:szCs w:val="30"/>
         </w:rPr>
-        <w:t>Lo más valioso fue implementar las reglas del negocio: el costo estimado calculado desde el servicio más el recargo, y la restricción de que una orden terminada no regrese a pendiente. Probar cada caso en Postman, incluidos los errores con sus códigos 400, 404 y 409, me mostró la importancia de las validaciones y del manejo centralizado de excepciones para que la API responda con mensajes comprensibles.</w:t>
+        <w:t>Como mejora futura, me gustaría agregar paginación en el listado de órdenes, pruebas automatizadas y un reporte de ingresos por periodo. En general, el proyecto reforzó mi capacidad para diseñar, probar y documentar un sistema completo de principio a fin.</w:t>
       </w:r>
     </w:p>
     <w:p>
@@ -6598,37 +6634,18 @@
         <w:pStyle w:val="Ttulo1"/>
         <w:spacing w:before="280" w:after="160"/>
         <w:rPr>
+          <w:b/>
+          <w:bCs/>
           <w:color w:val="auto"/>
           <w:sz w:val="30"/>
           <w:szCs w:val="30"/>
         </w:rPr>
       </w:pPr>
-      <w:r>
-        <w:rPr>
-          <w:color w:val="auto"/>
-          <w:sz w:val="30"/>
-          <w:szCs w:val="30"/>
-        </w:rPr>
-        <w:t>Como mejora futura, me gustaría agregar paginación en el listado de órdenes, pruebas automatizadas y un reporte de ingresos por periodo. En general, el proyecto reforzó mi capacidad para diseñar, probar y documentar un sistema completo de principio a fin.</w:t>
-      </w:r>
     </w:p>
     <w:p>
       <w:pPr>
         <w:pStyle w:val="Ttulo1"/>
         <w:spacing w:before="280" w:after="160"/>
-        <w:rPr>
-          <w:b/>
-          <w:bCs/>
-          <w:color w:val="auto"/>
-          <w:sz w:val="30"/>
-          <w:szCs w:val="30"/>
-        </w:rPr>
-      </w:pPr>
-    </w:p>
-    <w:p>
-      <w:pPr>
-        <w:pStyle w:val="Ttulo1"/>
-        <w:spacing w:before="280" w:after="160"/>
       </w:pPr>
     </w:p>
     <w:p>
@@ -6638,7 +6655,7 @@
       </w:pPr>
     </w:p>
     <w:sectPr>
-      <w:footerReference w:type="default" r:id="rId53"/>
+      <w:footerReference w:type="default" r:id="rId54"/>
       <w:pgSz w:w="12240" w:h="15840"/>
       <w:pgMar w:top="1440" w:right="1440" w:bottom="1440" w:left="1440" w:header="708" w:footer="708" w:gutter="0"/>
       <w:cols w:space="720"/>
@@ -7474,6 +7491,7 @@
   <w:style w:type="character" w:default="1" w:styleId="Fuentedeprrafopredeter">
     <w:name w:val="Default Paragraph Font"/>
     <w:uiPriority w:val="1"/>
+    <w:semiHidden/>
     <w:unhideWhenUsed/>
   </w:style>
   <w:style w:type="table" w:default="1" w:styleId="Tablanormal">

</xml_diff>